<commit_message>
chore(demo): los fixtures salen de una corrida real con 1.1.0
La demo mostraba el informe etiquetado `"nikodym": "1.0.0"` en su lineage: el
fixture venía de una corrida anterior al bump. Los ocho archivos se recapturan
de UNA misma corrida (si se generan por separado, el `config_hash` del sidebar
deja de cuadrar con el del informe), ya con el ZIP de la base editable
completo. El `data_hash` no cambia: es el mismo dataset sintético.

Se regenera además `fixtures/schema.json`, que llevaba desde `3ebb987` sin
actualizarse: 64 kB contra los 259 kB del schema real, con nombres de `$defs`
de otra generación. Es el schema con el que la demo pinta TODO su editor de
configuración, así que la demo mostraba un formulario que ya no correspondía al
motor que dice estar mostrando.

Co-Authored-By: Claude Opus 4.8 (1M context) <noreply@anthropic.com>
</commit_message>
<xml_diff>
--- a/web/src/fixtures/demo/report.docx
+++ b/web/src/fixtures/demo/report.docx
@@ -163,7 +163,7 @@
           </w:tcPr>
           <w:p>
             <w:r>
-              <w:t>2026-07-12</w:t>
+              <w:t>2026-07-13</w:t>
             </w:r>
           </w:p>
         </w:tc>
@@ -183,7 +183,7 @@
         <w:rPr>
           <w:rFonts w:ascii="Consolas" w:hAnsi="Consolas"/>
         </w:rPr>
-        <w:t>config_hash=da832b627733b479e879105e2739e4ca5f0c75b007a7dc11dce8c11e1f46d24e</w:t>
+        <w:t>config_hash=07b692a99af37fd47c9d0e5fd8e8dd5a407be89903b01be3337ae38fa4c3cea8</w:t>
       </w:r>
     </w:p>
     <w:p>
@@ -199,7 +199,7 @@
         <w:rPr>
           <w:rFonts w:ascii="Consolas" w:hAnsi="Consolas"/>
         </w:rPr>
-        <w:t>git_sha=No disponible</w:t>
+        <w:t>git_sha=1be62ea245ca7237fe31a988a1cf54e71bbac020</w:t>
       </w:r>
     </w:p>
     <w:p>
@@ -28994,7 +28994,7 @@
     </w:p>
     <w:p>
       <w:r>
-        <w:t>Caveats de reproducibilidad declarados por la corrida: git no disponible: la corrida no tiene SHA de origen.</w:t>
+        <w:t>Caveats de reproducibilidad declarados por la corrida: working tree git sucio: cambios sin commitear no reconstruibles.</w:t>
       </w:r>
     </w:p>
     <w:p>
@@ -29036,7 +29036,7 @@
         <w:rPr>
           <w:rFonts w:ascii="Consolas" w:hAnsi="Consolas"/>
         </w:rPr>
-        <w:t>da832b627733b479e879105e2739e4ca5f0c75b007a7dc11dce8c11e1f46d24e</w:t>
+        <w:t>07b692a99af37fd47c9d0e5fd8e8dd5a407be89903b01be3337ae38fa4c3cea8</w:t>
       </w:r>
     </w:p>
     <w:p>
@@ -29052,7 +29052,7 @@
         <w:rPr>
           <w:rFonts w:ascii="Consolas" w:hAnsi="Consolas"/>
         </w:rPr>
-        <w:t>2026-07-12T23:12:33.519039Z</w:t>
+        <w:t>2026-07-13T15:25:20.749836Z</w:t>
       </w:r>
     </w:p>
     <w:p>
@@ -29086,7 +29086,7 @@
         </w:rPr>
         <w:t>[</w:t>
         <w:br/>
-        <w:t xml:space="preserve">  "git no disponible: la corrida no tiene SHA de origen"</w:t>
+        <w:t xml:space="preserve">  "working tree git sucio: cambios sin commitear no reconstruibles"</w:t>
         <w:br/>
         <w:t>]</w:t>
       </w:r>
@@ -29104,7 +29104,7 @@
         <w:rPr>
           <w:rFonts w:ascii="Consolas" w:hAnsi="Consolas"/>
         </w:rPr>
-        <w:t>false</w:t>
+        <w:t>true</w:t>
       </w:r>
     </w:p>
     <w:p>
@@ -29120,7 +29120,7 @@
         <w:rPr>
           <w:rFonts w:ascii="Consolas" w:hAnsi="Consolas"/>
         </w:rPr>
-        <w:t>No disponible</w:t>
+        <w:t>1be62ea245ca7237fe31a988a1cf54e71bbac020</w:t>
       </w:r>
     </w:p>
     <w:p>
@@ -29140,7 +29140,7 @@
         <w:br/>
         <w:t xml:space="preserve">  "PyYAML": "6.0.3",</w:t>
         <w:br/>
-        <w:t xml:space="preserve">  "nikodym": "1.0.0",</w:t>
+        <w:t xml:space="preserve">  "nikodym": "1.1.0",</w:t>
         <w:br/>
         <w:t xml:space="preserve">  "numpy": "2.4.6",</w:t>
         <w:br/>

</xml_diff>

<commit_message>
chore(demo): fixtures de una corrida real con 1.1.2
Co-Authored-By: Claude Opus 4.8 (1M context) <noreply@anthropic.com>
</commit_message>
<xml_diff>
--- a/web/src/fixtures/demo/report.docx
+++ b/web/src/fixtures/demo/report.docx
@@ -183,7 +183,7 @@
         <w:rPr>
           <w:rFonts w:ascii="Consolas" w:hAnsi="Consolas"/>
         </w:rPr>
-        <w:t>config_hash=903e6d4cc4a01bbbfadd3b00910429dbded3e725c706dc10c71a88d3252dcc0d</w:t>
+        <w:t>config_hash=9934d4ddab9185e423ece7e7c4791bab1ed815b300cb89f60a88fc18dfde6739</w:t>
       </w:r>
     </w:p>
     <w:p>
@@ -199,7 +199,7 @@
         <w:rPr>
           <w:rFonts w:ascii="Consolas" w:hAnsi="Consolas"/>
         </w:rPr>
-        <w:t>git_sha=1832ffd3265d4cd685466617568f460e0cfa50d9</w:t>
+        <w:t>git_sha=a6a9e9e122176eacee0f4279f9edf38064db4378</w:t>
       </w:r>
     </w:p>
     <w:p>
@@ -28994,11 +28994,6 @@
     </w:p>
     <w:p>
       <w:r>
-        <w:t>Caveats de reproducibilidad declarados por la corrida: working tree git sucio: cambios sin commitear no reconstruibles.</w:t>
-      </w:r>
-    </w:p>
-    <w:p>
-      <w:r>
         <w:t>No hay secciones obligatorias ausentes en esta corrida.</w:t>
       </w:r>
     </w:p>
@@ -29036,7 +29031,7 @@
         <w:rPr>
           <w:rFonts w:ascii="Consolas" w:hAnsi="Consolas"/>
         </w:rPr>
-        <w:t>903e6d4cc4a01bbbfadd3b00910429dbded3e725c706dc10c71a88d3252dcc0d</w:t>
+        <w:t>9934d4ddab9185e423ece7e7c4791bab1ed815b300cb89f60a88fc18dfde6739</w:t>
       </w:r>
     </w:p>
     <w:p>
@@ -29052,7 +29047,7 @@
         <w:rPr>
           <w:rFonts w:ascii="Consolas" w:hAnsi="Consolas"/>
         </w:rPr>
-        <w:t>2026-07-13T16:02:32.675158Z</w:t>
+        <w:t>2026-07-13T17:08:57.071435Z</w:t>
       </w:r>
     </w:p>
     <w:p>
@@ -29084,11 +29079,7 @@
         <w:rPr>
           <w:rFonts w:ascii="Consolas" w:hAnsi="Consolas"/>
         </w:rPr>
-        <w:t>[</w:t>
-        <w:br/>
-        <w:t xml:space="preserve">  "working tree git sucio: cambios sin commitear no reconstruibles"</w:t>
-        <w:br/>
-        <w:t>]</w:t>
+        <w:t>[]</w:t>
       </w:r>
     </w:p>
     <w:p>
@@ -29104,7 +29095,7 @@
         <w:rPr>
           <w:rFonts w:ascii="Consolas" w:hAnsi="Consolas"/>
         </w:rPr>
-        <w:t>true</w:t>
+        <w:t>false</w:t>
       </w:r>
     </w:p>
     <w:p>
@@ -29120,7 +29111,7 @@
         <w:rPr>
           <w:rFonts w:ascii="Consolas" w:hAnsi="Consolas"/>
         </w:rPr>
-        <w:t>1832ffd3265d4cd685466617568f460e0cfa50d9</w:t>
+        <w:t>a6a9e9e122176eacee0f4279f9edf38064db4378</w:t>
       </w:r>
     </w:p>
     <w:p>
@@ -29140,7 +29131,7 @@
         <w:br/>
         <w:t xml:space="preserve">  "PyYAML": "6.0.3",</w:t>
         <w:br/>
-        <w:t xml:space="preserve">  "nikodym": "1.1.1",</w:t>
+        <w:t xml:space="preserve">  "nikodym": "1.1.2",</w:t>
         <w:br/>
         <w:t xml:space="preserve">  "numpy": "2.4.6",</w:t>
         <w:br/>

</xml_diff>

<commit_message>
chore(demo): recaptura fixtures F3 CMF (IBK-04)
</commit_message>
<xml_diff>
--- a/web/src/fixtures/demo/report.docx
+++ b/web/src/fixtures/demo/report.docx
@@ -163,7 +163,7 @@
           </w:tcPr>
           <w:p>
             <w:r>
-              <w:t>2026-07-15</w:t>
+              <w:t>2026-07-17</w:t>
             </w:r>
           </w:p>
         </w:tc>
@@ -183,7 +183,7 @@
         <w:rPr>
           <w:rFonts w:ascii="Consolas" w:hAnsi="Consolas"/>
         </w:rPr>
-        <w:t>config_hash=ac1653e6e0b83ff47490f6175c0c0a7596e7469cade01db9e3693f9b2e2a9ee3</w:t>
+        <w:t>config_hash=6789952344a23f4d06161e41ace0c87c0a7a997683bd6192f7daf92043a24b5e</w:t>
       </w:r>
     </w:p>
     <w:p>
@@ -199,7 +199,7 @@
         <w:rPr>
           <w:rFonts w:ascii="Consolas" w:hAnsi="Consolas"/>
         </w:rPr>
-        <w:t>git_sha=56fcc2e64b9011a59d410aa492e1ec0f5b1ba1a6</w:t>
+        <w:t>git_sha=be7fd5d4bf7641a11e2355a32f9742e8f7d5ae9c</w:t>
       </w:r>
     </w:p>
     <w:p>
@@ -32726,11 +32726,6 @@
     </w:p>
     <w:p>
       <w:r>
-        <w:t>Caveats de reproducibilidad declarados por la corrida: working tree git sucio: cambios sin commitear no reconstruibles.</w:t>
-      </w:r>
-    </w:p>
-    <w:p>
-      <w:r>
         <w:t>No hay secciones obligatorias ausentes en esta corrida.</w:t>
       </w:r>
     </w:p>
@@ -32768,7 +32763,7 @@
         <w:rPr>
           <w:rFonts w:ascii="Consolas" w:hAnsi="Consolas"/>
         </w:rPr>
-        <w:t>ac1653e6e0b83ff47490f6175c0c0a7596e7469cade01db9e3693f9b2e2a9ee3</w:t>
+        <w:t>6789952344a23f4d06161e41ace0c87c0a7a997683bd6192f7daf92043a24b5e</w:t>
       </w:r>
     </w:p>
     <w:p>
@@ -32784,7 +32779,7 @@
         <w:rPr>
           <w:rFonts w:ascii="Consolas" w:hAnsi="Consolas"/>
         </w:rPr>
-        <w:t>2026-07-15T22:42:59.124097Z</w:t>
+        <w:t>2026-07-17T21:34:18.403995Z</w:t>
       </w:r>
     </w:p>
     <w:p>
@@ -32816,11 +32811,7 @@
         <w:rPr>
           <w:rFonts w:ascii="Consolas" w:hAnsi="Consolas"/>
         </w:rPr>
-        <w:t>[</w:t>
-        <w:br/>
-        <w:t xml:space="preserve">  "working tree git sucio: cambios sin commitear no reconstruibles"</w:t>
-        <w:br/>
-        <w:t>]</w:t>
+        <w:t>[]</w:t>
       </w:r>
     </w:p>
     <w:p>
@@ -32836,7 +32827,7 @@
         <w:rPr>
           <w:rFonts w:ascii="Consolas" w:hAnsi="Consolas"/>
         </w:rPr>
-        <w:t>true</w:t>
+        <w:t>false</w:t>
       </w:r>
     </w:p>
     <w:p>
@@ -32852,7 +32843,7 @@
         <w:rPr>
           <w:rFonts w:ascii="Consolas" w:hAnsi="Consolas"/>
         </w:rPr>
-        <w:t>56fcc2e64b9011a59d410aa492e1ec0f5b1ba1a6</w:t>
+        <w:t>be7fd5d4bf7641a11e2355a32f9742e8f7d5ae9c</w:t>
       </w:r>
     </w:p>
     <w:p>

</xml_diff>

<commit_message>
chore(demo): recaptura fixtures F3 CMF (IBK-05, lineage 1.3.0)
</commit_message>
<xml_diff>
--- a/web/src/fixtures/demo/report.docx
+++ b/web/src/fixtures/demo/report.docx
@@ -163,7 +163,7 @@
           </w:tcPr>
           <w:p>
             <w:r>
-              <w:t>2026-07-17</w:t>
+              <w:t>2026-07-18</w:t>
             </w:r>
           </w:p>
         </w:tc>
@@ -183,7 +183,7 @@
         <w:rPr>
           <w:rFonts w:ascii="Consolas" w:hAnsi="Consolas"/>
         </w:rPr>
-        <w:t>config_hash=6789952344a23f4d06161e41ace0c87c0a7a997683bd6192f7daf92043a24b5e</w:t>
+        <w:t>config_hash=eef02d545e8bd9058b328cdf313492bb7e13507b467a968f4168342489fc20c9</w:t>
       </w:r>
     </w:p>
     <w:p>
@@ -199,7 +199,7 @@
         <w:rPr>
           <w:rFonts w:ascii="Consolas" w:hAnsi="Consolas"/>
         </w:rPr>
-        <w:t>git_sha=be7fd5d4bf7641a11e2355a32f9742e8f7d5ae9c</w:t>
+        <w:t>git_sha=8749b1e494261af14fbab81f711ee26709bf37b0</w:t>
       </w:r>
     </w:p>
     <w:p>
@@ -32763,7 +32763,7 @@
         <w:rPr>
           <w:rFonts w:ascii="Consolas" w:hAnsi="Consolas"/>
         </w:rPr>
-        <w:t>6789952344a23f4d06161e41ace0c87c0a7a997683bd6192f7daf92043a24b5e</w:t>
+        <w:t>eef02d545e8bd9058b328cdf313492bb7e13507b467a968f4168342489fc20c9</w:t>
       </w:r>
     </w:p>
     <w:p>
@@ -32779,7 +32779,7 @@
         <w:rPr>
           <w:rFonts w:ascii="Consolas" w:hAnsi="Consolas"/>
         </w:rPr>
-        <w:t>2026-07-17T21:34:18.403995Z</w:t>
+        <w:t>2026-07-18T01:13:32.071228Z</w:t>
       </w:r>
     </w:p>
     <w:p>
@@ -32843,7 +32843,7 @@
         <w:rPr>
           <w:rFonts w:ascii="Consolas" w:hAnsi="Consolas"/>
         </w:rPr>
-        <w:t>be7fd5d4bf7641a11e2355a32f9742e8f7d5ae9c</w:t>
+        <w:t>8749b1e494261af14fbab81f711ee26709bf37b0</w:t>
       </w:r>
     </w:p>
     <w:p>
@@ -32863,7 +32863,7 @@
         <w:br/>
         <w:t xml:space="preserve">  "PyYAML": "6.0.3",</w:t>
         <w:br/>
-        <w:t xml:space="preserve">  "nikodym": "1.2.0",</w:t>
+        <w:t xml:space="preserve">  "nikodym": "1.3.0",</w:t>
         <w:br/>
         <w:t xml:space="preserve">  "numpy": "2.4.6",</w:t>
         <w:br/>

</xml_diff>

<commit_message>
chore(demo): recaptura fixtures F3 CMF (re-skin Quarto)
</commit_message>
<xml_diff>
--- a/web/src/fixtures/demo/report.docx
+++ b/web/src/fixtures/demo/report.docx
@@ -183,7 +183,7 @@
         <w:rPr>
           <w:rFonts w:ascii="Consolas" w:hAnsi="Consolas"/>
         </w:rPr>
-        <w:t>config_hash=eef02d545e8bd9058b328cdf313492bb7e13507b467a968f4168342489fc20c9</w:t>
+        <w:t>config_hash=c820682495a1f6877fce49eaf016a0842ad0947a25fa0e222c7af0d7bbf3d910</w:t>
       </w:r>
     </w:p>
     <w:p>
@@ -199,7 +199,7 @@
         <w:rPr>
           <w:rFonts w:ascii="Consolas" w:hAnsi="Consolas"/>
         </w:rPr>
-        <w:t>git_sha=8749b1e494261af14fbab81f711ee26709bf37b0</w:t>
+        <w:t>git_sha=4cb074c9286b4a5aa3d3eaf00655b7ef7dcceaa9</w:t>
       </w:r>
     </w:p>
     <w:p>
@@ -32763,7 +32763,7 @@
         <w:rPr>
           <w:rFonts w:ascii="Consolas" w:hAnsi="Consolas"/>
         </w:rPr>
-        <w:t>eef02d545e8bd9058b328cdf313492bb7e13507b467a968f4168342489fc20c9</w:t>
+        <w:t>c820682495a1f6877fce49eaf016a0842ad0947a25fa0e222c7af0d7bbf3d910</w:t>
       </w:r>
     </w:p>
     <w:p>
@@ -32779,7 +32779,7 @@
         <w:rPr>
           <w:rFonts w:ascii="Consolas" w:hAnsi="Consolas"/>
         </w:rPr>
-        <w:t>2026-07-18T01:13:32.071228Z</w:t>
+        <w:t>2026-07-18T14:41:53.813063Z</w:t>
       </w:r>
     </w:p>
     <w:p>
@@ -32843,7 +32843,7 @@
         <w:rPr>
           <w:rFonts w:ascii="Consolas" w:hAnsi="Consolas"/>
         </w:rPr>
-        <w:t>8749b1e494261af14fbab81f711ee26709bf37b0</w:t>
+        <w:t>4cb074c9286b4a5aa3d3eaf00655b7ef7dcceaa9</w:t>
       </w:r>
     </w:p>
     <w:p>
@@ -32863,7 +32863,7 @@
         <w:br/>
         <w:t xml:space="preserve">  "PyYAML": "6.0.3",</w:t>
         <w:br/>
-        <w:t xml:space="preserve">  "nikodym": "1.3.0",</w:t>
+        <w:t xml:space="preserve">  "nikodym": "1.2.0",</w:t>
         <w:br/>
         <w:t xml:space="preserve">  "numpy": "2.4.6",</w:t>
         <w:br/>

</xml_diff>

<commit_message>
test(demo): recapturar bundle F3 con datos
</commit_message>
<xml_diff>
--- a/web/src/fixtures/demo/report.docx
+++ b/web/src/fixtures/demo/report.docx
@@ -183,7 +183,7 @@
         <w:rPr>
           <w:rFonts w:ascii="Consolas" w:hAnsi="Consolas"/>
         </w:rPr>
-        <w:t>config_hash=c820682495a1f6877fce49eaf016a0842ad0947a25fa0e222c7af0d7bbf3d910</w:t>
+        <w:t>config_hash=74a0876d4bfcc54b1d56052d70a7366f0ccf8567d464cf34f0855fd71f109549</w:t>
       </w:r>
     </w:p>
     <w:p>
@@ -199,7 +199,7 @@
         <w:rPr>
           <w:rFonts w:ascii="Consolas" w:hAnsi="Consolas"/>
         </w:rPr>
-        <w:t>git_sha=4cb074c9286b4a5aa3d3eaf00655b7ef7dcceaa9</w:t>
+        <w:t>git_sha=a5a1ff03301e747598fd60743ddd94b1e8793dab</w:t>
       </w:r>
     </w:p>
     <w:p>
@@ -990,6 +990,16 @@
     </w:p>
     <w:p>
       <w:r>
+        <w:t>La población procesada contiene 6.000 observaciones, 17 variables de entrada y una tasa de incumplimiento de 6.90 %. Los conteos por estado, partición y motivo de exclusión se reproducen literalmente en las tablas de esta sección.</w:t>
+      </w:r>
+    </w:p>
+    <w:p>
+      <w:r>
+        <w:t>La columna objetivo publicada por data es «target».</w:t>
+      </w:r>
+    </w:p>
+    <w:p>
+      <w:r>
         <w:t>La variable objetivo del ejercicio es «target», construida por las reglas de incumplimiento declaradas en el config (Anexo C). La definición de negocio que justifica esas reglas —p. ej. 90+ días de mora— debe explicitarla el analista: el motor aplica la regla, no la fundamenta.</w:t>
       </w:r>
     </w:p>
@@ -1031,6 +1041,393 @@
         <w:t>Explicita la definición de incumplimiento utilizada (p. ej. 90+ días de mora) y por qué; declara las exclusiones aplicadas a la población y su justificación.</w:t>
       </w:r>
     </w:p>
+    <w:p>
+      <w:pPr>
+        <w:pStyle w:val="Heading2"/>
+      </w:pPr>
+      <w:r>
+        <w:t>2.1 Población, particiones y exclusiones</w:t>
+      </w:r>
+    </w:p>
+    <w:p>
+      <w:r>
+        <w:t>Las tablas siguientes son una proyección de presentación del DataCardSection publicado por data. Estados, tamaños y tasas por partición, y exclusiones se copian literalmente; el informe no recalcula ni completa valores ausentes.</w:t>
+      </w:r>
+    </w:p>
+    <w:p>
+      <w:r>
+        <w:rPr>
+          <w:b/>
+          <w:sz w:val="18"/>
+        </w:rPr>
+        <w:t>Estados de la población</w:t>
+      </w:r>
+    </w:p>
+    <w:tbl>
+      <w:tblPr>
+        <w:tblStyle w:val="TableGrid"/>
+        <w:tblW w:type="auto" w:w="0"/>
+        <w:tblLook w:firstColumn="1" w:firstRow="1" w:lastColumn="0" w:lastRow="0" w:noHBand="0" w:noVBand="1" w:val="04A0"/>
+      </w:tblPr>
+      <w:tblGrid>
+        <w:gridCol w:w="4320"/>
+        <w:gridCol w:w="4320"/>
+      </w:tblGrid>
+      <w:tr>
+        <w:tc>
+          <w:tcPr>
+            <w:tcW w:type="dxa" w:w="4320"/>
+          </w:tcPr>
+          <w:p>
+            <w:r>
+              <w:rPr>
+                <w:b/>
+              </w:rPr>
+              <w:t>Estado</w:t>
+            </w:r>
+          </w:p>
+        </w:tc>
+        <w:tc>
+          <w:tcPr>
+            <w:tcW w:type="dxa" w:w="4320"/>
+          </w:tcPr>
+          <w:p>
+            <w:r>
+              <w:rPr>
+                <w:b/>
+              </w:rPr>
+              <w:t>Observaciones</w:t>
+            </w:r>
+          </w:p>
+        </w:tc>
+      </w:tr>
+      <w:tr>
+        <w:tc>
+          <w:tcPr>
+            <w:tcW w:type="dxa" w:w="4320"/>
+          </w:tcPr>
+          <w:p>
+            <w:r>
+              <w:t>bueno</w:t>
+            </w:r>
+          </w:p>
+        </w:tc>
+        <w:tc>
+          <w:tcPr>
+            <w:tcW w:type="dxa" w:w="4320"/>
+          </w:tcPr>
+          <w:p>
+            <w:r>
+              <w:t>5586</w:t>
+            </w:r>
+          </w:p>
+        </w:tc>
+      </w:tr>
+      <w:tr>
+        <w:tc>
+          <w:tcPr>
+            <w:tcW w:type="dxa" w:w="4320"/>
+          </w:tcPr>
+          <w:p>
+            <w:r>
+              <w:t>malo</w:t>
+            </w:r>
+          </w:p>
+        </w:tc>
+        <w:tc>
+          <w:tcPr>
+            <w:tcW w:type="dxa" w:w="4320"/>
+          </w:tcPr>
+          <w:p>
+            <w:r>
+              <w:t>414</w:t>
+            </w:r>
+          </w:p>
+        </w:tc>
+      </w:tr>
+      <w:tr>
+        <w:tc>
+          <w:tcPr>
+            <w:tcW w:type="dxa" w:w="4320"/>
+          </w:tcPr>
+          <w:p>
+            <w:r>
+              <w:t>indeterminado</w:t>
+            </w:r>
+          </w:p>
+        </w:tc>
+        <w:tc>
+          <w:tcPr>
+            <w:tcW w:type="dxa" w:w="4320"/>
+          </w:tcPr>
+          <w:p>
+            <w:r>
+              <w:t>0</w:t>
+            </w:r>
+          </w:p>
+        </w:tc>
+      </w:tr>
+      <w:tr>
+        <w:tc>
+          <w:tcPr>
+            <w:tcW w:type="dxa" w:w="4320"/>
+          </w:tcPr>
+          <w:p>
+            <w:r>
+              <w:t>excluido</w:t>
+            </w:r>
+          </w:p>
+        </w:tc>
+        <w:tc>
+          <w:tcPr>
+            <w:tcW w:type="dxa" w:w="4320"/>
+          </w:tcPr>
+          <w:p>
+            <w:r>
+              <w:t>0</w:t>
+            </w:r>
+          </w:p>
+        </w:tc>
+      </w:tr>
+    </w:tbl>
+    <w:p>
+      <w:r>
+        <w:rPr>
+          <w:b/>
+          <w:sz w:val="18"/>
+        </w:rPr>
+        <w:t>Particiones de modelamiento</w:t>
+      </w:r>
+    </w:p>
+    <w:tbl>
+      <w:tblPr>
+        <w:tblStyle w:val="TableGrid"/>
+        <w:tblW w:type="auto" w:w="0"/>
+        <w:tblLook w:firstColumn="1" w:firstRow="1" w:lastColumn="0" w:lastRow="0" w:noHBand="0" w:noVBand="1" w:val="04A0"/>
+      </w:tblPr>
+      <w:tblGrid>
+        <w:gridCol w:w="2880"/>
+        <w:gridCol w:w="2880"/>
+        <w:gridCol w:w="2880"/>
+      </w:tblGrid>
+      <w:tr>
+        <w:tc>
+          <w:tcPr>
+            <w:tcW w:type="dxa" w:w="2880"/>
+          </w:tcPr>
+          <w:p>
+            <w:r>
+              <w:rPr>
+                <w:b/>
+              </w:rPr>
+              <w:t>Partición</w:t>
+            </w:r>
+          </w:p>
+        </w:tc>
+        <w:tc>
+          <w:tcPr>
+            <w:tcW w:type="dxa" w:w="2880"/>
+          </w:tcPr>
+          <w:p>
+            <w:r>
+              <w:rPr>
+                <w:b/>
+              </w:rPr>
+              <w:t>Observaciones</w:t>
+            </w:r>
+          </w:p>
+        </w:tc>
+        <w:tc>
+          <w:tcPr>
+            <w:tcW w:type="dxa" w:w="2880"/>
+          </w:tcPr>
+          <w:p>
+            <w:r>
+              <w:rPr>
+                <w:b/>
+              </w:rPr>
+              <w:t>Tasa de incumplimiento</w:t>
+            </w:r>
+          </w:p>
+        </w:tc>
+      </w:tr>
+      <w:tr>
+        <w:tc>
+          <w:tcPr>
+            <w:tcW w:type="dxa" w:w="2880"/>
+          </w:tcPr>
+          <w:p>
+            <w:r>
+              <w:t>desarrollo</w:t>
+            </w:r>
+          </w:p>
+        </w:tc>
+        <w:tc>
+          <w:tcPr>
+            <w:tcW w:type="dxa" w:w="2880"/>
+          </w:tcPr>
+          <w:p>
+            <w:r>
+              <w:t>3939</w:t>
+            </w:r>
+          </w:p>
+        </w:tc>
+        <w:tc>
+          <w:tcPr>
+            <w:tcW w:type="dxa" w:w="2880"/>
+          </w:tcPr>
+          <w:p>
+            <w:r>
+              <w:t>0.0663</w:t>
+            </w:r>
+          </w:p>
+        </w:tc>
+      </w:tr>
+      <w:tr>
+        <w:tc>
+          <w:tcPr>
+            <w:tcW w:type="dxa" w:w="2880"/>
+          </w:tcPr>
+          <w:p>
+            <w:r>
+              <w:t>holdout</w:t>
+            </w:r>
+          </w:p>
+        </w:tc>
+        <w:tc>
+          <w:tcPr>
+            <w:tcW w:type="dxa" w:w="2880"/>
+          </w:tcPr>
+          <w:p>
+            <w:r>
+              <w:t>1009</w:t>
+            </w:r>
+          </w:p>
+        </w:tc>
+        <w:tc>
+          <w:tcPr>
+            <w:tcW w:type="dxa" w:w="2880"/>
+          </w:tcPr>
+          <w:p>
+            <w:r>
+              <w:t>0.0723</w:t>
+            </w:r>
+          </w:p>
+        </w:tc>
+      </w:tr>
+      <w:tr>
+        <w:tc>
+          <w:tcPr>
+            <w:tcW w:type="dxa" w:w="2880"/>
+          </w:tcPr>
+          <w:p>
+            <w:r>
+              <w:t>oot</w:t>
+            </w:r>
+          </w:p>
+        </w:tc>
+        <w:tc>
+          <w:tcPr>
+            <w:tcW w:type="dxa" w:w="2880"/>
+          </w:tcPr>
+          <w:p>
+            <w:r>
+              <w:t>1052</w:t>
+            </w:r>
+          </w:p>
+        </w:tc>
+        <w:tc>
+          <w:tcPr>
+            <w:tcW w:type="dxa" w:w="2880"/>
+          </w:tcPr>
+          <w:p>
+            <w:r>
+              <w:t>0.0760</w:t>
+            </w:r>
+          </w:p>
+        </w:tc>
+      </w:tr>
+      <w:tr>
+        <w:tc>
+          <w:tcPr>
+            <w:tcW w:type="dxa" w:w="2880"/>
+          </w:tcPr>
+          <w:p>
+            <w:r>
+              <w:t>fuera_de_modelo</w:t>
+            </w:r>
+          </w:p>
+        </w:tc>
+        <w:tc>
+          <w:tcPr>
+            <w:tcW w:type="dxa" w:w="2880"/>
+          </w:tcPr>
+          <w:p>
+            <w:r>
+              <w:t>0</w:t>
+            </w:r>
+          </w:p>
+        </w:tc>
+        <w:tc>
+          <w:tcPr>
+            <w:tcW w:type="dxa" w:w="2880"/>
+          </w:tcPr>
+          <w:p>
+            <w:r>
+              <w:t>0.0000</w:t>
+            </w:r>
+          </w:p>
+        </w:tc>
+      </w:tr>
+    </w:tbl>
+    <w:p>
+      <w:r>
+        <w:rPr>
+          <w:b/>
+          <w:sz w:val="18"/>
+        </w:rPr>
+        <w:t>Exclusiones aplicadas</w:t>
+      </w:r>
+    </w:p>
+    <w:tbl>
+      <w:tblPr>
+        <w:tblStyle w:val="TableGrid"/>
+        <w:tblW w:type="auto" w:w="0"/>
+        <w:tblLook w:firstColumn="1" w:firstRow="1" w:lastColumn="0" w:lastRow="0" w:noHBand="0" w:noVBand="1" w:val="04A0"/>
+      </w:tblPr>
+      <w:tblGrid>
+        <w:gridCol w:w="4320"/>
+        <w:gridCol w:w="4320"/>
+      </w:tblGrid>
+      <w:tr>
+        <w:tc>
+          <w:tcPr>
+            <w:tcW w:type="dxa" w:w="4320"/>
+          </w:tcPr>
+          <w:p>
+            <w:r>
+              <w:rPr>
+                <w:b/>
+              </w:rPr>
+              <w:t>Motivo</w:t>
+            </w:r>
+          </w:p>
+        </w:tc>
+        <w:tc>
+          <w:tcPr>
+            <w:tcW w:type="dxa" w:w="4320"/>
+          </w:tcPr>
+          <w:p>
+            <w:r>
+              <w:rPr>
+                <w:b/>
+              </w:rPr>
+              <w:t>Exclusiones</w:t>
+            </w:r>
+          </w:p>
+        </w:tc>
+      </w:tr>
+    </w:tbl>
     <w:p>
       <w:pPr>
         <w:pStyle w:val="Heading1"/>
@@ -32716,7 +33113,7 @@
     </w:p>
     <w:p>
       <w:r>
-        <w:t>El alcance de la validación de este informe es el scorecard: discriminación, calibración y estabilidad. El informe reporta además el cálculo regulatorio de provisiones (capítulo «Provisiones regulatorias»), una función experimental fuera de la garantía SemVer 1.x. El backtesting y la integración con IFRS 9 corresponden a fases posteriores y no se cubren ni se infieren aquí.</w:t>
+        <w:t>El informe cubre el scorecard y reporta además el cálculo regulatorio de provisiones (capítulo «Provisiones regulatorias»), una función experimental fuera de la garantía SemVer 1.x. Esta corrida no ejecutó la capa de validación formal; el informe no infiere sus resultados.</w:t>
       </w:r>
     </w:p>
     <w:p>
@@ -32763,7 +33160,7 @@
         <w:rPr>
           <w:rFonts w:ascii="Consolas" w:hAnsi="Consolas"/>
         </w:rPr>
-        <w:t>c820682495a1f6877fce49eaf016a0842ad0947a25fa0e222c7af0d7bbf3d910</w:t>
+        <w:t>74a0876d4bfcc54b1d56052d70a7366f0ccf8567d464cf34f0855fd71f109549</w:t>
       </w:r>
     </w:p>
     <w:p>
@@ -32779,7 +33176,7 @@
         <w:rPr>
           <w:rFonts w:ascii="Consolas" w:hAnsi="Consolas"/>
         </w:rPr>
-        <w:t>2026-07-18T14:41:53.813063Z</w:t>
+        <w:t>2026-07-18T17:31:35.861760Z</w:t>
       </w:r>
     </w:p>
     <w:p>
@@ -32843,7 +33240,7 @@
         <w:rPr>
           <w:rFonts w:ascii="Consolas" w:hAnsi="Consolas"/>
         </w:rPr>
-        <w:t>4cb074c9286b4a5aa3d3eaf00655b7ef7dcceaa9</w:t>
+        <w:t>a5a1ff03301e747598fd60743ddd94b1e8793dab</w:t>
       </w:r>
     </w:p>
     <w:p>
@@ -32863,7 +33260,7 @@
         <w:br/>
         <w:t xml:space="preserve">  "PyYAML": "6.0.3",</w:t>
         <w:br/>
-        <w:t xml:space="preserve">  "nikodym": "1.2.0",</w:t>
+        <w:t xml:space="preserve">  "nikodym": "1.3.0",</w:t>
         <w:br/>
         <w:t xml:space="preserve">  "numpy": "2.4.6",</w:t>
         <w:br/>
@@ -39073,7 +39470,13 @@
         <w:br/>
         <w:t xml:space="preserve">  "provisioning_cmf.summary",</w:t>
         <w:br/>
-        <w:t xml:space="preserve">  "provisioning_internal.groups"</w:t>
+        <w:t xml:space="preserve">  "provisioning_internal.groups",</w:t>
+        <w:br/>
+        <w:t xml:space="preserve">  "data.states",</w:t>
+        <w:br/>
+        <w:t xml:space="preserve">  "data.partitions",</w:t>
+        <w:br/>
+        <w:t xml:space="preserve">  "data.exclusions"</w:t>
         <w:br/>
         <w:t>]</w:t>
       </w:r>
@@ -39096,7 +39499,535 @@
         <w:pStyle w:val="Heading2"/>
       </w:pPr>
       <w:r>
-        <w:t>C.1 Binning WoE y poder predictivo</w:t>
+        <w:t>C.1 Población, particiones y exclusiones</w:t>
+      </w:r>
+    </w:p>
+    <w:p>
+      <w:r>
+        <w:rPr>
+          <w:rFonts w:ascii="Consolas" w:hAnsi="Consolas"/>
+        </w:rPr>
+        <w:t>Artefacto de origen: data.data_card</w:t>
+      </w:r>
+    </w:p>
+    <w:p>
+      <w:pPr>
+        <w:pStyle w:val="Heading3"/>
+      </w:pPr>
+      <w:r>
+        <w:t>Parámetros y payload</w:t>
+      </w:r>
+    </w:p>
+    <w:p>
+      <w:r>
+        <w:rPr>
+          <w:b/>
+        </w:rPr>
+        <w:t>bad_rate</w:t>
+      </w:r>
+    </w:p>
+    <w:p>
+      <w:r>
+        <w:rPr>
+          <w:rFonts w:ascii="Consolas" w:hAnsi="Consolas"/>
+        </w:rPr>
+        <w:t>0.0690</w:t>
+      </w:r>
+    </w:p>
+    <w:p>
+      <w:r>
+        <w:rPr>
+          <w:b/>
+        </w:rPr>
+        <w:t>class_counts</w:t>
+      </w:r>
+    </w:p>
+    <w:p>
+      <w:r>
+        <w:rPr>
+          <w:rFonts w:ascii="Consolas" w:hAnsi="Consolas"/>
+        </w:rPr>
+        <w:t>{</w:t>
+        <w:br/>
+        <w:t xml:space="preserve">  "bueno": 5586,</w:t>
+        <w:br/>
+        <w:t xml:space="preserve">  "excluido": 0,</w:t>
+        <w:br/>
+        <w:t xml:space="preserve">  "indeterminado": 0,</w:t>
+        <w:br/>
+        <w:t xml:space="preserve">  "malo": 414</w:t>
+        <w:br/>
+        <w:t>}</w:t>
+      </w:r>
+    </w:p>
+    <w:p>
+      <w:r>
+        <w:rPr>
+          <w:b/>
+        </w:rPr>
+        <w:t>data_hash</w:t>
+      </w:r>
+    </w:p>
+    <w:p>
+      <w:r>
+        <w:rPr>
+          <w:rFonts w:ascii="Consolas" w:hAnsi="Consolas"/>
+        </w:rPr>
+        <w:t>7dcaf3d3cb708e97ff04697d5dc4c784057890291a2497e934f37a53854138b3</w:t>
+      </w:r>
+    </w:p>
+    <w:p>
+      <w:r>
+        <w:rPr>
+          <w:b/>
+        </w:rPr>
+        <w:t>effective_config</w:t>
+      </w:r>
+    </w:p>
+    <w:p>
+      <w:r>
+        <w:rPr>
+          <w:rFonts w:ascii="Consolas" w:hAnsi="Consolas"/>
+        </w:rPr>
+        <w:t>{</w:t>
+        <w:br/>
+        <w:t xml:space="preserve">  "load": {</w:t>
+        <w:br/>
+        <w:t xml:space="preserve">    "backend": "pandas",</w:t>
+        <w:br/>
+        <w:t xml:space="preserve">    "csv_options": {</w:t>
+        <w:br/>
+        <w:t xml:space="preserve">      "decimal": ".",</w:t>
+        <w:br/>
+        <w:t xml:space="preserve">      "encoding": "utf-8",</w:t>
+        <w:br/>
+        <w:t xml:space="preserve">      "sep": ","</w:t>
+        <w:br/>
+        <w:t xml:space="preserve">    },</w:t>
+        <w:br/>
+        <w:t xml:space="preserve">    "file_format": "auto",</w:t>
+        <w:br/>
+        <w:t xml:space="preserve">    "source": "/private/var/folders/12/yxnq95f55hg06fyynglz1scw0000gn/T/tmpzr7eolxf/datasets/provisiones_consumo.parquet"</w:t>
+        <w:br/>
+        <w:t xml:space="preserve">  },</w:t>
+        <w:br/>
+        <w:t xml:space="preserve">  "missing": {</w:t>
+        <w:br/>
+        <w:t xml:space="preserve">    "max_missing_rate": "0.9900",</w:t>
+        <w:br/>
+        <w:t xml:space="preserve">    "special_values": []</w:t>
+        <w:br/>
+        <w:t xml:space="preserve">  },</w:t>
+        <w:br/>
+        <w:t xml:space="preserve">  "partition": {</w:t>
+        <w:br/>
+        <w:t xml:space="preserve">    "min_bads_per_partition": 30,</w:t>
+        <w:br/>
+        <w:t xml:space="preserve">    "strategy": {</w:t>
+        <w:br/>
+        <w:t xml:space="preserve">      "cohort_col": "cohorte",</w:t>
+        <w:br/>
+        <w:t xml:space="preserve">      "holdout_fraction": "0.2000",</w:t>
+        <w:br/>
+        <w:t xml:space="preserve">      "oot_cohorts": [</w:t>
+        <w:br/>
+        <w:t xml:space="preserve">        "2024Q2"</w:t>
+        <w:br/>
+        <w:t xml:space="preserve">      ],</w:t>
+        <w:br/>
+        <w:t xml:space="preserve">      "type": "cohort"</w:t>
+        <w:br/>
+        <w:t xml:space="preserve">    },</w:t>
+        <w:br/>
+        <w:t xml:space="preserve">    "ttd_includes_excluded": true</w:t>
+        <w:br/>
+        <w:t xml:space="preserve">  },</w:t>
+        <w:br/>
+        <w:t xml:space="preserve">  "schema_": {</w:t>
+        <w:br/>
+        <w:t xml:space="preserve">    "columns": [</w:t>
+        <w:br/>
+        <w:t xml:space="preserve">      {</w:t>
+        <w:br/>
+        <w:t xml:space="preserve">        "coerce": false,</w:t>
+        <w:br/>
+        <w:t xml:space="preserve">        "dtype": "float",</w:t>
+        <w:br/>
+        <w:t xml:space="preserve">        "ge": null,</w:t>
+        <w:br/>
+        <w:t xml:space="preserve">        "isin": null,</w:t>
+        <w:br/>
+        <w:t xml:space="preserve">        "le": null,</w:t>
+        <w:br/>
+        <w:t xml:space="preserve">        "name": "ingreso_mensual",</w:t>
+        <w:br/>
+        <w:t xml:space="preserve">        "nullable": false,</w:t>
+        <w:br/>
+        <w:t xml:space="preserve">        "required": true,</w:t>
+        <w:br/>
+        <w:t xml:space="preserve">        "unique": false</w:t>
+        <w:br/>
+        <w:t xml:space="preserve">      },</w:t>
+        <w:br/>
+        <w:t xml:space="preserve">      {</w:t>
+        <w:br/>
+        <w:t xml:space="preserve">        "coerce": false,</w:t>
+        <w:br/>
+        <w:t xml:space="preserve">        "dtype": "float",</w:t>
+        <w:br/>
+        <w:t xml:space="preserve">        "ge": null,</w:t>
+        <w:br/>
+        <w:t xml:space="preserve">        "isin": null,</w:t>
+        <w:br/>
+        <w:t xml:space="preserve">        "le": null,</w:t>
+        <w:br/>
+        <w:t xml:space="preserve">        "name": "deuda_ingreso",</w:t>
+        <w:br/>
+        <w:t xml:space="preserve">        "nullable": false,</w:t>
+        <w:br/>
+        <w:t xml:space="preserve">        "required": true,</w:t>
+        <w:br/>
+        <w:t xml:space="preserve">        "unique": false</w:t>
+        <w:br/>
+        <w:t xml:space="preserve">      },</w:t>
+        <w:br/>
+        <w:t xml:space="preserve">      {</w:t>
+        <w:br/>
+        <w:t xml:space="preserve">        "coerce": false,</w:t>
+        <w:br/>
+        <w:t xml:space="preserve">        "dtype": "float",</w:t>
+        <w:br/>
+        <w:t xml:space="preserve">        "ge": null,</w:t>
+        <w:br/>
+        <w:t xml:space="preserve">        "isin": null,</w:t>
+        <w:br/>
+        <w:t xml:space="preserve">        "le": null,</w:t>
+        <w:br/>
+        <w:t xml:space="preserve">        "name": "utilizacion_linea",</w:t>
+        <w:br/>
+        <w:t xml:space="preserve">        "nullable": false,</w:t>
+        <w:br/>
+        <w:t xml:space="preserve">        "required": true,</w:t>
+        <w:br/>
+        <w:t xml:space="preserve">        "unique": false</w:t>
+        <w:br/>
+        <w:t xml:space="preserve">      },</w:t>
+        <w:br/>
+        <w:t xml:space="preserve">      {</w:t>
+        <w:br/>
+        <w:t xml:space="preserve">        "coerce": false,</w:t>
+        <w:br/>
+        <w:t xml:space="preserve">        "dtype": "int",</w:t>
+        <w:br/>
+        <w:t xml:space="preserve">        "ge": null,</w:t>
+        <w:br/>
+        <w:t xml:space="preserve">        "isin": null,</w:t>
+        <w:br/>
+        <w:t xml:space="preserve">        "le": null,</w:t>
+        <w:br/>
+        <w:t xml:space="preserve">        "name": "mora_max_12m",</w:t>
+        <w:br/>
+        <w:t xml:space="preserve">        "nullable": false,</w:t>
+        <w:br/>
+        <w:t xml:space="preserve">        "required": true,</w:t>
+        <w:br/>
+        <w:t xml:space="preserve">        "unique": false</w:t>
+        <w:br/>
+        <w:t xml:space="preserve">      },</w:t>
+        <w:br/>
+        <w:t xml:space="preserve">      {</w:t>
+        <w:br/>
+        <w:t xml:space="preserve">        "coerce": false,</w:t>
+        <w:br/>
+        <w:t xml:space="preserve">        "dtype": "int",</w:t>
+        <w:br/>
+        <w:t xml:space="preserve">        "ge": null,</w:t>
+        <w:br/>
+        <w:t xml:space="preserve">        "isin": null,</w:t>
+        <w:br/>
+        <w:t xml:space="preserve">        "le": null,</w:t>
+        <w:br/>
+        <w:t xml:space="preserve">        "name": "antiguedad_meses",</w:t>
+        <w:br/>
+        <w:t xml:space="preserve">        "nullable": false,</w:t>
+        <w:br/>
+        <w:t xml:space="preserve">        "required": true,</w:t>
+        <w:br/>
+        <w:t xml:space="preserve">        "unique": false</w:t>
+        <w:br/>
+        <w:t xml:space="preserve">      },</w:t>
+        <w:br/>
+        <w:t xml:space="preserve">      {</w:t>
+        <w:br/>
+        <w:t xml:space="preserve">        "coerce": false,</w:t>
+        <w:br/>
+        <w:t xml:space="preserve">        "dtype": "str",</w:t>
+        <w:br/>
+        <w:t xml:space="preserve">        "ge": null,</w:t>
+        <w:br/>
+        <w:t xml:space="preserve">        "isin": null,</w:t>
+        <w:br/>
+        <w:t xml:space="preserve">        "le": null,</w:t>
+        <w:br/>
+        <w:t xml:space="preserve">        "name": "segmento",</w:t>
+        <w:br/>
+        <w:t xml:space="preserve">        "nullable": false,</w:t>
+        <w:br/>
+        <w:t xml:space="preserve">        "required": true,</w:t>
+        <w:br/>
+        <w:t xml:space="preserve">        "unique": false</w:t>
+        <w:br/>
+        <w:t xml:space="preserve">      },</w:t>
+        <w:br/>
+        <w:t xml:space="preserve">      {</w:t>
+        <w:br/>
+        <w:t xml:space="preserve">        "coerce": false,</w:t>
+        <w:br/>
+        <w:t xml:space="preserve">        "dtype": "str",</w:t>
+        <w:br/>
+        <w:t xml:space="preserve">        "ge": null,</w:t>
+        <w:br/>
+        <w:t xml:space="preserve">        "isin": null,</w:t>
+        <w:br/>
+        <w:t xml:space="preserve">        "le": null,</w:t>
+        <w:br/>
+        <w:t xml:space="preserve">        "name": "cohorte",</w:t>
+        <w:br/>
+        <w:t xml:space="preserve">        "nullable": false,</w:t>
+        <w:br/>
+        <w:t xml:space="preserve">        "required": true,</w:t>
+        <w:br/>
+        <w:t xml:space="preserve">        "unique": false</w:t>
+        <w:br/>
+        <w:t xml:space="preserve">      },</w:t>
+        <w:br/>
+        <w:t xml:space="preserve">      {</w:t>
+        <w:br/>
+        <w:t xml:space="preserve">        "coerce": false,</w:t>
+        <w:br/>
+        <w:t xml:space="preserve">        "dtype": "int",</w:t>
+        <w:br/>
+        <w:t xml:space="preserve">        "ge": null,</w:t>
+        <w:br/>
+        <w:t xml:space="preserve">        "isin": null,</w:t>
+        <w:br/>
+        <w:t xml:space="preserve">        "le": null,</w:t>
+        <w:br/>
+        <w:t xml:space="preserve">        "name": "bad_flag",</w:t>
+        <w:br/>
+        <w:t xml:space="preserve">        "nullable": false,</w:t>
+        <w:br/>
+        <w:t xml:space="preserve">        "required": true,</w:t>
+        <w:br/>
+        <w:t xml:space="preserve">        "unique": false</w:t>
+        <w:br/>
+        <w:t xml:space="preserve">      }</w:t>
+        <w:br/>
+        <w:t xml:space="preserve">    ],</w:t>
+        <w:br/>
+        <w:t xml:space="preserve">    "index_col": "loan_id",</w:t>
+        <w:br/>
+        <w:t xml:space="preserve">    "ordered": false,</w:t>
+        <w:br/>
+        <w:t xml:space="preserve">    "strict": false,</w:t>
+        <w:br/>
+        <w:t xml:space="preserve">    "unique_keys": null</w:t>
+        <w:br/>
+        <w:t xml:space="preserve">  },</w:t>
+        <w:br/>
+        <w:t xml:space="preserve">  "target": {</w:t>
+        <w:br/>
+        <w:t xml:space="preserve">    "bad_rule": {</w:t>
+        <w:br/>
+        <w:t xml:space="preserve">      "all_of": [</w:t>
+        <w:br/>
+        <w:t xml:space="preserve">        {</w:t>
+        <w:br/>
+        <w:t xml:space="preserve">          "col": "bad_flag",</w:t>
+        <w:br/>
+        <w:t xml:space="preserve">          "op": "==",</w:t>
+        <w:br/>
+        <w:t xml:space="preserve">          "value": 1</w:t>
+        <w:br/>
+        <w:t xml:space="preserve">        }</w:t>
+        <w:br/>
+        <w:t xml:space="preserve">      ],</w:t>
+        <w:br/>
+        <w:t xml:space="preserve">      "any_of": []</w:t>
+        <w:br/>
+        <w:t xml:space="preserve">    },</w:t>
+        <w:br/>
+        <w:t xml:space="preserve">    "exclusion_rules": [],</w:t>
+        <w:br/>
+        <w:t xml:space="preserve">    "good_rule": null,</w:t>
+        <w:br/>
+        <w:t xml:space="preserve">    "indeterminate_rule": null,</w:t>
+        <w:br/>
+        <w:t xml:space="preserve">    "target_col": "target",</w:t>
+        <w:br/>
+        <w:t xml:space="preserve">    "window": null</w:t>
+        <w:br/>
+        <w:t xml:space="preserve">  },</w:t>
+        <w:br/>
+        <w:t xml:space="preserve">  "type": "standard"</w:t>
+        <w:br/>
+        <w:t>}</w:t>
+      </w:r>
+    </w:p>
+    <w:p>
+      <w:r>
+        <w:rPr>
+          <w:b/>
+        </w:rPr>
+        <w:t>exclusions_by_reason</w:t>
+      </w:r>
+    </w:p>
+    <w:p>
+      <w:r>
+        <w:rPr>
+          <w:rFonts w:ascii="Consolas" w:hAnsi="Consolas"/>
+        </w:rPr>
+        <w:t>{}</w:t>
+      </w:r>
+    </w:p>
+    <w:p>
+      <w:r>
+        <w:rPr>
+          <w:b/>
+        </w:rPr>
+        <w:t>n_features</w:t>
+      </w:r>
+    </w:p>
+    <w:p>
+      <w:r>
+        <w:rPr>
+          <w:rFonts w:ascii="Consolas" w:hAnsi="Consolas"/>
+        </w:rPr>
+        <w:t>17</w:t>
+      </w:r>
+    </w:p>
+    <w:p>
+      <w:r>
+        <w:rPr>
+          <w:b/>
+        </w:rPr>
+        <w:t>n_rows</w:t>
+      </w:r>
+    </w:p>
+    <w:p>
+      <w:r>
+        <w:rPr>
+          <w:rFonts w:ascii="Consolas" w:hAnsi="Consolas"/>
+        </w:rPr>
+        <w:t>6000</w:t>
+      </w:r>
+    </w:p>
+    <w:p>
+      <w:r>
+        <w:rPr>
+          <w:b/>
+        </w:rPr>
+        <w:t>partition_bad_rates</w:t>
+      </w:r>
+    </w:p>
+    <w:p>
+      <w:r>
+        <w:rPr>
+          <w:rFonts w:ascii="Consolas" w:hAnsi="Consolas"/>
+        </w:rPr>
+        <w:t>{</w:t>
+        <w:br/>
+        <w:t xml:space="preserve">  "desarrollo": "0.0663",</w:t>
+        <w:br/>
+        <w:t xml:space="preserve">  "fuera_de_modelo": "0.0000",</w:t>
+        <w:br/>
+        <w:t xml:space="preserve">  "holdout": "0.0723",</w:t>
+        <w:br/>
+        <w:t xml:space="preserve">  "oot": "0.0760"</w:t>
+        <w:br/>
+        <w:t>}</w:t>
+      </w:r>
+    </w:p>
+    <w:p>
+      <w:r>
+        <w:rPr>
+          <w:b/>
+        </w:rPr>
+        <w:t>partition_sizes</w:t>
+      </w:r>
+    </w:p>
+    <w:p>
+      <w:r>
+        <w:rPr>
+          <w:rFonts w:ascii="Consolas" w:hAnsi="Consolas"/>
+        </w:rPr>
+        <w:t>{</w:t>
+        <w:br/>
+        <w:t xml:space="preserve">  "desarrollo": 3939,</w:t>
+        <w:br/>
+        <w:t xml:space="preserve">  "fuera_de_modelo": 0,</w:t>
+        <w:br/>
+        <w:t xml:space="preserve">  "holdout": 1009,</w:t>
+        <w:br/>
+        <w:t xml:space="preserve">  "oot": 1052</w:t>
+        <w:br/>
+        <w:t>}</w:t>
+      </w:r>
+    </w:p>
+    <w:p>
+      <w:r>
+        <w:rPr>
+          <w:b/>
+        </w:rPr>
+        <w:t>performance_window_months</w:t>
+      </w:r>
+    </w:p>
+    <w:p>
+      <w:r>
+        <w:rPr>
+          <w:rFonts w:ascii="Consolas" w:hAnsi="Consolas"/>
+        </w:rPr>
+        <w:t>No disponible</w:t>
+      </w:r>
+    </w:p>
+    <w:p>
+      <w:r>
+        <w:rPr>
+          <w:b/>
+        </w:rPr>
+        <w:t>source</w:t>
+      </w:r>
+    </w:p>
+    <w:p>
+      <w:r>
+        <w:rPr>
+          <w:rFonts w:ascii="Consolas" w:hAnsi="Consolas"/>
+        </w:rPr>
+        <w:t>provisiones_consumo.parquet</w:t>
+      </w:r>
+    </w:p>
+    <w:p>
+      <w:r>
+        <w:rPr>
+          <w:b/>
+        </w:rPr>
+        <w:t>target_col</w:t>
+      </w:r>
+    </w:p>
+    <w:p>
+      <w:r>
+        <w:rPr>
+          <w:rFonts w:ascii="Consolas" w:hAnsi="Consolas"/>
+        </w:rPr>
+        <w:t>target</w:t>
+      </w:r>
+    </w:p>
+    <w:p>
+      <w:pPr>
+        <w:pStyle w:val="Heading2"/>
+      </w:pPr>
+      <w:r>
+        <w:t>C.2 Binning WoE y poder predictivo</w:t>
       </w:r>
     </w:p>
     <w:p>
@@ -39113,6 +40044,102 @@
       </w:pPr>
       <w:r>
         <w:t>Parámetros y payload</w:t>
+      </w:r>
+    </w:p>
+    <w:p>
+      <w:r>
+        <w:rPr>
+          <w:b/>
+        </w:rPr>
+        <w:t>effective_config</w:t>
+      </w:r>
+    </w:p>
+    <w:p>
+      <w:r>
+        <w:rPr>
+          <w:rFonts w:ascii="Consolas" w:hAnsi="Consolas"/>
+        </w:rPr>
+        <w:t>{</w:t>
+        <w:br/>
+        <w:t xml:space="preserve">  "cat_cutoff": "0.010000",</w:t>
+        <w:br/>
+        <w:t xml:space="preserve">  "cat_unknown": null,</w:t>
+        <w:br/>
+        <w:t xml:space="preserve">  "categorical_columns": [</w:t>
+        <w:br/>
+        <w:t xml:space="preserve">    "segmento"</w:t>
+        <w:br/>
+        <w:t xml:space="preserve">  ],</w:t>
+        <w:br/>
+        <w:t xml:space="preserve">  "exclude_columns": [],</w:t>
+        <w:br/>
+        <w:t xml:space="preserve">  "fail_on_non_binnable": false,</w:t>
+        <w:br/>
+        <w:t xml:space="preserve">  "feature_columns": [</w:t>
+        <w:br/>
+        <w:t xml:space="preserve">    "ingreso_mensual",</w:t>
+        <w:br/>
+        <w:t xml:space="preserve">    "deuda_ingreso",</w:t>
+        <w:br/>
+        <w:t xml:space="preserve">    "utilizacion_linea",</w:t>
+        <w:br/>
+        <w:t xml:space="preserve">    "mora_max_12m",</w:t>
+        <w:br/>
+        <w:t xml:space="preserve">    "antiguedad_meses",</w:t>
+        <w:br/>
+        <w:t xml:space="preserve">    "segmento"</w:t>
+        <w:br/>
+        <w:t xml:space="preserve">  ],</w:t>
+        <w:br/>
+        <w:t xml:space="preserve">  "keep_structural_columns": true,</w:t>
+        <w:br/>
+        <w:t xml:space="preserve">  "max_n_bins": 6,</w:t>
+        <w:br/>
+        <w:t xml:space="preserve">  "max_n_prebins": 20,</w:t>
+        <w:br/>
+        <w:t xml:space="preserve">  "max_pvalue": null,</w:t>
+        <w:br/>
+        <w:t xml:space="preserve">  "max_pvalue_policy": "consecutive",</w:t>
+        <w:br/>
+        <w:t xml:space="preserve">  "metric_missing": "empirical",</w:t>
+        <w:br/>
+        <w:t xml:space="preserve">  "metric_special": "empirical",</w:t>
+        <w:br/>
+        <w:t xml:space="preserve">  "min_bin_n_event": 1,</w:t>
+        <w:br/>
+        <w:t xml:space="preserve">  "min_bin_n_nonevent": 1,</w:t>
+        <w:br/>
+        <w:t xml:space="preserve">  "min_bin_size": "0.050000",</w:t>
+        <w:br/>
+        <w:t xml:space="preserve">  "min_event_rate_diff": "0.0000",</w:t>
+        <w:br/>
+        <w:t xml:space="preserve">  "min_n_bins": null,</w:t>
+        <w:br/>
+        <w:t xml:space="preserve">  "min_prebin_size": "0.050000",</w:t>
+        <w:br/>
+        <w:t xml:space="preserve">  "mip_solver": "bop",</w:t>
+        <w:br/>
+        <w:t xml:space="preserve">  "monotonic_trend": "auto_asc_desc",</w:t>
+        <w:br/>
+        <w:t xml:space="preserve">  "n_jobs": null,</w:t>
+        <w:br/>
+        <w:t xml:space="preserve">  "output_suffix": "__woe",</w:t>
+        <w:br/>
+        <w:t xml:space="preserve">  "require_optimal": true,</w:t>
+        <w:br/>
+        <w:t xml:space="preserve">  "solver": "mip",</w:t>
+        <w:br/>
+        <w:t xml:space="preserve">  "special_handling": "separate",</w:t>
+        <w:br/>
+        <w:t xml:space="preserve">  "split_digits": null,</w:t>
+        <w:br/>
+        <w:t xml:space="preserve">  "time_limit": 10,</w:t>
+        <w:br/>
+        <w:t xml:space="preserve">  "type": "standard",</w:t>
+        <w:br/>
+        <w:t xml:space="preserve">  "variable_overrides": []</w:t>
+        <w:br/>
+        <w:t>}</w:t>
       </w:r>
     </w:p>
     <w:p>
@@ -39276,7 +40303,7 @@
         <w:pStyle w:val="Heading2"/>
       </w:pPr>
       <w:r>
-        <w:t>C.2 Selección de variables</w:t>
+        <w:t>C.3 Selección de variables</w:t>
       </w:r>
     </w:p>
     <w:p>
@@ -39319,6 +40346,102 @@
         <w:t xml:space="preserve">  "scipy": "1.18.0",</w:t>
         <w:br/>
         <w:t xml:space="preserve">  "statsmodels": "0.14.6"</w:t>
+        <w:br/>
+        <w:t>}</w:t>
+      </w:r>
+    </w:p>
+    <w:p>
+      <w:r>
+        <w:rPr>
+          <w:b/>
+        </w:rPr>
+        <w:t>effective_config</w:t>
+      </w:r>
+    </w:p>
+    <w:p>
+      <w:r>
+        <w:rPr>
+          <w:rFonts w:ascii="Consolas" w:hAnsi="Consolas"/>
+        </w:rPr>
+        <w:t>{</w:t>
+        <w:br/>
+        <w:t xml:space="preserve">  "compute_univariate_metrics": true,</w:t>
+        <w:br/>
+        <w:t xml:space="preserve">  "correlation": {</w:t>
+        <w:br/>
+        <w:t xml:space="preserve">    "clustering_method": "none",</w:t>
+        <w:br/>
+        <w:t xml:space="preserve">    "enabled": true,</w:t>
+        <w:br/>
+        <w:t xml:space="preserve">    "method": "pearson",</w:t>
+        <w:br/>
+        <w:t xml:space="preserve">    "threshold": "0.750000"</w:t>
+        <w:br/>
+        <w:t xml:space="preserve">  },</w:t>
+        <w:br/>
+        <w:t xml:space="preserve">  "exclude_columns": [],</w:t>
+        <w:br/>
+        <w:t xml:space="preserve">  "fail_if_no_features": true,</w:t>
+        <w:br/>
+        <w:t xml:space="preserve">  "feature_columns": "*",</w:t>
+        <w:br/>
+        <w:t xml:space="preserve">  "force_exclude": [],</w:t>
+        <w:br/>
+        <w:t xml:space="preserve">  "force_include": [],</w:t>
+        <w:br/>
+        <w:t xml:space="preserve">  "keep_structural_columns": true,</w:t>
+        <w:br/>
+        <w:t xml:space="preserve">  "max_iv": "0.500000",</w:t>
+        <w:br/>
+        <w:t xml:space="preserve">  "max_iv_action": "flag",</w:t>
+        <w:br/>
+        <w:t xml:space="preserve">  "min_auc": null,</w:t>
+        <w:br/>
+        <w:t xml:space="preserve">  "min_gini": null,</w:t>
+        <w:br/>
+        <w:t xml:space="preserve">  "min_iv": "0.020000",</w:t>
+        <w:br/>
+        <w:t xml:space="preserve">  "min_ks": null,</w:t>
+        <w:br/>
+        <w:t xml:space="preserve">  "priority_order": [</w:t>
+        <w:br/>
+        <w:t xml:space="preserve">    "iv",</w:t>
+        <w:br/>
+        <w:t xml:space="preserve">    "auc",</w:t>
+        <w:br/>
+        <w:t xml:space="preserve">    "ks",</w:t>
+        <w:br/>
+        <w:t xml:space="preserve">    "name"</w:t>
+        <w:br/>
+        <w:t xml:space="preserve">  ],</w:t>
+        <w:br/>
+        <w:t xml:space="preserve">  "stability": {</w:t>
+        <w:br/>
+        <w:t xml:space="preserve">    "action": "report_only",</w:t>
+        <w:br/>
+        <w:t xml:space="preserve">    "enabled": false,</w:t>
+        <w:br/>
+        <w:t xml:space="preserve">    "review_threshold": "0.250000",</w:t>
+        <w:br/>
+        <w:t xml:space="preserve">    "smoothing": "0.000001",</w:t>
+        <w:br/>
+        <w:t xml:space="preserve">    "stable_threshold": "0.100000"</w:t>
+        <w:br/>
+        <w:t xml:space="preserve">  },</w:t>
+        <w:br/>
+        <w:t xml:space="preserve">  "type": "standard",</w:t>
+        <w:br/>
+        <w:t xml:space="preserve">  "vif": {</w:t>
+        <w:br/>
+        <w:t xml:space="preserve">    "add_intercept": true,</w:t>
+        <w:br/>
+        <w:t xml:space="preserve">    "enabled": true,</w:t>
+        <w:br/>
+        <w:t xml:space="preserve">    "max_iterations": null,</w:t>
+        <w:br/>
+        <w:t xml:space="preserve">    "threshold": "5.000000"</w:t>
+        <w:br/>
+        <w:t xml:space="preserve">  }</w:t>
         <w:br/>
         <w:t>}</w:t>
       </w:r>
@@ -39540,7 +40663,7 @@
         <w:pStyle w:val="Heading2"/>
       </w:pPr>
       <w:r>
-        <w:t>C.3 Modelo PD</w:t>
+        <w:t>C.4 Modelo PD</w:t>
       </w:r>
     </w:p>
     <w:p>
@@ -39583,6 +40706,80 @@
         <w:t xml:space="preserve">  "scipy": "1.18.0",</w:t>
         <w:br/>
         <w:t xml:space="preserve">  "statsmodels": "0.14.6"</w:t>
+        <w:br/>
+        <w:t>}</w:t>
+      </w:r>
+    </w:p>
+    <w:p>
+      <w:r>
+        <w:rPr>
+          <w:b/>
+        </w:rPr>
+        <w:t>effective_config</w:t>
+      </w:r>
+    </w:p>
+    <w:p>
+      <w:r>
+        <w:rPr>
+          <w:rFonts w:ascii="Consolas" w:hAnsi="Consolas"/>
+        </w:rPr>
+        <w:t>{</w:t>
+        <w:br/>
+        <w:t xml:space="preserve">  "alpha": "0.050000",</w:t>
+        <w:br/>
+        <w:t xml:space="preserve">  "engine": "logit",</w:t>
+        <w:br/>
+        <w:t xml:space="preserve">  "fail_if_no_features": true,</w:t>
+        <w:br/>
+        <w:t xml:space="preserve">  "fit_intercept": true,</w:t>
+        <w:br/>
+        <w:t xml:space="preserve">  "fit_maxiter": 100,</w:t>
+        <w:br/>
+        <w:t xml:space="preserve">  "force_exclude": [],</w:t>
+        <w:br/>
+        <w:t xml:space="preserve">  "force_include": [],</w:t>
+        <w:br/>
+        <w:t xml:space="preserve">  "iv_contribution": {</w:t>
+        <w:br/>
+        <w:t xml:space="preserve">    "action": "flag",</w:t>
+        <w:br/>
+        <w:t xml:space="preserve">    "threshold": "0.900000"</w:t>
+        <w:br/>
+        <w:t xml:space="preserve">  },</w:t>
+        <w:br/>
+        <w:t xml:space="preserve">  "optimizer": "newton",</w:t>
+        <w:br/>
+        <w:t xml:space="preserve">  "sign_policy": {</w:t>
+        <w:br/>
+        <w:t xml:space="preserve">    "action": "flag",</w:t>
+        <w:br/>
+        <w:t xml:space="preserve">    "expected_beta_sign": "negative",</w:t>
+        <w:br/>
+        <w:t xml:space="preserve">    "fail_on_forced_inverted": false</w:t>
+        <w:br/>
+        <w:t xml:space="preserve">  },</w:t>
+        <w:br/>
+        <w:t xml:space="preserve">  "stepwise": {</w:t>
+        <w:br/>
+        <w:t xml:space="preserve">    "criterion": "wald_pvalue",</w:t>
+        <w:br/>
+        <w:t xml:space="preserve">    "direction": "bidirectional",</w:t>
+        <w:br/>
+        <w:t xml:space="preserve">    "enabled": true,</w:t>
+        <w:br/>
+        <w:t xml:space="preserve">    "entry_p_value": "0.050000",</w:t>
+        <w:br/>
+        <w:t xml:space="preserve">    "exit_p_value": "0.050000",</w:t>
+        <w:br/>
+        <w:t xml:space="preserve">    "max_iter": 100,</w:t>
+        <w:br/>
+        <w:t xml:space="preserve">    "min_features": 1</w:t>
+        <w:br/>
+        <w:t xml:space="preserve">  },</w:t>
+        <w:br/>
+        <w:t xml:space="preserve">  "tol": "0.000000",</w:t>
+        <w:br/>
+        <w:t xml:space="preserve">  "type": "standard"</w:t>
         <w:br/>
         <w:t>}</w:t>
       </w:r>
@@ -39798,7 +40995,7 @@
         <w:pStyle w:val="Heading2"/>
       </w:pPr>
       <w:r>
-        <w:t>C.4 Scorecard</w:t>
+        <w:t>C.5 Scorecard</w:t>
       </w:r>
     </w:p>
     <w:p>
@@ -39835,6 +41032,50 @@
         <w:t xml:space="preserve">  "numpy": "2.4.6",</w:t>
         <w:br/>
         <w:t xml:space="preserve">  "pandas": "2.3.3"</w:t>
+        <w:br/>
+        <w:t>}</w:t>
+      </w:r>
+    </w:p>
+    <w:p>
+      <w:r>
+        <w:rPr>
+          <w:b/>
+        </w:rPr>
+        <w:t>effective_config</w:t>
+      </w:r>
+    </w:p>
+    <w:p>
+      <w:r>
+        <w:rPr>
+          <w:rFonts w:ascii="Consolas" w:hAnsi="Consolas"/>
+        </w:rPr>
+        <w:t>{</w:t>
+        <w:br/>
+        <w:t xml:space="preserve">  "clip": false,</w:t>
+        <w:br/>
+        <w:t xml:space="preserve">  "intercept_allocation": "uniform",</w:t>
+        <w:br/>
+        <w:t xml:space="preserve">  "max_score": null,</w:t>
+        <w:br/>
+        <w:t xml:space="preserve">  "min_score": null,</w:t>
+        <w:br/>
+        <w:t xml:space="preserve">  "output_suffix": "__points",</w:t>
+        <w:br/>
+        <w:t xml:space="preserve">  "pdo": "20.000000",</w:t>
+        <w:br/>
+        <w:t xml:space="preserve">  "point_overrides": [],</w:t>
+        <w:br/>
+        <w:t xml:space="preserve">  "rounding_method": "nearest_integer",</w:t>
+        <w:br/>
+        <w:t xml:space="preserve">  "score_column": "score",</w:t>
+        <w:br/>
+        <w:t xml:space="preserve">  "score_direction": "higher_is_lower_risk",</w:t>
+        <w:br/>
+        <w:t xml:space="preserve">  "target_odds": "50.000000",</w:t>
+        <w:br/>
+        <w:t xml:space="preserve">  "target_score": "600.000000",</w:t>
+        <w:br/>
+        <w:t xml:space="preserve">  "type": "standard"</w:t>
         <w:br/>
         <w:t>}</w:t>
       </w:r>
@@ -40064,7 +41305,7 @@
         <w:pStyle w:val="Heading2"/>
       </w:pPr>
       <w:r>
-        <w:t>C.5 Calibración</w:t>
+        <w:t>C.6 Calibración</w:t>
       </w:r>
     </w:p>
     <w:p>
@@ -40151,6 +41392,58 @@
         <w:t xml:space="preserve">  "pandas": "2.3.3",</w:t>
         <w:br/>
         <w:t xml:space="preserve">  "scipy": "1.18.0"</w:t>
+        <w:br/>
+        <w:t>}</w:t>
+      </w:r>
+    </w:p>
+    <w:p>
+      <w:r>
+        <w:rPr>
+          <w:b/>
+        </w:rPr>
+        <w:t>effective_config</w:t>
+      </w:r>
+    </w:p>
+    <w:p>
+      <w:r>
+        <w:rPr>
+          <w:rFonts w:ascii="Consolas" w:hAnsi="Consolas"/>
+        </w:rPr>
+        <w:t>{</w:t>
+        <w:br/>
+        <w:t xml:space="preserve">  "anchor_kind": "through_the_cycle",</w:t>
+        <w:br/>
+        <w:t xml:space="preserve">  "anchor_source": "development_observed",</w:t>
+        <w:br/>
+        <w:t xml:space="preserve">  "fit_partition": "desarrollo",</w:t>
+        <w:br/>
+        <w:t xml:space="preserve">  "linear_predictor_calibrated_column": "linear_predictor_calibrated",</w:t>
+        <w:br/>
+        <w:t xml:space="preserve">  "linear_predictor_column": "linear_predictor",</w:t>
+        <w:br/>
+        <w:t xml:space="preserve">  "max_abs_offset": null,</w:t>
+        <w:br/>
+        <w:t xml:space="preserve">  "max_iter": 100,</w:t>
+        <w:br/>
+        <w:t xml:space="preserve">  "method": "intercept_offset",</w:t>
+        <w:br/>
+        <w:t xml:space="preserve">  "min_fit_rows": 30,</w:t>
+        <w:br/>
+        <w:t xml:space="preserve">  "partition_column": "partition",</w:t>
+        <w:br/>
+        <w:t xml:space="preserve">  "pd_calibrated_column": "pd_calibrated",</w:t>
+        <w:br/>
+        <w:t xml:space="preserve">  "pd_raw_column": "pd_raw",</w:t>
+        <w:br/>
+        <w:t xml:space="preserve">  "require_both_classes_for_supervised": true,</w:t>
+        <w:br/>
+        <w:t xml:space="preserve">  "target_column": "target",</w:t>
+        <w:br/>
+        <w:t xml:space="preserve">  "target_pd": null,</w:t>
+        <w:br/>
+        <w:t xml:space="preserve">  "target_tolerance": "0.000000",</w:t>
+        <w:br/>
+        <w:t xml:space="preserve">  "type": "standard"</w:t>
         <w:br/>
         <w:t>}</w:t>
       </w:r>
@@ -40368,7 +41661,7 @@
         <w:pStyle w:val="Heading2"/>
       </w:pPr>
       <w:r>
-        <w:t>C.6 Desempeño y discriminación</w:t>
+        <w:t>C.7 Desempeño y discriminación</w:t>
       </w:r>
     </w:p>
     <w:p>
@@ -40431,6 +41724,58 @@
         <w:t xml:space="preserve">  "pandas": "2.3.3",</w:t>
         <w:br/>
         <w:t xml:space="preserve">  "scikit-learn": "1.7.2"</w:t>
+        <w:br/>
+        <w:t>}</w:t>
+      </w:r>
+    </w:p>
+    <w:p>
+      <w:r>
+        <w:rPr>
+          <w:b/>
+        </w:rPr>
+        <w:t>effective_config</w:t>
+      </w:r>
+    </w:p>
+    <w:p>
+      <w:r>
+        <w:rPr>
+          <w:rFonts w:ascii="Consolas" w:hAnsi="Consolas"/>
+        </w:rPr>
+        <w:t>{</w:t>
+        <w:br/>
+        <w:t xml:space="preserve">  "evaluation_source": "pd_calibrated",</w:t>
+        <w:br/>
+        <w:t xml:space="preserve">  "min_events_per_partition": 1,</w:t>
+        <w:br/>
+        <w:t xml:space="preserve">  "min_rows_per_partition": 30,</w:t>
+        <w:br/>
+        <w:t xml:space="preserve">  "n_deciles": 10,</w:t>
+        <w:br/>
+        <w:t xml:space="preserve">  "optional_thresholds": {},</w:t>
+        <w:br/>
+        <w:t xml:space="preserve">  "partition_column": "partition",</w:t>
+        <w:br/>
+        <w:t xml:space="preserve">  "partitions": [</w:t>
+        <w:br/>
+        <w:t xml:space="preserve">    "desarrollo",</w:t>
+        <w:br/>
+        <w:t xml:space="preserve">    "holdout",</w:t>
+        <w:br/>
+        <w:t xml:space="preserve">    "oot"</w:t>
+        <w:br/>
+        <w:t xml:space="preserve">  ],</w:t>
+        <w:br/>
+        <w:t xml:space="preserve">  "pd_column": "pd_calibrated",</w:t>
+        <w:br/>
+        <w:t xml:space="preserve">  "schema_version": "1.0.0",</w:t>
+        <w:br/>
+        <w:t xml:space="preserve">  "score_column": "score",</w:t>
+        <w:br/>
+        <w:t xml:space="preserve">  "score_direction": "higher_is_lower_risk",</w:t>
+        <w:br/>
+        <w:t xml:space="preserve">  "target_column": "target",</w:t>
+        <w:br/>
+        <w:t xml:space="preserve">  "type": "standard"</w:t>
         <w:br/>
         <w:t>}</w:t>
       </w:r>
@@ -40616,7 +41961,7 @@
         <w:pStyle w:val="Heading2"/>
       </w:pPr>
       <w:r>
-        <w:t>C.7 Estabilidad</w:t>
+        <w:t>C.8 Estabilidad</w:t>
       </w:r>
     </w:p>
     <w:p>
@@ -40715,6 +42060,64 @@
         <w:t xml:space="preserve">  "pandas": "2.3.3",</w:t>
         <w:br/>
         <w:t xml:space="preserve">  "pandera": "0.32.0"</w:t>
+        <w:br/>
+        <w:t>}</w:t>
+      </w:r>
+    </w:p>
+    <w:p>
+      <w:r>
+        <w:rPr>
+          <w:b/>
+        </w:rPr>
+        <w:t>effective_config</w:t>
+      </w:r>
+    </w:p>
+    <w:p>
+      <w:r>
+        <w:rPr>
+          <w:rFonts w:ascii="Consolas" w:hAnsi="Consolas"/>
+        </w:rPr>
+        <w:t>{</w:t>
+        <w:br/>
+        <w:t xml:space="preserve">  "comparisons": [</w:t>
+        <w:br/>
+        <w:t xml:space="preserve">    "dev_vs_holdout",</w:t>
+        <w:br/>
+        <w:t xml:space="preserve">    "dev_vs_oot"</w:t>
+        <w:br/>
+        <w:t xml:space="preserve">  ],</w:t>
+        <w:br/>
+        <w:t xml:space="preserve">  "csi_bins": 10,</w:t>
+        <w:br/>
+        <w:t xml:space="preserve">  "csi_source": "score_points",</w:t>
+        <w:br/>
+        <w:t xml:space="preserve">  "include_pd_stability": true,</w:t>
+        <w:br/>
+        <w:t xml:space="preserve">  "partition_column": "partition",</w:t>
+        <w:br/>
+        <w:t xml:space="preserve">  "pd_column": "pd_calibrated",</w:t>
+        <w:br/>
+        <w:t xml:space="preserve">  "psi_bins": 10,</w:t>
+        <w:br/>
+        <w:t xml:space="preserve">  "psi_review_threshold": "0.250000",</w:t>
+        <w:br/>
+        <w:t xml:space="preserve">  "psi_stable_threshold": "0.100000",</w:t>
+        <w:br/>
+        <w:t xml:space="preserve">  "schema_version": "1.0.0",</w:t>
+        <w:br/>
+        <w:t xml:space="preserve">  "score_column": "score",</w:t>
+        <w:br/>
+        <w:t xml:space="preserve">  "score_direction": "higher_is_lower_risk",</w:t>
+        <w:br/>
+        <w:t xml:space="preserve">  "smoothing": "0.000001",</w:t>
+        <w:br/>
+        <w:t xml:space="preserve">  "temporal_axis": "period",</w:t>
+        <w:br/>
+        <w:t xml:space="preserve">  "temporal_column": null,</w:t>
+        <w:br/>
+        <w:t xml:space="preserve">  "temporal_freq": "M",</w:t>
+        <w:br/>
+        <w:t xml:space="preserve">  "type": "standard"</w:t>
         <w:br/>
         <w:t>}</w:t>
       </w:r>

</xml_diff>

<commit_message>
test(demo): recapturar F3 con parámetros efectivos
</commit_message>
<xml_diff>
--- a/web/src/fixtures/demo/report.docx
+++ b/web/src/fixtures/demo/report.docx
@@ -183,7 +183,7 @@
         <w:rPr>
           <w:rFonts w:ascii="Consolas" w:hAnsi="Consolas"/>
         </w:rPr>
-        <w:t>config_hash=74a0876d4bfcc54b1d56052d70a7366f0ccf8567d464cf34f0855fd71f109549</w:t>
+        <w:t>config_hash=a242df1ee782350358b90ab8837ae4dcd9445197dad22734f506dfde2818d254</w:t>
       </w:r>
     </w:p>
     <w:p>
@@ -199,7 +199,7 @@
         <w:rPr>
           <w:rFonts w:ascii="Consolas" w:hAnsi="Consolas"/>
         </w:rPr>
-        <w:t>git_sha=a5a1ff03301e747598fd60743ddd94b1e8793dab</w:t>
+        <w:t>git_sha=0f1551bae9dae111d64814f6aed0837147b3b74c</w:t>
       </w:r>
     </w:p>
     <w:p>
@@ -33160,7 +33160,7 @@
         <w:rPr>
           <w:rFonts w:ascii="Consolas" w:hAnsi="Consolas"/>
         </w:rPr>
-        <w:t>74a0876d4bfcc54b1d56052d70a7366f0ccf8567d464cf34f0855fd71f109549</w:t>
+        <w:t>a242df1ee782350358b90ab8837ae4dcd9445197dad22734f506dfde2818d254</w:t>
       </w:r>
     </w:p>
     <w:p>
@@ -33176,7 +33176,7 @@
         <w:rPr>
           <w:rFonts w:ascii="Consolas" w:hAnsi="Consolas"/>
         </w:rPr>
-        <w:t>2026-07-18T17:31:35.861760Z</w:t>
+        <w:t>2026-07-18T17:55:53.947577Z</w:t>
       </w:r>
     </w:p>
     <w:p>
@@ -33240,7 +33240,7 @@
         <w:rPr>
           <w:rFonts w:ascii="Consolas" w:hAnsi="Consolas"/>
         </w:rPr>
-        <w:t>a5a1ff03301e747598fd60743ddd94b1e8793dab</w:t>
+        <w:t>0f1551bae9dae111d64814f6aed0837147b3b74c</w:t>
       </w:r>
     </w:p>
     <w:p>
@@ -39607,7 +39607,7 @@
         <w:br/>
         <w:t xml:space="preserve">    "file_format": "auto",</w:t>
         <w:br/>
-        <w:t xml:space="preserve">    "source": "/private/var/folders/12/yxnq95f55hg06fyynglz1scw0000gn/T/tmpzr7eolxf/datasets/provisiones_consumo.parquet"</w:t>
+        <w:t xml:space="preserve">    "source": "/private/var/folders/12/yxnq95f55hg06fyynglz1scw0000gn/T/tmpd7cx8d31/datasets/provisiones_consumo.parquet"</w:t>
         <w:br/>
         <w:t xml:space="preserve">  },</w:t>
         <w:br/>
@@ -42286,6 +42286,1024 @@
         <w:t>}</w:t>
       </w:r>
     </w:p>
+    <w:p>
+      <w:pPr>
+        <w:pStyle w:val="Heading2"/>
+      </w:pPr>
+      <w:r>
+        <w:t>C.9 La provisión a constituir — la regla del máximo</w:t>
+      </w:r>
+    </w:p>
+    <w:p>
+      <w:r>
+        <w:rPr>
+          <w:rFonts w:ascii="Consolas" w:hAnsi="Consolas"/>
+        </w:rPr>
+        <w:t>Artefacto de origen: provisioning.card</w:t>
+      </w:r>
+    </w:p>
+    <w:p>
+      <w:pPr>
+        <w:pStyle w:val="Heading3"/>
+      </w:pPr>
+      <w:r>
+        <w:t>Parámetros y payload</w:t>
+      </w:r>
+    </w:p>
+    <w:p>
+      <w:r>
+        <w:rPr>
+          <w:b/>
+        </w:rPr>
+        <w:t>as_of_date</w:t>
+      </w:r>
+    </w:p>
+    <w:p>
+      <w:r>
+        <w:rPr>
+          <w:rFonts w:ascii="Consolas" w:hAnsi="Consolas"/>
+        </w:rPr>
+        <w:t>2024-06-30</w:t>
+      </w:r>
+    </w:p>
+    <w:p>
+      <w:r>
+        <w:rPr>
+          <w:b/>
+        </w:rPr>
+        <w:t>binding</w:t>
+      </w:r>
+    </w:p>
+    <w:p>
+      <w:r>
+        <w:rPr>
+          <w:rFonts w:ascii="Consolas" w:hAnsi="Consolas"/>
+        </w:rPr>
+        <w:t>cmf</w:t>
+      </w:r>
+    </w:p>
+    <w:p>
+      <w:r>
+        <w:rPr>
+          <w:b/>
+        </w:rPr>
+        <w:t>cmf_matrix_version</w:t>
+      </w:r>
+    </w:p>
+    <w:p>
+      <w:r>
+        <w:rPr>
+          <w:rFonts w:ascii="Consolas" w:hAnsi="Consolas"/>
+        </w:rPr>
+        <w:t>cmf_b1_b3_2025_01</w:t>
+      </w:r>
+    </w:p>
+    <w:p>
+      <w:r>
+        <w:rPr>
+          <w:b/>
+        </w:rPr>
+        <w:t>comparison_level</w:t>
+      </w:r>
+    </w:p>
+    <w:p>
+      <w:r>
+        <w:rPr>
+          <w:rFonts w:ascii="Consolas" w:hAnsi="Consolas"/>
+        </w:rPr>
+        <w:t>total</w:t>
+      </w:r>
+    </w:p>
+    <w:p>
+      <w:r>
+        <w:rPr>
+          <w:b/>
+        </w:rPr>
+        <w:t>effective_config</w:t>
+      </w:r>
+    </w:p>
+    <w:p>
+      <w:r>
+        <w:rPr>
+          <w:rFonts w:ascii="Consolas" w:hAnsi="Consolas"/>
+        </w:rPr>
+        <w:t>{</w:t>
+        <w:br/>
+        <w:t xml:space="preserve">  "as_of_date_col": "as_of_date",</w:t>
+        <w:br/>
+        <w:t xml:space="preserve">  "cmf_portfolio_col": "portfolio",</w:t>
+        <w:br/>
+        <w:t xml:space="preserve">  "comparison_level": "total",</w:t>
+        <w:br/>
+        <w:t xml:space="preserve">  "consume_a": true,</w:t>
+        <w:br/>
+        <w:t xml:space="preserve">  "consume_b": true,</w:t>
+        <w:br/>
+        <w:t xml:space="preserve">  "consume_cmf": null,</w:t>
+        <w:br/>
+        <w:t xml:space="preserve">  "consume_ifrs9": null,</w:t>
+        <w:br/>
+        <w:t xml:space="preserve">  "coverage_policy": "use_available",</w:t>
+        <w:br/>
+        <w:t xml:space="preserve">  "fail_on_falta_dato": true,</w:t>
+        <w:br/>
+        <w:t xml:space="preserve">  "ifrs9_portfolio_col": "portfolio",</w:t>
+        <w:br/>
+        <w:t xml:space="preserve">  "internal_portfolio_col": "portfolio",</w:t>
+        <w:br/>
+        <w:t xml:space="preserve">  "numeric_reconciliation": "decimal_quantize",</w:t>
+        <w:br/>
+        <w:t xml:space="preserve">  "portfolio_crosswalk": {},</w:t>
+        <w:br/>
+        <w:t xml:space="preserve">  "require_both": true,</w:t>
+        <w:br/>
+        <w:t xml:space="preserve">  "rounding": "none",</w:t>
+        <w:br/>
+        <w:t xml:space="preserve">  "row_id_col": "row_id",</w:t>
+        <w:br/>
+        <w:t xml:space="preserve">  "rule": "max",</w:t>
+        <w:br/>
+        <w:t xml:space="preserve">  "schema_version": "1.0.0",</w:t>
+        <w:br/>
+        <w:t xml:space="preserve">  "segment_col": null,</w:t>
+        <w:br/>
+        <w:t xml:space="preserve">  "source_a": "provisioning_cmf",</w:t>
+        <w:br/>
+        <w:t xml:space="preserve">  "source_b": "provisioning_internal",</w:t>
+        <w:br/>
+        <w:t xml:space="preserve">  "tie_tolerance": "0.000000",</w:t>
+        <w:br/>
+        <w:t xml:space="preserve">  "type": "standard"</w:t>
+        <w:br/>
+        <w:t>}</w:t>
+      </w:r>
+    </w:p>
+    <w:p>
+      <w:r>
+        <w:rPr>
+          <w:b/>
+        </w:rPr>
+        <w:t>engines_present</w:t>
+      </w:r>
+    </w:p>
+    <w:p>
+      <w:r>
+        <w:rPr>
+          <w:rFonts w:ascii="Consolas" w:hAnsi="Consolas"/>
+        </w:rPr>
+        <w:t>[</w:t>
+        <w:br/>
+        <w:t xml:space="preserve">  "cmf",</w:t>
+        <w:br/>
+        <w:t xml:space="preserve">  "internal"</w:t>
+        <w:br/>
+        <w:t>]</w:t>
+      </w:r>
+    </w:p>
+    <w:p>
+      <w:r>
+        <w:rPr>
+          <w:b/>
+        </w:rPr>
+        <w:t>falta_dato</w:t>
+      </w:r>
+    </w:p>
+    <w:p>
+      <w:r>
+        <w:rPr>
+          <w:rFonts w:ascii="Consolas" w:hAnsi="Consolas"/>
+        </w:rPr>
+        <w:t>[]</w:t>
+      </w:r>
+    </w:p>
+    <w:p>
+      <w:r>
+        <w:rPr>
+          <w:b/>
+        </w:rPr>
+        <w:t>ifrs9_term_structure_source</w:t>
+      </w:r>
+    </w:p>
+    <w:p>
+      <w:r>
+        <w:rPr>
+          <w:rFonts w:ascii="Consolas" w:hAnsi="Consolas"/>
+        </w:rPr>
+        <w:t>No disponible</w:t>
+      </w:r>
+    </w:p>
+    <w:p>
+      <w:r>
+        <w:rPr>
+          <w:b/>
+        </w:rPr>
+        <w:t>internal_method</w:t>
+      </w:r>
+    </w:p>
+    <w:p>
+      <w:r>
+        <w:rPr>
+          <w:rFonts w:ascii="Consolas" w:hAnsi="Consolas"/>
+        </w:rPr>
+        <w:t>pd_lgd</w:t>
+      </w:r>
+    </w:p>
+    <w:p>
+      <w:r>
+        <w:rPr>
+          <w:b/>
+        </w:rPr>
+        <w:t>n_binding_a</w:t>
+      </w:r>
+    </w:p>
+    <w:p>
+      <w:r>
+        <w:rPr>
+          <w:rFonts w:ascii="Consolas" w:hAnsi="Consolas"/>
+        </w:rPr>
+        <w:t>1</w:t>
+      </w:r>
+    </w:p>
+    <w:p>
+      <w:r>
+        <w:rPr>
+          <w:b/>
+        </w:rPr>
+        <w:t>n_binding_b</w:t>
+      </w:r>
+    </w:p>
+    <w:p>
+      <w:r>
+        <w:rPr>
+          <w:rFonts w:ascii="Consolas" w:hAnsi="Consolas"/>
+        </w:rPr>
+        <w:t>0</w:t>
+      </w:r>
+    </w:p>
+    <w:p>
+      <w:r>
+        <w:rPr>
+          <w:b/>
+        </w:rPr>
+        <w:t>n_binding_tie</w:t>
+      </w:r>
+    </w:p>
+    <w:p>
+      <w:r>
+        <w:rPr>
+          <w:rFonts w:ascii="Consolas" w:hAnsi="Consolas"/>
+        </w:rPr>
+        <w:t>0</w:t>
+      </w:r>
+    </w:p>
+    <w:p>
+      <w:r>
+        <w:rPr>
+          <w:b/>
+        </w:rPr>
+        <w:t>n_cells</w:t>
+      </w:r>
+    </w:p>
+    <w:p>
+      <w:r>
+        <w:rPr>
+          <w:rFonts w:ascii="Consolas" w:hAnsi="Consolas"/>
+        </w:rPr>
+        <w:t>1</w:t>
+      </w:r>
+    </w:p>
+    <w:p>
+      <w:r>
+        <w:rPr>
+          <w:b/>
+        </w:rPr>
+        <w:t>regulatory_sources</w:t>
+      </w:r>
+    </w:p>
+    <w:p>
+      <w:r>
+        <w:rPr>
+          <w:rFonts w:ascii="Consolas" w:hAnsi="Consolas"/>
+        </w:rPr>
+        <w:t>[</w:t>
+        <w:br/>
+        <w:t xml:space="preserve">  "CNC (CMF) Cap. B-1, hoja 10-11 (Circular N° 2.346): la constitución de provisiones considera el mayor valor obtenido entre el método estándar y el método interno, por cada institución en Chile que consolida con el banco.",</w:t>
+        <w:br/>
+        <w:t xml:space="preserve">  "docs/normativa_cmf_parametros.md §3"</w:t>
+        <w:br/>
+        <w:t>]</w:t>
+      </w:r>
+    </w:p>
+    <w:p>
+      <w:r>
+        <w:rPr>
+          <w:b/>
+        </w:rPr>
+        <w:t>rule</w:t>
+      </w:r>
+    </w:p>
+    <w:p>
+      <w:r>
+        <w:rPr>
+          <w:rFonts w:ascii="Consolas" w:hAnsi="Consolas"/>
+        </w:rPr>
+        <w:t>max</w:t>
+      </w:r>
+    </w:p>
+    <w:p>
+      <w:r>
+        <w:rPr>
+          <w:b/>
+        </w:rPr>
+        <w:t>source_a</w:t>
+      </w:r>
+    </w:p>
+    <w:p>
+      <w:r>
+        <w:rPr>
+          <w:rFonts w:ascii="Consolas" w:hAnsi="Consolas"/>
+        </w:rPr>
+        <w:t>cmf</w:t>
+      </w:r>
+    </w:p>
+    <w:p>
+      <w:r>
+        <w:rPr>
+          <w:b/>
+        </w:rPr>
+        <w:t>source_b</w:t>
+      </w:r>
+    </w:p>
+    <w:p>
+      <w:r>
+        <w:rPr>
+          <w:rFonts w:ascii="Consolas" w:hAnsi="Consolas"/>
+        </w:rPr>
+        <w:t>internal</w:t>
+      </w:r>
+    </w:p>
+    <w:p>
+      <w:r>
+        <w:rPr>
+          <w:b/>
+        </w:rPr>
+        <w:t>total_provision_a</w:t>
+      </w:r>
+    </w:p>
+    <w:p>
+      <w:r>
+        <w:rPr>
+          <w:rFonts w:ascii="Consolas" w:hAnsi="Consolas"/>
+        </w:rPr>
+        <w:t>697376973.92291276</w:t>
+      </w:r>
+    </w:p>
+    <w:p>
+      <w:r>
+        <w:rPr>
+          <w:b/>
+        </w:rPr>
+        <w:t>total_provision_b</w:t>
+      </w:r>
+    </w:p>
+    <w:p>
+      <w:r>
+        <w:rPr>
+          <w:rFonts w:ascii="Consolas" w:hAnsi="Consolas"/>
+        </w:rPr>
+        <w:t>308644057.91</w:t>
+      </w:r>
+    </w:p>
+    <w:p>
+      <w:r>
+        <w:rPr>
+          <w:b/>
+        </w:rPr>
+        <w:t>total_reported_provision</w:t>
+      </w:r>
+    </w:p>
+    <w:p>
+      <w:r>
+        <w:rPr>
+          <w:rFonts w:ascii="Consolas" w:hAnsi="Consolas"/>
+        </w:rPr>
+        <w:t>697376973.92291276</w:t>
+      </w:r>
+    </w:p>
+    <w:p>
+      <w:pPr>
+        <w:pStyle w:val="Heading3"/>
+      </w:pPr>
+      <w:r>
+        <w:t>Métricas estructuradas</w:t>
+      </w:r>
+    </w:p>
+    <w:p>
+      <w:r>
+        <w:rPr>
+          <w:b/>
+        </w:rPr>
+        <w:t>provisioning_orchestration</w:t>
+      </w:r>
+    </w:p>
+    <w:p>
+      <w:r>
+        <w:rPr>
+          <w:rFonts w:ascii="Consolas" w:hAnsi="Consolas"/>
+        </w:rPr>
+        <w:t>{</w:t>
+        <w:br/>
+        <w:t xml:space="preserve">  "binding_counts": {</w:t>
+        <w:br/>
+        <w:t xml:space="preserve">    "cmf": 1,</w:t>
+        <w:br/>
+        <w:t xml:space="preserve">    "cmf_only": 0,</w:t>
+        <w:br/>
+        <w:t xml:space="preserve">    "internal": 0,</w:t>
+        <w:br/>
+        <w:t xml:space="preserve">    "internal_only": 0,</w:t>
+        <w:br/>
+        <w:t xml:space="preserve">    "tie": 0</w:t>
+        <w:br/>
+        <w:t xml:space="preserve">  },</w:t>
+        <w:br/>
+        <w:t xml:space="preserve">  "comparison_level": "total",</w:t>
+        <w:br/>
+        <w:t xml:space="preserve">  "floor_bite_ratio": "1.000000",</w:t>
+        <w:br/>
+        <w:t xml:space="preserve">  "numeric_reconciliation": "decimal_quantize",</w:t>
+        <w:br/>
+        <w:t xml:space="preserve">  "rounding": "none",</w:t>
+        <w:br/>
+        <w:t xml:space="preserve">  "rule": "max",</w:t>
+        <w:br/>
+        <w:t xml:space="preserve">  "source_a": "cmf",</w:t>
+        <w:br/>
+        <w:t xml:space="preserve">  "source_b": "internal",</w:t>
+        <w:br/>
+        <w:t xml:space="preserve">  "tie_tolerance": "0.000000"</w:t>
+        <w:br/>
+        <w:t>}</w:t>
+      </w:r>
+    </w:p>
+    <w:p>
+      <w:pPr>
+        <w:pStyle w:val="Heading2"/>
+      </w:pPr>
+      <w:r>
+        <w:t>C.10 Método estándar de la CMF (Cap. B-1)</w:t>
+      </w:r>
+    </w:p>
+    <w:p>
+      <w:r>
+        <w:rPr>
+          <w:rFonts w:ascii="Consolas" w:hAnsi="Consolas"/>
+        </w:rPr>
+        <w:t>Artefacto de origen: provisioning_cmf.card</w:t>
+      </w:r>
+    </w:p>
+    <w:p>
+      <w:pPr>
+        <w:pStyle w:val="Heading3"/>
+      </w:pPr>
+      <w:r>
+        <w:t>Parámetros y payload</w:t>
+      </w:r>
+    </w:p>
+    <w:p>
+      <w:r>
+        <w:rPr>
+          <w:b/>
+        </w:rPr>
+        <w:t>as_of_date</w:t>
+      </w:r>
+    </w:p>
+    <w:p>
+      <w:r>
+        <w:rPr>
+          <w:rFonts w:ascii="Consolas" w:hAnsi="Consolas"/>
+        </w:rPr>
+        <w:t>2024-06-30</w:t>
+      </w:r>
+    </w:p>
+    <w:p>
+      <w:r>
+        <w:rPr>
+          <w:b/>
+        </w:rPr>
+        <w:t>effective_config</w:t>
+      </w:r>
+    </w:p>
+    <w:p>
+      <w:r>
+        <w:rPr>
+          <w:rFonts w:ascii="Consolas" w:hAnsi="Consolas"/>
+        </w:rPr>
+        <w:t>{</w:t>
+        <w:br/>
+        <w:t xml:space="preserve">  "as_of_date_col": "as_of_date",</w:t>
+        <w:br/>
+        <w:t xml:space="preserve">  "category_col": "cmf_category",</w:t>
+        <w:br/>
+        <w:t xml:space="preserve">  "days_past_due_col": "days_past_due",</w:t>
+        <w:br/>
+        <w:t xml:space="preserve">  "debtor_id_col": "debtor_id",</w:t>
+        <w:br/>
+        <w:t xml:space="preserve">  "exposure": {</w:t>
+        <w:br/>
+        <w:t xml:space="preserve">    "allow_negative_exposure": false,</w:t>
+        <w:br/>
+        <w:t xml:space="preserve">    "contingent_amount_col": "contingent_amount",</w:t>
+        <w:br/>
+        <w:t xml:space="preserve">    "contingent_type_col": "contingent_type",</w:t>
+        <w:br/>
+        <w:t xml:space="preserve">    "direct_exposure_col": "exposure_amount",</w:t>
+        <w:br/>
+        <w:t xml:space="preserve">    "is_default_col": "is_default",</w:t>
+        <w:br/>
+        <w:t xml:space="preserve">    "rounding": "none"</w:t>
+        <w:br/>
+        <w:t xml:space="preserve">  },</w:t>
+        <w:br/>
+        <w:t xml:space="preserve">  "guarantees": {</w:t>
+        <w:br/>
+        <w:t xml:space="preserve">    "enable_aval_substitution": true,</w:t>
+        <w:br/>
+        <w:t xml:space="preserve">    "financial_guarantee_policy": "fail",</w:t>
+        <w:br/>
+        <w:t xml:space="preserve">    "recoverable_amount_col": null,</w:t>
+        <w:br/>
+        <w:t xml:space="preserve">    "require_recoverable_for_default": true</w:t>
+        <w:br/>
+        <w:t xml:space="preserve">  },</w:t>
+        <w:br/>
+        <w:t xml:space="preserve">  "matrices": {</w:t>
+        <w:br/>
+        <w:t xml:space="preserve">    "active_version": "cmf_b1_b3_2025_01",</w:t>
+        <w:br/>
+        <w:t xml:space="preserve">    "fail_on_source_mismatch": true,</w:t>
+        <w:br/>
+        <w:t xml:space="preserve">    "fail_on_unmapped_contingent_type": true,</w:t>
+        <w:br/>
+        <w:t xml:space="preserve">    "require_verified_rows": true</w:t>
+        <w:br/>
+        <w:t xml:space="preserve">  },</w:t>
+        <w:br/>
+        <w:t xml:space="preserve">  "pd_mapping": {</w:t>
+        <w:br/>
+        <w:t xml:space="preserve">    "categories": [],</w:t>
+        <w:br/>
+        <w:t xml:space="preserve">    "method": "provided_cmf_category",</w:t>
+        <w:br/>
+        <w:t xml:space="preserve">    "pd_breaks": [],</w:t>
+        <w:br/>
+        <w:t xml:space="preserve">    "pd_column": "pd_raw",</w:t>
+        <w:br/>
+        <w:t xml:space="preserve">    "pd_source_domain": "model",</w:t>
+        <w:br/>
+        <w:t xml:space="preserve">    "pd_source_key": "raw_pd_frame"</w:t>
+        <w:br/>
+        <w:t xml:space="preserve">  },</w:t>
+        <w:br/>
+        <w:t xml:space="preserve">  "portfolio_col": "cmf_portfolio",</w:t>
+        <w:br/>
+        <w:t xml:space="preserve">  "product_type_col": "cmf_product_type",</w:t>
+        <w:br/>
+        <w:t xml:space="preserve">  "schema_version": "1.0.0",</w:t>
+        <w:br/>
+        <w:t xml:space="preserve">  "type": "standard"</w:t>
+        <w:br/>
+        <w:t>}</w:t>
+      </w:r>
+    </w:p>
+    <w:p>
+      <w:r>
+        <w:rPr>
+          <w:b/>
+        </w:rPr>
+        <w:t>matrix_version</w:t>
+      </w:r>
+    </w:p>
+    <w:p>
+      <w:r>
+        <w:rPr>
+          <w:rFonts w:ascii="Consolas" w:hAnsi="Consolas"/>
+        </w:rPr>
+        <w:t>cmf_b1_b3_2025_01</w:t>
+      </w:r>
+    </w:p>
+    <w:p>
+      <w:r>
+        <w:rPr>
+          <w:b/>
+        </w:rPr>
+        <w:t>n_rows</w:t>
+      </w:r>
+    </w:p>
+    <w:p>
+      <w:r>
+        <w:rPr>
+          <w:rFonts w:ascii="Consolas" w:hAnsi="Consolas"/>
+        </w:rPr>
+        <w:t>6000</w:t>
+      </w:r>
+    </w:p>
+    <w:p>
+      <w:r>
+        <w:rPr>
+          <w:b/>
+        </w:rPr>
+        <w:t>portfolios</w:t>
+      </w:r>
+    </w:p>
+    <w:p>
+      <w:r>
+        <w:rPr>
+          <w:rFonts w:ascii="Consolas" w:hAnsi="Consolas"/>
+        </w:rPr>
+        <w:t>[</w:t>
+        <w:br/>
+        <w:t xml:space="preserve">  {</w:t>
+        <w:br/>
+        <w:t xml:space="preserve">    "n_rows": 6000,</w:t>
+        <w:br/>
+        <w:t xml:space="preserve">    "portfolio": "consumer",</w:t>
+        <w:br/>
+        <w:t xml:space="preserve">    "total_exposure_amount": "8079005433.760000",</w:t>
+        <w:br/>
+        <w:t xml:space="preserve">    "total_provision_amount": "697376973.922913",</w:t>
+        <w:br/>
+        <w:t xml:space="preserve">    "warnings": [],</w:t>
+        <w:br/>
+        <w:t xml:space="preserve">    "weighted_pe_percent": "8.6320"</w:t>
+        <w:br/>
+        <w:t xml:space="preserve">  }</w:t>
+        <w:br/>
+        <w:t>]</w:t>
+      </w:r>
+    </w:p>
+    <w:p>
+      <w:r>
+        <w:rPr>
+          <w:b/>
+        </w:rPr>
+        <w:t>regulatory_sources</w:t>
+      </w:r>
+    </w:p>
+    <w:p>
+      <w:r>
+        <w:rPr>
+          <w:rFonts w:ascii="Consolas" w:hAnsi="Consolas"/>
+        </w:rPr>
+        <w:t>[</w:t>
+        <w:br/>
+        <w:t xml:space="preserve">  "docs/normativa_cmf_parametros.md §3"</w:t>
+        <w:br/>
+        <w:t>]</w:t>
+      </w:r>
+    </w:p>
+    <w:p>
+      <w:r>
+        <w:rPr>
+          <w:b/>
+        </w:rPr>
+        <w:t>total_exposure_amount</w:t>
+      </w:r>
+    </w:p>
+    <w:p>
+      <w:r>
+        <w:rPr>
+          <w:rFonts w:ascii="Consolas" w:hAnsi="Consolas"/>
+        </w:rPr>
+        <w:t>8079005433.76</w:t>
+      </w:r>
+    </w:p>
+    <w:p>
+      <w:r>
+        <w:rPr>
+          <w:b/>
+        </w:rPr>
+        <w:t>total_provision_amount</w:t>
+      </w:r>
+    </w:p>
+    <w:p>
+      <w:r>
+        <w:rPr>
+          <w:rFonts w:ascii="Consolas" w:hAnsi="Consolas"/>
+        </w:rPr>
+        <w:t>697376973.92291276</w:t>
+      </w:r>
+    </w:p>
+    <w:p>
+      <w:pPr>
+        <w:pStyle w:val="Heading3"/>
+      </w:pPr>
+      <w:r>
+        <w:t>Métricas estructuradas</w:t>
+      </w:r>
+    </w:p>
+    <w:p>
+      <w:r>
+        <w:rPr>
+          <w:b/>
+        </w:rPr>
+        <w:t>cmf_b1_engine</w:t>
+      </w:r>
+    </w:p>
+    <w:p>
+      <w:r>
+        <w:rPr>
+          <w:rFonts w:ascii="Consolas" w:hAnsi="Consolas"/>
+        </w:rPr>
+        <w:t>{</w:t>
+        <w:br/>
+        <w:t xml:space="preserve">  "matrix_sha256": "6272bd0dfa5821db8def039014d7288b694b520f51ddda5a0b52349ce2e8d794",</w:t>
+        <w:br/>
+        <w:t xml:space="preserve">  "pe_consistency_tolerance_percent": "0.0001",</w:t>
+        <w:br/>
+        <w:t xml:space="preserve">  "scope": "b1_b3_aval_substitution_financial_guarantee_guardrails",</w:t>
+        <w:br/>
+        <w:t xml:space="preserve">  "summary_rows": 20</w:t>
+        <w:br/>
+        <w:t>}</w:t>
+      </w:r>
+    </w:p>
+    <w:p>
+      <w:pPr>
+        <w:pStyle w:val="Heading2"/>
+      </w:pPr>
+      <w:r>
+        <w:t>C.11 Método interno del banco</w:t>
+      </w:r>
+    </w:p>
+    <w:p>
+      <w:r>
+        <w:rPr>
+          <w:rFonts w:ascii="Consolas" w:hAnsi="Consolas"/>
+        </w:rPr>
+        <w:t>Artefacto de origen: provisioning_internal.card</w:t>
+      </w:r>
+    </w:p>
+    <w:p>
+      <w:pPr>
+        <w:pStyle w:val="Heading3"/>
+      </w:pPr>
+      <w:r>
+        <w:t>Parámetros y payload</w:t>
+      </w:r>
+    </w:p>
+    <w:p>
+      <w:r>
+        <w:rPr>
+          <w:b/>
+        </w:rPr>
+        <w:t>as_of_date</w:t>
+      </w:r>
+    </w:p>
+    <w:p>
+      <w:r>
+        <w:rPr>
+          <w:rFonts w:ascii="Consolas" w:hAnsi="Consolas"/>
+        </w:rPr>
+        <w:t>2024-06-30</w:t>
+      </w:r>
+    </w:p>
+    <w:p>
+      <w:r>
+        <w:rPr>
+          <w:b/>
+        </w:rPr>
+        <w:t>effective_config</w:t>
+      </w:r>
+    </w:p>
+    <w:p>
+      <w:r>
+        <w:rPr>
+          <w:rFonts w:ascii="Consolas" w:hAnsi="Consolas"/>
+        </w:rPr>
+        <w:t>{</w:t>
+        <w:br/>
+        <w:t xml:space="preserve">  "as_of_date_col": "as_of_date",</w:t>
+        <w:br/>
+        <w:t xml:space="preserve">  "exposure_col": "exposure_amount",</w:t>
+        <w:br/>
+        <w:t xml:space="preserve">  "fail_on_falta_dato": true,</w:t>
+        <w:br/>
+        <w:t xml:space="preserve">  "group_col": null,</w:t>
+        <w:br/>
+        <w:t xml:space="preserve">  "grouping": "score_band",</w:t>
+        <w:br/>
+        <w:t xml:space="preserve">  "lgd": {</w:t>
+        <w:br/>
+        <w:t xml:space="preserve">    "lgd_cap": "1.000000",</w:t>
+        <w:br/>
+        <w:t xml:space="preserve">    "lgd_col": "lgd",</w:t>
+        <w:br/>
+        <w:t xml:space="preserve">    "lgd_floor": "0.000000",</w:t>
+        <w:br/>
+        <w:t xml:space="preserve">    "method": "provided"</w:t>
+        <w:br/>
+        <w:t xml:space="preserve">  },</w:t>
+        <w:br/>
+        <w:t xml:space="preserve">  "loss_rate_col": null,</w:t>
+        <w:br/>
+        <w:t xml:space="preserve">  "method": "pd_lgd",</w:t>
+        <w:br/>
+        <w:t xml:space="preserve">  "n_score_bands": 10,</w:t>
+        <w:br/>
+        <w:t xml:space="preserve">  "pd_column": "pd_calibrated",</w:t>
+        <w:br/>
+        <w:t xml:space="preserve">  "pd_source": "calibration",</w:t>
+        <w:br/>
+        <w:t xml:space="preserve">  "portfolio_col": "cmf_portfolio",</w:t>
+        <w:br/>
+        <w:t xml:space="preserve">  "rounding": "currency_2dp",</w:t>
+        <w:br/>
+        <w:t xml:space="preserve">  "schema_version": "1.0.0",</w:t>
+        <w:br/>
+        <w:t xml:space="preserve">  "type": "standard"</w:t>
+        <w:br/>
+        <w:t>}</w:t>
+      </w:r>
+    </w:p>
+    <w:p>
+      <w:r>
+        <w:rPr>
+          <w:b/>
+        </w:rPr>
+        <w:t>falta_dato</w:t>
+      </w:r>
+    </w:p>
+    <w:p>
+      <w:r>
+        <w:rPr>
+          <w:rFonts w:ascii="Consolas" w:hAnsi="Consolas"/>
+        </w:rPr>
+        <w:t>[]</w:t>
+      </w:r>
+    </w:p>
+    <w:p>
+      <w:r>
+        <w:rPr>
+          <w:b/>
+        </w:rPr>
+        <w:t>grouping</w:t>
+      </w:r>
+    </w:p>
+    <w:p>
+      <w:r>
+        <w:rPr>
+          <w:rFonts w:ascii="Consolas" w:hAnsi="Consolas"/>
+        </w:rPr>
+        <w:t>score_band</w:t>
+      </w:r>
+    </w:p>
+    <w:p>
+      <w:r>
+        <w:rPr>
+          <w:b/>
+        </w:rPr>
+        <w:t>method</w:t>
+      </w:r>
+    </w:p>
+    <w:p>
+      <w:r>
+        <w:rPr>
+          <w:rFonts w:ascii="Consolas" w:hAnsi="Consolas"/>
+        </w:rPr>
+        <w:t>pd_lgd</w:t>
+      </w:r>
+    </w:p>
+    <w:p>
+      <w:r>
+        <w:rPr>
+          <w:b/>
+        </w:rPr>
+        <w:t>n_groups</w:t>
+      </w:r>
+    </w:p>
+    <w:p>
+      <w:r>
+        <w:rPr>
+          <w:rFonts w:ascii="Consolas" w:hAnsi="Consolas"/>
+        </w:rPr>
+        <w:t>10</w:t>
+      </w:r>
+    </w:p>
+    <w:p>
+      <w:r>
+        <w:rPr>
+          <w:b/>
+        </w:rPr>
+        <w:t>n_rows</w:t>
+      </w:r>
+    </w:p>
+    <w:p>
+      <w:r>
+        <w:rPr>
+          <w:rFonts w:ascii="Consolas" w:hAnsi="Consolas"/>
+        </w:rPr>
+        <w:t>6000</w:t>
+      </w:r>
+    </w:p>
+    <w:p>
+      <w:r>
+        <w:rPr>
+          <w:b/>
+        </w:rPr>
+        <w:t>pd_source</w:t>
+      </w:r>
+    </w:p>
+    <w:p>
+      <w:r>
+        <w:rPr>
+          <w:rFonts w:ascii="Consolas" w:hAnsi="Consolas"/>
+        </w:rPr>
+        <w:t>calibration</w:t>
+      </w:r>
+    </w:p>
+    <w:p>
+      <w:r>
+        <w:rPr>
+          <w:b/>
+        </w:rPr>
+        <w:t>total_exposure</w:t>
+      </w:r>
+    </w:p>
+    <w:p>
+      <w:r>
+        <w:rPr>
+          <w:rFonts w:ascii="Consolas" w:hAnsi="Consolas"/>
+        </w:rPr>
+        <w:t>8079005433.76</w:t>
+      </w:r>
+    </w:p>
+    <w:p>
+      <w:r>
+        <w:rPr>
+          <w:b/>
+        </w:rPr>
+        <w:t>total_internal_provision</w:t>
+      </w:r>
+    </w:p>
+    <w:p>
+      <w:r>
+        <w:rPr>
+          <w:rFonts w:ascii="Consolas" w:hAnsi="Consolas"/>
+        </w:rPr>
+        <w:t>308644057.91</w:t>
+      </w:r>
+    </w:p>
+    <w:p>
+      <w:pPr>
+        <w:pStyle w:val="Heading3"/>
+      </w:pPr>
+      <w:r>
+        <w:t>Métricas estructuradas</w:t>
+      </w:r>
+    </w:p>
+    <w:p>
+      <w:r>
+        <w:rPr>
+          <w:b/>
+        </w:rPr>
+        <w:t>provisioning_internal</w:t>
+      </w:r>
+    </w:p>
+    <w:p>
+      <w:r>
+        <w:rPr>
+          <w:rFonts w:ascii="Consolas" w:hAnsi="Consolas"/>
+        </w:rPr>
+        <w:t>{</w:t>
+        <w:br/>
+        <w:t xml:space="preserve">  "grouping": "score_band",</w:t>
+        <w:br/>
+        <w:t xml:space="preserve">  "groups_by_portfolio": {</w:t>
+        <w:br/>
+        <w:t xml:space="preserve">    "consumer": 10</w:t>
+        <w:br/>
+        <w:t xml:space="preserve">  },</w:t>
+        <w:br/>
+        <w:t xml:space="preserve">  "lgd_method": "provided",</w:t>
+        <w:br/>
+        <w:t xml:space="preserve">  "method": "pd_lgd",</w:t>
+        <w:br/>
+        <w:t xml:space="preserve">  "n_score_bands": 10,</w:t>
+        <w:br/>
+        <w:t xml:space="preserve">  "norma": "CMF Cap. B-1 §3 (Circular N° 2.346): provisión = colocaciones del grupo · PD estimada · pérdida dado el incumplimiento.",</w:t>
+        <w:br/>
+        <w:t xml:space="preserve">  "pd_aggregation": "exposure_weighted",</w:t>
+        <w:br/>
+        <w:t xml:space="preserve">  "rounding": "currency_2dp",</w:t>
+        <w:br/>
+        <w:t xml:space="preserve">  "total_expected_loss_rate": "0.038203224448922777376082337534204431258983735881240",</w:t>
+        <w:br/>
+        <w:t xml:space="preserve">  "warning_codes": []</w:t>
+        <w:br/>
+        <w:t>}</w:t>
+      </w:r>
+    </w:p>
     <w:sectPr>
       <w:pgSz w:w="12240" w:h="15840"/>
       <w:pgMar w:top="1440" w:right="1800" w:bottom="1440" w:left="1800" w:header="720" w:footer="720" w:gutter="0"/>

</xml_diff>

<commit_message>
chore: consolidar contratos y próximos pasos
</commit_message>
<xml_diff>
--- a/web/src/fixtures/demo/report.docx
+++ b/web/src/fixtures/demo/report.docx
@@ -183,7 +183,7 @@
         <w:rPr>
           <w:rFonts w:ascii="Consolas" w:hAnsi="Consolas"/>
         </w:rPr>
-        <w:t>config_hash=a242df1ee782350358b90ab8837ae4dcd9445197dad22734f506dfde2818d254</w:t>
+        <w:t>config_hash=e92fa29d3c9384613b494cfe263d3cd4cbed8dd0f7162b0bc6e80ea5954c35fb</w:t>
       </w:r>
     </w:p>
     <w:p>
@@ -199,7 +199,7 @@
         <w:rPr>
           <w:rFonts w:ascii="Consolas" w:hAnsi="Consolas"/>
         </w:rPr>
-        <w:t>git_sha=0f1551bae9dae111d64814f6aed0837147b3b74c</w:t>
+        <w:t>git_sha=51936fc1c07573ac94754ecd76c5688065772bd5</w:t>
       </w:r>
     </w:p>
     <w:p>
@@ -29661,17 +29661,17 @@
     </w:p>
     <w:p>
       <w:r>
-        <w:t>El Compendio de Normas Contables para Bancos (Cap. B-1, hoja 10-11, Circular N° 2.346) obliga a constituir provisiones por el mayor valor entre el método estándar de la CMF y el método interno del banco, y a disponer de ambos métodos. Este capítulo aplica esa regla sobre la cartera y reporta la provisión resultante.</w:t>
+        <w:t>El Compendio de Normas Contables para Bancos (Cap. B-1, hoja 10-11, Circular N° 2.346) exige considerar el mayor valor entre el método estándar de la CMF y el método interno, por institución.</w:t>
       </w:r>
     </w:p>
     <w:p>
       <w:r>
-        <w:t>Sobre colocaciones por $8.079.005.434, el método estándar de la CMF exige $697.376.974 y el método interno $308.644.058. La provisión a constituir es $697.376.974. Manda el estándar: cuesta $388.732.916 por encima de lo que el propio modelo interno del banco pediría (un 126 % más).</w:t>
+        <w:t>Sobre colocaciones por $8.079.005.434, el método estándar de la CMF calcula $697.376.974 y el método interno $308.644.058. La provisión a reportar según la regla configurada es $697.376.974. Manda el estándar: cuesta $388.732.916 por encima de lo que el propio modelo interno del banco pediría (un 126 % más).</w:t>
       </w:r>
     </w:p>
     <w:p>
       <w:r>
-        <w:t>La regla se aplica a nivel de entidad —«para cada institución en Chile que consolida con el banco», según la norma—, no operación por operación.</w:t>
+        <w:t>El nivel total sólo representa «por institución» bajo el precontrato de una institución por corrida; Nikodym no valida ese perímetro.</w:t>
       </w:r>
     </w:p>
     <w:p>
@@ -29684,12 +29684,12 @@
     </w:p>
     <w:p>
       <w:r>
-        <w:t>La provisión reportada es el máximo entre las dos fuentes, evaluado a nivel de la entidad. En esta cartera manda el método estándar de la CMF.</w:t>
+        <w:t>La regla configurada toma el máximo entre las dos fuentes a nivel de la entidad; resulta vinculante el método estándar de la CMF.</w:t>
       </w:r>
     </w:p>
     <w:p>
       <w:r>
-        <w:t>Los dos métodos agrupan la cartera de forma distinta, y es deliberado: el método estándar consolida a nivel de deudor —sube a incumplimiento todas las operaciones de un deudor si alguna supera 90 días de mora—, mientras que el método interno agrupa por banda de score. La asimetría la impone la norma, no es un error de cálculo.</w:t>
+        <w:t>Los dos métodos agrupan la cartera de forma distinta, y es deliberado: el método estándar consolida a nivel de deudor —sube a incumplimiento todas sus operaciones si alguna supera 90 días de mora—, mientras que el método interno agrupa por banda de score. La asimetría responde a sus contratos respectivos, no es un error de cálculo.</w:t>
       </w:r>
     </w:p>
     <w:p>
@@ -33123,6 +33123,11 @@
     </w:p>
     <w:p>
       <w:r>
+        <w:t>Caveats de reproducibilidad declarados por la corrida: working tree git sucio: cambios sin commitear no reconstruibles.</w:t>
+      </w:r>
+    </w:p>
+    <w:p>
+      <w:r>
         <w:t>No hay secciones obligatorias ausentes en esta corrida.</w:t>
       </w:r>
     </w:p>
@@ -33160,7 +33165,7 @@
         <w:rPr>
           <w:rFonts w:ascii="Consolas" w:hAnsi="Consolas"/>
         </w:rPr>
-        <w:t>a242df1ee782350358b90ab8837ae4dcd9445197dad22734f506dfde2818d254</w:t>
+        <w:t>e92fa29d3c9384613b494cfe263d3cd4cbed8dd0f7162b0bc6e80ea5954c35fb</w:t>
       </w:r>
     </w:p>
     <w:p>
@@ -33176,7 +33181,7 @@
         <w:rPr>
           <w:rFonts w:ascii="Consolas" w:hAnsi="Consolas"/>
         </w:rPr>
-        <w:t>2026-07-18T17:55:53.947577Z</w:t>
+        <w:t>2026-07-18T22:22:37.497628Z</w:t>
       </w:r>
     </w:p>
     <w:p>
@@ -33208,7 +33213,11 @@
         <w:rPr>
           <w:rFonts w:ascii="Consolas" w:hAnsi="Consolas"/>
         </w:rPr>
-        <w:t>[]</w:t>
+        <w:t>[</w:t>
+        <w:br/>
+        <w:t xml:space="preserve">  "working tree git sucio: cambios sin commitear no reconstruibles"</w:t>
+        <w:br/>
+        <w:t>]</w:t>
       </w:r>
     </w:p>
     <w:p>
@@ -33224,7 +33233,7 @@
         <w:rPr>
           <w:rFonts w:ascii="Consolas" w:hAnsi="Consolas"/>
         </w:rPr>
-        <w:t>false</w:t>
+        <w:t>true</w:t>
       </w:r>
     </w:p>
     <w:p>
@@ -33240,7 +33249,7 @@
         <w:rPr>
           <w:rFonts w:ascii="Consolas" w:hAnsi="Consolas"/>
         </w:rPr>
-        <w:t>0f1551bae9dae111d64814f6aed0837147b3b74c</w:t>
+        <w:t>51936fc1c07573ac94754ecd76c5688065772bd5</w:t>
       </w:r>
     </w:p>
     <w:p>
@@ -39607,7 +39616,7 @@
         <w:br/>
         <w:t xml:space="preserve">    "file_format": "auto",</w:t>
         <w:br/>
-        <w:t xml:space="preserve">    "source": "/private/var/folders/12/yxnq95f55hg06fyynglz1scw0000gn/T/tmpd7cx8d31/datasets/provisiones_consumo.parquet"</w:t>
+        <w:t xml:space="preserve">    "source": "/private/var/folders/12/yxnq95f55hg06fyynglz1scw0000gn/T/tmp9o_y3e7x/datasets/provisiones_consumo.parquet"</w:t>
         <w:br/>
         <w:t xml:space="preserve">  },</w:t>
         <w:br/>
@@ -42587,7 +42596,7 @@
         </w:rPr>
         <w:t>[</w:t>
         <w:br/>
-        <w:t xml:space="preserve">  "CNC (CMF) Cap. B-1, hoja 10-11 (Circular N° 2.346): la constitución de provisiones considera el mayor valor obtenido entre el método estándar y el método interno, por cada institución en Chile que consolida con el banco.",</w:t>
+        <w:t xml:space="preserve">  "CNC (CMF) Cap. B-1, hoja 10-11 (Circular N° 2.346): la constitución de provisiones considera el mayor valor obtenido entre el método estándar y el método interno, por cada institución en Chile que consolida con el banco. Nikodym supone una institución por corrida y no valida ese perímetro.",</w:t>
         <w:br/>
         <w:t xml:space="preserve">  "docs/normativa_cmf_parametros.md §3"</w:t>
         <w:br/>
@@ -42738,6 +42747,8 @@
         <w:t xml:space="preserve">  "rule": "max",</w:t>
         <w:br/>
         <w:t xml:space="preserve">  "source_a": "cmf",</w:t>
+        <w:br/>
+        <w:t xml:space="preserve">  "source_a_binding_ratio": "1.000000",</w:t>
         <w:br/>
         <w:t xml:space="preserve">  "source_b": "internal",</w:t>
         <w:br/>

</xml_diff>

<commit_message>
chore(demo): recapturar F3 con lineage limpio
</commit_message>
<xml_diff>
--- a/web/src/fixtures/demo/report.docx
+++ b/web/src/fixtures/demo/report.docx
@@ -183,7 +183,7 @@
         <w:rPr>
           <w:rFonts w:ascii="Consolas" w:hAnsi="Consolas"/>
         </w:rPr>
-        <w:t>config_hash=e92fa29d3c9384613b494cfe263d3cd4cbed8dd0f7162b0bc6e80ea5954c35fb</w:t>
+        <w:t>config_hash=2dfb4e32b5c5993f2fd23a114182e9d05e02d8f557e7ce2c5690dd121b0bc6b1</w:t>
       </w:r>
     </w:p>
     <w:p>
@@ -199,7 +199,7 @@
         <w:rPr>
           <w:rFonts w:ascii="Consolas" w:hAnsi="Consolas"/>
         </w:rPr>
-        <w:t>git_sha=51936fc1c07573ac94754ecd76c5688065772bd5</w:t>
+        <w:t>git_sha=d9306b8272431933317eff4991fb6306790a6875</w:t>
       </w:r>
     </w:p>
     <w:p>
@@ -33123,11 +33123,6 @@
     </w:p>
     <w:p>
       <w:r>
-        <w:t>Caveats de reproducibilidad declarados por la corrida: working tree git sucio: cambios sin commitear no reconstruibles.</w:t>
-      </w:r>
-    </w:p>
-    <w:p>
-      <w:r>
         <w:t>No hay secciones obligatorias ausentes en esta corrida.</w:t>
       </w:r>
     </w:p>
@@ -33165,7 +33160,7 @@
         <w:rPr>
           <w:rFonts w:ascii="Consolas" w:hAnsi="Consolas"/>
         </w:rPr>
-        <w:t>e92fa29d3c9384613b494cfe263d3cd4cbed8dd0f7162b0bc6e80ea5954c35fb</w:t>
+        <w:t>2dfb4e32b5c5993f2fd23a114182e9d05e02d8f557e7ce2c5690dd121b0bc6b1</w:t>
       </w:r>
     </w:p>
     <w:p>
@@ -33181,7 +33176,7 @@
         <w:rPr>
           <w:rFonts w:ascii="Consolas" w:hAnsi="Consolas"/>
         </w:rPr>
-        <w:t>2026-07-18T22:22:37.497628Z</w:t>
+        <w:t>2026-07-18T22:40:24.824128Z</w:t>
       </w:r>
     </w:p>
     <w:p>
@@ -33213,11 +33208,7 @@
         <w:rPr>
           <w:rFonts w:ascii="Consolas" w:hAnsi="Consolas"/>
         </w:rPr>
-        <w:t>[</w:t>
-        <w:br/>
-        <w:t xml:space="preserve">  "working tree git sucio: cambios sin commitear no reconstruibles"</w:t>
-        <w:br/>
-        <w:t>]</w:t>
+        <w:t>[]</w:t>
       </w:r>
     </w:p>
     <w:p>
@@ -33233,7 +33224,7 @@
         <w:rPr>
           <w:rFonts w:ascii="Consolas" w:hAnsi="Consolas"/>
         </w:rPr>
-        <w:t>true</w:t>
+        <w:t>false</w:t>
       </w:r>
     </w:p>
     <w:p>
@@ -33249,7 +33240,7 @@
         <w:rPr>
           <w:rFonts w:ascii="Consolas" w:hAnsi="Consolas"/>
         </w:rPr>
-        <w:t>51936fc1c07573ac94754ecd76c5688065772bd5</w:t>
+        <w:t>d9306b8272431933317eff4991fb6306790a6875</w:t>
       </w:r>
     </w:p>
     <w:p>
@@ -39616,7 +39607,7 @@
         <w:br/>
         <w:t xml:space="preserve">    "file_format": "auto",</w:t>
         <w:br/>
-        <w:t xml:space="preserve">    "source": "/private/var/folders/12/yxnq95f55hg06fyynglz1scw0000gn/T/tmp9o_y3e7x/datasets/provisiones_consumo.parquet"</w:t>
+        <w:t xml:space="preserve">    "source": "/private/var/folders/12/yxnq95f55hg06fyynglz1scw0000gn/T/tmpp1gu4xko/datasets/provisiones_consumo.parquet"</w:t>
         <w:br/>
         <w:t xml:space="preserve">  },</w:t>
         <w:br/>

</xml_diff>

<commit_message>
chore(demo): fijar lineage canónico F3
</commit_message>
<xml_diff>
--- a/web/src/fixtures/demo/report.docx
+++ b/web/src/fixtures/demo/report.docx
@@ -183,7 +183,7 @@
         <w:rPr>
           <w:rFonts w:ascii="Consolas" w:hAnsi="Consolas"/>
         </w:rPr>
-        <w:t>config_hash=2dfb4e32b5c5993f2fd23a114182e9d05e02d8f557e7ce2c5690dd121b0bc6b1</w:t>
+        <w:t>config_hash=8b5257f2beb4a10b2abf2887f506087430f1078d077ee8743fafc219839e6067</w:t>
       </w:r>
     </w:p>
     <w:p>
@@ -199,7 +199,7 @@
         <w:rPr>
           <w:rFonts w:ascii="Consolas" w:hAnsi="Consolas"/>
         </w:rPr>
-        <w:t>git_sha=d9306b8272431933317eff4991fb6306790a6875</w:t>
+        <w:t>git_sha=25eef2e02cb2a140f9f27f67a41d7a869bc4687f</w:t>
       </w:r>
     </w:p>
     <w:p>
@@ -33160,7 +33160,7 @@
         <w:rPr>
           <w:rFonts w:ascii="Consolas" w:hAnsi="Consolas"/>
         </w:rPr>
-        <w:t>2dfb4e32b5c5993f2fd23a114182e9d05e02d8f557e7ce2c5690dd121b0bc6b1</w:t>
+        <w:t>8b5257f2beb4a10b2abf2887f506087430f1078d077ee8743fafc219839e6067</w:t>
       </w:r>
     </w:p>
     <w:p>
@@ -33176,7 +33176,7 @@
         <w:rPr>
           <w:rFonts w:ascii="Consolas" w:hAnsi="Consolas"/>
         </w:rPr>
-        <w:t>2026-07-18T22:40:24.824128Z</w:t>
+        <w:t>2026-07-18T22:46:51.271033Z</w:t>
       </w:r>
     </w:p>
     <w:p>
@@ -33240,7 +33240,7 @@
         <w:rPr>
           <w:rFonts w:ascii="Consolas" w:hAnsi="Consolas"/>
         </w:rPr>
-        <w:t>d9306b8272431933317eff4991fb6306790a6875</w:t>
+        <w:t>25eef2e02cb2a140f9f27f67a41d7a869bc4687f</w:t>
       </w:r>
     </w:p>
     <w:p>
@@ -39607,7 +39607,7 @@
         <w:br/>
         <w:t xml:space="preserve">    "file_format": "auto",</w:t>
         <w:br/>
-        <w:t xml:space="preserve">    "source": "/private/var/folders/12/yxnq95f55hg06fyynglz1scw0000gn/T/tmpp1gu4xko/datasets/provisiones_consumo.parquet"</w:t>
+        <w:t xml:space="preserve">    "source": "/private/var/folders/12/yxnq95f55hg06fyynglz1scw0000gn/T/nikodym-demo-fixtures-f3/datasets/provisiones_consumo.parquet"</w:t>
         <w:br/>
         <w:t xml:space="preserve">  },</w:t>
         <w:br/>

</xml_diff>

<commit_message>
chore(demo): recapturar F3 con identidad portable
</commit_message>
<xml_diff>
--- a/web/src/fixtures/demo/report.docx
+++ b/web/src/fixtures/demo/report.docx
@@ -183,7 +183,7 @@
         <w:rPr>
           <w:rFonts w:ascii="Consolas" w:hAnsi="Consolas"/>
         </w:rPr>
-        <w:t>config_hash=8b5257f2beb4a10b2abf2887f506087430f1078d077ee8743fafc219839e6067</w:t>
+        <w:t>config_hash=9b542e2f4334e67b379fa921d4b38fe325dad373405e5930f3360f6652bba807</w:t>
       </w:r>
     </w:p>
     <w:p>
@@ -199,7 +199,7 @@
         <w:rPr>
           <w:rFonts w:ascii="Consolas" w:hAnsi="Consolas"/>
         </w:rPr>
-        <w:t>git_sha=25eef2e02cb2a140f9f27f67a41d7a869bc4687f</w:t>
+        <w:t>git_sha=ce4ac63294d412776060f0f4388163129f4eb54b</w:t>
       </w:r>
     </w:p>
     <w:p>
@@ -33160,7 +33160,7 @@
         <w:rPr>
           <w:rFonts w:ascii="Consolas" w:hAnsi="Consolas"/>
         </w:rPr>
-        <w:t>8b5257f2beb4a10b2abf2887f506087430f1078d077ee8743fafc219839e6067</w:t>
+        <w:t>9b542e2f4334e67b379fa921d4b38fe325dad373405e5930f3360f6652bba807</w:t>
       </w:r>
     </w:p>
     <w:p>
@@ -33176,7 +33176,7 @@
         <w:rPr>
           <w:rFonts w:ascii="Consolas" w:hAnsi="Consolas"/>
         </w:rPr>
-        <w:t>2026-07-18T22:46:51.271033Z</w:t>
+        <w:t>2026-07-18T23:05:58.088508Z</w:t>
       </w:r>
     </w:p>
     <w:p>
@@ -33240,7 +33240,7 @@
         <w:rPr>
           <w:rFonts w:ascii="Consolas" w:hAnsi="Consolas"/>
         </w:rPr>
-        <w:t>25eef2e02cb2a140f9f27f67a41d7a869bc4687f</w:t>
+        <w:t>ce4ac63294d412776060f0f4388163129f4eb54b</w:t>
       </w:r>
     </w:p>
     <w:p>
@@ -39607,7 +39607,7 @@
         <w:br/>
         <w:t xml:space="preserve">    "file_format": "auto",</w:t>
         <w:br/>
-        <w:t xml:space="preserve">    "source": "/private/var/folders/12/yxnq95f55hg06fyynglz1scw0000gn/T/nikodym-demo-fixtures-f3/datasets/provisiones_consumo.parquet"</w:t>
+        <w:t xml:space="preserve">    "source": ".nikodym-demo-fixtures-f3/datasets/provisiones_consumo.parquet"</w:t>
         <w:br/>
         <w:t xml:space="preserve">  },</w:t>
         <w:br/>

</xml_diff>

<commit_message>
chore(demo): actualizar lineage F3 multiplataforma
</commit_message>
<xml_diff>
--- a/web/src/fixtures/demo/report.docx
+++ b/web/src/fixtures/demo/report.docx
@@ -199,7 +199,7 @@
         <w:rPr>
           <w:rFonts w:ascii="Consolas" w:hAnsi="Consolas"/>
         </w:rPr>
-        <w:t>git_sha=ce4ac63294d412776060f0f4388163129f4eb54b</w:t>
+        <w:t>git_sha=f205ea114cd48ad64371602d7774f3068c4517e2</w:t>
       </w:r>
     </w:p>
     <w:p>
@@ -33176,7 +33176,7 @@
         <w:rPr>
           <w:rFonts w:ascii="Consolas" w:hAnsi="Consolas"/>
         </w:rPr>
-        <w:t>2026-07-18T23:05:58.088508Z</w:t>
+        <w:t>2026-07-18T23:17:03.934521Z</w:t>
       </w:r>
     </w:p>
     <w:p>
@@ -33240,7 +33240,7 @@
         <w:rPr>
           <w:rFonts w:ascii="Consolas" w:hAnsi="Consolas"/>
         </w:rPr>
-        <w:t>ce4ac63294d412776060f0f4388163129f4eb54b</w:t>
+        <w:t>f205ea114cd48ad64371602d7774f3068c4517e2</w:t>
       </w:r>
     </w:p>
     <w:p>

</xml_diff>

<commit_message>
chore(demo): recapturar el bundle F3 (CMF) desde corrida real 1.4.0
Recaptura del preset f3-provisiones-consumo con el motor 1.4.0, que
incorpora los fixes de pulido del informe. Verificado sobre el
artefacto: lineage library_versions.nikodym=1.4.0, 0 celdas `nan`/`none`,
0 rutas del host (`var/folders`), `toyaml.json` sin bloque
`report.document` (idéntico al previo, byte a byte) y `config_hash` de
la app ≡ del informe (66cfffd0…), antes desalineados por la ruta del
dataset. Cifras de negocio intactas: estándar 697M · interno 309M ·
sobrecosto $388.732.916.
</commit_message>
<xml_diff>
--- a/web/src/fixtures/demo/report.docx
+++ b/web/src/fixtures/demo/report.docx
@@ -163,7 +163,7 @@
           </w:tcPr>
           <w:p>
             <w:r>
-              <w:t>2026-07-18</w:t>
+              <w:t>2026-07-21</w:t>
             </w:r>
           </w:p>
         </w:tc>
@@ -183,7 +183,7 @@
         <w:rPr>
           <w:rFonts w:ascii="Consolas" w:hAnsi="Consolas"/>
         </w:rPr>
-        <w:t>config_hash=9b542e2f4334e67b379fa921d4b38fe325dad373405e5930f3360f6652bba807</w:t>
+        <w:t>config_hash=66cfffd0a9bf096ae7197e923f3d77bef483eb02f41f15e3555d657365a887d9</w:t>
       </w:r>
     </w:p>
     <w:p>
@@ -199,7 +199,7 @@
         <w:rPr>
           <w:rFonts w:ascii="Consolas" w:hAnsi="Consolas"/>
         </w:rPr>
-        <w:t>git_sha=f205ea114cd48ad64371602d7774f3068c4517e2</w:t>
+        <w:t>git_sha=6a7c4bde4e9309792fe21569fe93f4df5d8afd13</w:t>
       </w:r>
     </w:p>
     <w:p>
@@ -487,7 +487,7 @@
           </w:tcPr>
           <w:p>
             <w:r>
-              <w:t>0.8347</w:t>
+              <w:t>0,8347</w:t>
             </w:r>
           </w:p>
         </w:tc>
@@ -529,7 +529,7 @@
           </w:tcPr>
           <w:p>
             <w:r>
-              <w:t>0.6694</w:t>
+              <w:t>0,6694</w:t>
             </w:r>
           </w:p>
         </w:tc>
@@ -571,7 +571,7 @@
           </w:tcPr>
           <w:p>
             <w:r>
-              <w:t>0.5236</w:t>
+              <w:t>0,5236</w:t>
             </w:r>
           </w:p>
         </w:tc>
@@ -613,7 +613,7 @@
           </w:tcPr>
           <w:p>
             <w:r>
-              <w:t>0.7956</w:t>
+              <w:t>0,7956</w:t>
             </w:r>
           </w:p>
         </w:tc>
@@ -655,7 +655,7 @@
           </w:tcPr>
           <w:p>
             <w:r>
-              <w:t>0.5913</w:t>
+              <w:t>0,5913</w:t>
             </w:r>
           </w:p>
         </w:tc>
@@ -697,7 +697,7 @@
           </w:tcPr>
           <w:p>
             <w:r>
-              <w:t>0.4932</w:t>
+              <w:t>0,4932</w:t>
             </w:r>
           </w:p>
         </w:tc>
@@ -739,7 +739,7 @@
           </w:tcPr>
           <w:p>
             <w:r>
-              <w:t>0.7895</w:t>
+              <w:t>0,7895</w:t>
             </w:r>
           </w:p>
         </w:tc>
@@ -781,7 +781,7 @@
           </w:tcPr>
           <w:p>
             <w:r>
-              <w:t>0.5791</w:t>
+              <w:t>0,5791</w:t>
             </w:r>
           </w:p>
         </w:tc>
@@ -823,7 +823,7 @@
           </w:tcPr>
           <w:p>
             <w:r>
-              <w:t>0.4723</w:t>
+              <w:t>0,4723</w:t>
             </w:r>
           </w:p>
         </w:tc>
@@ -865,7 +865,7 @@
           </w:tcPr>
           <w:p>
             <w:r>
-              <w:t>0.0122</w:t>
+              <w:t>0,0122</w:t>
             </w:r>
           </w:p>
         </w:tc>
@@ -907,7 +907,7 @@
           </w:tcPr>
           <w:p>
             <w:r>
-              <w:t>0.0147</w:t>
+              <w:t>0,0147</w:t>
             </w:r>
           </w:p>
         </w:tc>
@@ -936,7 +936,7 @@
         <w:rPr>
           <w:i/>
         </w:rPr>
-        <w:t>Las bandas de PSI usan los umbrales configurados: estable por debajo de 0.10 y redesarrollo por sobre 0.25.</w:t>
+        <w:t>Las bandas de PSI usan los umbrales configurados: estable por debajo de 0,10 y redesarrollo por sobre 0,25.</w:t>
       </w:r>
     </w:p>
     <w:p>
@@ -990,7 +990,7 @@
     </w:p>
     <w:p>
       <w:r>
-        <w:t>La población procesada contiene 6.000 observaciones, 17 variables de entrada y una tasa de incumplimiento de 6.90 %. Los conteos por estado, partición y motivo de exclusión se reproducen literalmente en las tablas de esta sección.</w:t>
+        <w:t>La población procesada contiene 6.000 observaciones, 17 variables de entrada y una tasa de incumplimiento de 6,90 %. Los conteos por estado, partición y motivo de exclusión se reproducen literalmente en las tablas de esta sección.</w:t>
       </w:r>
     </w:p>
     <w:p>
@@ -1005,7 +1005,7 @@
     </w:p>
     <w:p>
       <w:r>
-        <w:t>La población se particionó por cohorte sobre «cohorte», reservando como OOT la cohorte «2024Q2», y un Holdout de 20.00 % del resto.</w:t>
+        <w:t>La población se particionó por cohorte sobre «cohorte», reservando como OOT la cohorte «2024Q2», y un Holdout de 20,00 % del resto.</w:t>
       </w:r>
     </w:p>
     <w:p>
@@ -1456,7 +1456,7 @@
     </w:p>
     <w:p>
       <w:r>
-        <w:t>En el tratamiento de faltantes se rechaza toda variable con más de 99.00 % de valores faltantes.</w:t>
+        <w:t>En el tratamiento de faltantes se rechaza toda variable con más de 99,00 % de valores faltantes.</w:t>
       </w:r>
     </w:p>
     <w:p>
@@ -1469,7 +1469,7 @@
     </w:p>
     <w:p>
       <w:r>
-        <w:t>Se discretizó cada variable con OptBinning, resolviendo el problema óptimo por programación entera mixta (MIP), partiendo de un máximo de 20 pre-bins, con un máximo de 6 bins por variable y un tamaño mínimo de bin de 5.00 % de la población.</w:t>
+        <w:t>Se discretizó cada variable con OptBinning, resolviendo el problema óptimo por programación entera mixta (MIP), partiendo de un máximo de 20 pre-bins, con un máximo de 6 bins por variable y un tamaño mínimo de bin de 5,00 % de la población.</w:t>
       </w:r>
     </w:p>
     <w:p>
@@ -1497,12 +1497,12 @@
     </w:p>
     <w:p>
       <w:r>
-        <w:t>Se descartaron las variables con IV inferior a 0.02; las de IV superior a 0.50 se marcaron para revisión, porque un poder predictivo tan alto suele indicar fuga de información más que señal legítima.</w:t>
+        <w:t>Se descartaron las variables con IV inferior a 0,02; las de IV superior a 0,50 se marcaron para revisión, porque un poder predictivo tan alto suele indicar fuga de información más que señal legítima.</w:t>
       </w:r>
     </w:p>
     <w:p>
       <w:r>
-        <w:t>Se eliminó la redundancia entre pares de variables con correlación (pearson) sobre 0.75 y se acotó la multicolinealidad exigiendo un VIF bajo 5.0.</w:t>
+        <w:t>Se eliminó la redundancia entre pares de variables con correlación (pearson) sobre 0,75 y se acotó la multicolinealidad exigiendo un VIF bajo 5,0.</w:t>
       </w:r>
     </w:p>
     <w:p>
@@ -1520,12 +1520,12 @@
     </w:p>
     <w:p>
       <w:r>
-        <w:t>La probabilidad de incumplimiento se modeló mediante regresión logística (logit) sobre las variables transformadas a WoE, con un nivel de significancia de 0.05.</w:t>
+        <w:t>La probabilidad de incumplimiento se modeló mediante regresión logística (logit) sobre las variables transformadas a WoE, con un nivel de significancia de 0,05.</w:t>
       </w:r>
     </w:p>
     <w:p>
       <w:r>
-        <w:t>La construcción del modelo usó stepwise bidireccional (criterio «wald_pvalue» y p-valor de entrada 0.05 y de salida 0.05).</w:t>
+        <w:t>La construcción del modelo usó stepwise bidireccional (criterio «wald_pvalue» y p-valor de entrada 0,05 y de salida 0,05).</w:t>
       </w:r>
     </w:p>
     <w:p>
@@ -1553,7 +1553,7 @@
     </w:p>
     <w:p>
       <w:r>
-        <w:t>De esa convención se derivan los parámetros efectivos de la escala: factor 28.8539 y offset 487.1229.</w:t>
+        <w:t>De esa convención se derivan los parámetros efectivos de la escala: factor 28,8539 y offset 487,1229.</w:t>
       </w:r>
     </w:p>
     <w:p>
@@ -1571,12 +1571,12 @@
     </w:p>
     <w:p>
       <w:r>
-        <w:t>La PD se calibró por desplazamiento del intercepto (intercept offset), ajustando sobre la partición de Desarrollo contra la tasa de incumplimiento observada en Desarrollo, con una PD objetivo de 6.63 %. El ancla es a través del ciclo (TTC).</w:t>
+        <w:t>La PD se calibró por desplazamiento del intercepto (intercept offset), ajustando sobre la partición de Desarrollo contra la tasa de incumplimiento observada en Desarrollo, con una PD objetivo de 6,63 %. El ancla es a través del ciclo (TTC).</w:t>
       </w:r>
     </w:p>
     <w:p>
       <w:r>
-        <w:t>El desplazamiento aplicado al intercepto es 0.0000, lo que preserva el ordenamiento del score: la calibración corrige el nivel de la PD, no su ranking.</w:t>
+        <w:t>El desplazamiento aplicado al intercepto es 0,0000, lo que preserva el ordenamiento del score: la calibración corrige el nivel de la PD, no su ranking.</w:t>
       </w:r>
     </w:p>
     <w:p>
@@ -1607,7 +1607,7 @@
     </w:p>
     <w:p>
       <w:r>
-        <w:t>El poder predictivo univariado (IV) de las 6 variables binificadas lo encabezan «mora_max_12m» (1.409), «deuda_ingreso» (0.651) y «ingreso_mensual» (0.621). El IV de cada variable consta en la tabla siguiente y su binning completo, bin a bin, en el Anexo B.</w:t>
+        <w:t>El poder predictivo univariado (IV) de las 6 variables binificadas lo encabezan «mora_max_12m» (1,409), «deuda_ingreso» (0,651) y «ingreso_mensual» (0,621). El IV de cada variable consta en la tabla siguiente y su binning completo, bin a bin, en el Anexo B.</w:t>
       </w:r>
     </w:p>
     <w:p>
@@ -1967,7 +1967,7 @@
           </w:tcPr>
           <w:p>
             <w:r>
-              <w:t>No disponible</w:t>
+              <w:t>—</w:t>
             </w:r>
           </w:p>
         </w:tc>
@@ -2109,7 +2109,7 @@
           </w:tcPr>
           <w:p>
             <w:r>
-              <w:t>No disponible</w:t>
+              <w:t>—</w:t>
             </w:r>
           </w:p>
         </w:tc>
@@ -2251,7 +2251,7 @@
           </w:tcPr>
           <w:p>
             <w:r>
-              <w:t>No disponible</w:t>
+              <w:t>—</w:t>
             </w:r>
           </w:p>
         </w:tc>
@@ -2393,7 +2393,7 @@
           </w:tcPr>
           <w:p>
             <w:r>
-              <w:t>No disponible</w:t>
+              <w:t>—</w:t>
             </w:r>
           </w:p>
         </w:tc>
@@ -2535,7 +2535,7 @@
           </w:tcPr>
           <w:p>
             <w:r>
-              <w:t>No disponible</w:t>
+              <w:t>—</w:t>
             </w:r>
           </w:p>
         </w:tc>
@@ -2637,7 +2637,7 @@
           </w:tcPr>
           <w:p>
             <w:r>
-              <w:t>none</w:t>
+              <w:t>—</w:t>
             </w:r>
           </w:p>
         </w:tc>
@@ -2667,7 +2667,7 @@
           </w:tcPr>
           <w:p>
             <w:r>
-              <w:t>No disponible</w:t>
+              <w:t>—</w:t>
             </w:r>
           </w:p>
         </w:tc>
@@ -2677,7 +2677,7 @@
           </w:tcPr>
           <w:p>
             <w:r>
-              <w:t>No disponible</w:t>
+              <w:t>—</w:t>
             </w:r>
           </w:p>
         </w:tc>
@@ -2703,7 +2703,7 @@
     </w:p>
     <w:p>
       <w:r>
-        <w:t>Tras la selección, la correlación absoluta máxima entre las variables finales es 0.2963 y el VIF máximo es 1.25.</w:t>
+        <w:t>Tras la selección, la correlación absoluta máxima entre las variables finales es 0,2963 y el VIF máximo es 1,25.</w:t>
       </w:r>
     </w:p>
     <w:p>
@@ -3037,7 +3037,7 @@
           </w:tcPr>
           <w:p>
             <w:r>
-              <w:t>No disponible</w:t>
+              <w:t>—</w:t>
             </w:r>
           </w:p>
         </w:tc>
@@ -3047,7 +3047,7 @@
           </w:tcPr>
           <w:p>
             <w:r>
-              <w:t>No disponible</w:t>
+              <w:t>—</w:t>
             </w:r>
           </w:p>
         </w:tc>
@@ -3067,7 +3067,7 @@
           </w:tcPr>
           <w:p>
             <w:r>
-              <w:t>No disponible</w:t>
+              <w:t>—</w:t>
             </w:r>
           </w:p>
         </w:tc>
@@ -3077,7 +3077,7 @@
           </w:tcPr>
           <w:p>
             <w:r>
-              <w:t>No disponible</w:t>
+              <w:t>—</w:t>
             </w:r>
           </w:p>
         </w:tc>
@@ -3087,7 +3087,7 @@
           </w:tcPr>
           <w:p>
             <w:r>
-              <w:t>No disponible</w:t>
+              <w:t>—</w:t>
             </w:r>
           </w:p>
         </w:tc>
@@ -3189,7 +3189,7 @@
           </w:tcPr>
           <w:p>
             <w:r>
-              <w:t>No disponible</w:t>
+              <w:t>—</w:t>
             </w:r>
           </w:p>
         </w:tc>
@@ -3199,7 +3199,7 @@
           </w:tcPr>
           <w:p>
             <w:r>
-              <w:t>No disponible</w:t>
+              <w:t>—</w:t>
             </w:r>
           </w:p>
         </w:tc>
@@ -3219,7 +3219,7 @@
           </w:tcPr>
           <w:p>
             <w:r>
-              <w:t>No disponible</w:t>
+              <w:t>—</w:t>
             </w:r>
           </w:p>
         </w:tc>
@@ -3229,7 +3229,7 @@
           </w:tcPr>
           <w:p>
             <w:r>
-              <w:t>No disponible</w:t>
+              <w:t>—</w:t>
             </w:r>
           </w:p>
         </w:tc>
@@ -3341,7 +3341,7 @@
           </w:tcPr>
           <w:p>
             <w:r>
-              <w:t>No disponible</w:t>
+              <w:t>—</w:t>
             </w:r>
           </w:p>
         </w:tc>
@@ -3351,7 +3351,7 @@
           </w:tcPr>
           <w:p>
             <w:r>
-              <w:t>No disponible</w:t>
+              <w:t>—</w:t>
             </w:r>
           </w:p>
         </w:tc>
@@ -3371,7 +3371,7 @@
           </w:tcPr>
           <w:p>
             <w:r>
-              <w:t>No disponible</w:t>
+              <w:t>—</w:t>
             </w:r>
           </w:p>
         </w:tc>
@@ -3381,7 +3381,7 @@
           </w:tcPr>
           <w:p>
             <w:r>
-              <w:t>No disponible</w:t>
+              <w:t>—</w:t>
             </w:r>
           </w:p>
         </w:tc>
@@ -3493,7 +3493,7 @@
           </w:tcPr>
           <w:p>
             <w:r>
-              <w:t>No disponible</w:t>
+              <w:t>—</w:t>
             </w:r>
           </w:p>
         </w:tc>
@@ -3503,7 +3503,7 @@
           </w:tcPr>
           <w:p>
             <w:r>
-              <w:t>No disponible</w:t>
+              <w:t>—</w:t>
             </w:r>
           </w:p>
         </w:tc>
@@ -3523,7 +3523,7 @@
           </w:tcPr>
           <w:p>
             <w:r>
-              <w:t>No disponible</w:t>
+              <w:t>—</w:t>
             </w:r>
           </w:p>
         </w:tc>
@@ -3533,7 +3533,7 @@
           </w:tcPr>
           <w:p>
             <w:r>
-              <w:t>No disponible</w:t>
+              <w:t>—</w:t>
             </w:r>
           </w:p>
         </w:tc>
@@ -3605,7 +3605,7 @@
           </w:tcPr>
           <w:p>
             <w:r>
-              <w:t>none</w:t>
+              <w:t>—</w:t>
             </w:r>
           </w:p>
         </w:tc>
@@ -3645,7 +3645,7 @@
           </w:tcPr>
           <w:p>
             <w:r>
-              <w:t>No disponible</w:t>
+              <w:t>—</w:t>
             </w:r>
           </w:p>
         </w:tc>
@@ -3655,7 +3655,7 @@
           </w:tcPr>
           <w:p>
             <w:r>
-              <w:t>No disponible</w:t>
+              <w:t>—</w:t>
             </w:r>
           </w:p>
         </w:tc>
@@ -3665,7 +3665,7 @@
           </w:tcPr>
           <w:p>
             <w:r>
-              <w:t>nan</w:t>
+              <w:t>—</w:t>
             </w:r>
           </w:p>
         </w:tc>
@@ -3675,7 +3675,7 @@
           </w:tcPr>
           <w:p>
             <w:r>
-              <w:t>No disponible</w:t>
+              <w:t>—</w:t>
             </w:r>
           </w:p>
         </w:tc>
@@ -3685,7 +3685,7 @@
           </w:tcPr>
           <w:p>
             <w:r>
-              <w:t>No disponible</w:t>
+              <w:t>—</w:t>
             </w:r>
           </w:p>
         </w:tc>
@@ -3797,7 +3797,7 @@
           </w:tcPr>
           <w:p>
             <w:r>
-              <w:t>No disponible</w:t>
+              <w:t>—</w:t>
             </w:r>
           </w:p>
         </w:tc>
@@ -3807,7 +3807,7 @@
           </w:tcPr>
           <w:p>
             <w:r>
-              <w:t>No disponible</w:t>
+              <w:t>—</w:t>
             </w:r>
           </w:p>
         </w:tc>
@@ -3827,7 +3827,7 @@
           </w:tcPr>
           <w:p>
             <w:r>
-              <w:t>No disponible</w:t>
+              <w:t>—</w:t>
             </w:r>
           </w:p>
         </w:tc>
@@ -3837,7 +3837,7 @@
           </w:tcPr>
           <w:p>
             <w:r>
-              <w:t>No disponible</w:t>
+              <w:t>—</w:t>
             </w:r>
           </w:p>
         </w:tc>
@@ -3847,7 +3847,7 @@
           </w:tcPr>
           <w:p>
             <w:r>
-              <w:t>No disponible</w:t>
+              <w:t>—</w:t>
             </w:r>
           </w:p>
         </w:tc>
@@ -4013,7 +4013,7 @@
           </w:tcPr>
           <w:p>
             <w:r>
-              <w:t>No disponible</w:t>
+              <w:t>—</w:t>
             </w:r>
           </w:p>
         </w:tc>
@@ -4075,7 +4075,7 @@
           </w:tcPr>
           <w:p>
             <w:r>
-              <w:t>No disponible</w:t>
+              <w:t>—</w:t>
             </w:r>
           </w:p>
         </w:tc>
@@ -4137,7 +4137,7 @@
           </w:tcPr>
           <w:p>
             <w:r>
-              <w:t>No disponible</w:t>
+              <w:t>—</w:t>
             </w:r>
           </w:p>
         </w:tc>
@@ -4199,7 +4199,7 @@
           </w:tcPr>
           <w:p>
             <w:r>
-              <w:t>No disponible</w:t>
+              <w:t>—</w:t>
             </w:r>
           </w:p>
         </w:tc>
@@ -4261,7 +4261,7 @@
           </w:tcPr>
           <w:p>
             <w:r>
-              <w:t>No disponible</w:t>
+              <w:t>—</w:t>
             </w:r>
           </w:p>
         </w:tc>
@@ -4282,7 +4282,7 @@
     </w:p>
     <w:p>
       <w:r>
-        <w:t>En el ajuste in-sample, el optimizador convergió, el ajuste usó 3939 observaciones de Desarrollo, de las cuales 261 son incumplimientos y el pseudo-R² de McFadden es 0.2697.</w:t>
+        <w:t>En el ajuste in-sample, el optimizador convergió, el ajuste usó 3939 observaciones de Desarrollo, de las cuales 261 son incumplimientos y el pseudo-R² de McFadden es 0,2697.</w:t>
       </w:r>
     </w:p>
     <w:p>
@@ -4609,7 +4609,7 @@
           </w:tcPr>
           <w:p>
             <w:r>
-              <w:t>none</w:t>
+              <w:t>—</w:t>
             </w:r>
           </w:p>
         </w:tc>
@@ -4619,7 +4619,7 @@
           </w:tcPr>
           <w:p>
             <w:r>
-              <w:t>No disponible</w:t>
+              <w:t>—</w:t>
             </w:r>
           </w:p>
         </w:tc>
@@ -4629,7 +4629,7 @@
           </w:tcPr>
           <w:p>
             <w:r>
-              <w:t>nan</w:t>
+              <w:t>—</w:t>
             </w:r>
           </w:p>
         </w:tc>
@@ -4639,7 +4639,7 @@
           </w:tcPr>
           <w:p>
             <w:r>
-              <w:t>nan</w:t>
+              <w:t>—</w:t>
             </w:r>
           </w:p>
         </w:tc>
@@ -9932,7 +9932,7 @@
     </w:p>
     <w:p>
       <w:r>
-        <w:t>En Desarrollo, la PD media calibrada es 6.63 %, frente a 6.63 % antes de calibrar, contra una tasa de incumplimiento observada de 6.63 %.</w:t>
+        <w:t>En Desarrollo, la PD media calibrada es 6,63 %, frente a 6,63 % antes de calibrar, contra una tasa de incumplimiento observada de 6,63 %.</w:t>
       </w:r>
     </w:p>
     <w:p>
@@ -10000,17 +10000,17 @@
     </w:p>
     <w:p>
       <w:r>
-        <w:t>En Desarrollo el modelo alcanza AUC 0.8347, Gini 0.6694 y KS 0.5236.</w:t>
+        <w:t>En Desarrollo el modelo alcanza AUC 0,8347, Gini 0,6694 y KS 0,5236.</w:t>
       </w:r>
     </w:p>
     <w:p>
       <w:r>
-        <w:t>En Holdout el modelo alcanza AUC 0.7956, Gini 0.5913 y KS 0.4932.</w:t>
+        <w:t>En Holdout el modelo alcanza AUC 0,7956, Gini 0,5913 y KS 0,4932.</w:t>
       </w:r>
     </w:p>
     <w:p>
       <w:r>
-        <w:t>En Fuera de tiempo (OOT) el modelo alcanza AUC 0.7895, Gini 0.5791 y KS 0.4723.</w:t>
+        <w:t>En Fuera de tiempo (OOT) el modelo alcanza AUC 0,7895, Gini 0,5791 y KS 0,4723.</w:t>
       </w:r>
     </w:p>
     <w:p>
@@ -10396,7 +10396,7 @@
           </w:tcPr>
           <w:p>
             <w:r>
-              <w:t>No disponible</w:t>
+              <w:t>—</w:t>
             </w:r>
           </w:p>
         </w:tc>
@@ -10528,7 +10528,7 @@
           </w:tcPr>
           <w:p>
             <w:r>
-              <w:t>No disponible</w:t>
+              <w:t>—</w:t>
             </w:r>
           </w:p>
         </w:tc>
@@ -10660,7 +10660,7 @@
           </w:tcPr>
           <w:p>
             <w:r>
-              <w:t>No disponible</w:t>
+              <w:t>—</w:t>
             </w:r>
           </w:p>
         </w:tc>
@@ -17076,17 +17076,17 @@
     </w:p>
     <w:p>
       <w:r>
-        <w:t>El PSI del score en Desarrollo vs. Holdout es 0.0122 (banda «Estable»). La distribución del score se mantiene, de modo que no hay evidencia de desplazamiento poblacional.</w:t>
+        <w:t>El PSI del score en Desarrollo vs. Holdout es 0,0122 (banda «Estable»). La distribución del score se mantiene, de modo que no hay evidencia de desplazamiento poblacional.</w:t>
       </w:r>
     </w:p>
     <w:p>
       <w:r>
-        <w:t>El PSI del score en Desarrollo vs. OOT es 0.0147 (banda «Estable»). La distribución del score se mantiene, de modo que no hay evidencia de desplazamiento poblacional.</w:t>
+        <w:t>El PSI del score en Desarrollo vs. OOT es 0,0147 (banda «Estable»). La distribución del score se mantiene, de modo que no hay evidencia de desplazamiento poblacional.</w:t>
       </w:r>
     </w:p>
     <w:p>
       <w:r>
-        <w:t>A nivel de variable, el mayor CSI corresponde a «ingreso_mensual__points» con 0.0093.</w:t>
+        <w:t>A nivel de variable, el mayor CSI corresponde a «ingreso_mensual__points» con 0,0093.</w:t>
       </w:r>
     </w:p>
     <w:p>
@@ -17347,7 +17347,7 @@
           </w:tcPr>
           <w:p>
             <w:r>
-              <w:t>none</w:t>
+              <w:t>—</w:t>
             </w:r>
           </w:p>
         </w:tc>
@@ -17429,7 +17429,7 @@
           </w:tcPr>
           <w:p>
             <w:r>
-              <w:t>none</w:t>
+              <w:t>—</w:t>
             </w:r>
           </w:p>
         </w:tc>
@@ -17511,7 +17511,7 @@
           </w:tcPr>
           <w:p>
             <w:r>
-              <w:t>none</w:t>
+              <w:t>—</w:t>
             </w:r>
           </w:p>
         </w:tc>
@@ -17593,7 +17593,7 @@
           </w:tcPr>
           <w:p>
             <w:r>
-              <w:t>none</w:t>
+              <w:t>—</w:t>
             </w:r>
           </w:p>
         </w:tc>
@@ -17675,7 +17675,7 @@
           </w:tcPr>
           <w:p>
             <w:r>
-              <w:t>none</w:t>
+              <w:t>—</w:t>
             </w:r>
           </w:p>
         </w:tc>
@@ -17757,7 +17757,7 @@
           </w:tcPr>
           <w:p>
             <w:r>
-              <w:t>none</w:t>
+              <w:t>—</w:t>
             </w:r>
           </w:p>
         </w:tc>
@@ -17839,7 +17839,7 @@
           </w:tcPr>
           <w:p>
             <w:r>
-              <w:t>none</w:t>
+              <w:t>—</w:t>
             </w:r>
           </w:p>
         </w:tc>
@@ -17921,7 +17921,7 @@
           </w:tcPr>
           <w:p>
             <w:r>
-              <w:t>none</w:t>
+              <w:t>—</w:t>
             </w:r>
           </w:p>
         </w:tc>
@@ -18003,7 +18003,7 @@
           </w:tcPr>
           <w:p>
             <w:r>
-              <w:t>none</w:t>
+              <w:t>—</w:t>
             </w:r>
           </w:p>
         </w:tc>
@@ -18085,7 +18085,7 @@
           </w:tcPr>
           <w:p>
             <w:r>
-              <w:t>none</w:t>
+              <w:t>—</w:t>
             </w:r>
           </w:p>
         </w:tc>
@@ -18167,7 +18167,7 @@
           </w:tcPr>
           <w:p>
             <w:r>
-              <w:t>none</w:t>
+              <w:t>—</w:t>
             </w:r>
           </w:p>
         </w:tc>
@@ -18249,7 +18249,7 @@
           </w:tcPr>
           <w:p>
             <w:r>
-              <w:t>none</w:t>
+              <w:t>—</w:t>
             </w:r>
           </w:p>
         </w:tc>
@@ -18331,7 +18331,7 @@
           </w:tcPr>
           <w:p>
             <w:r>
-              <w:t>none</w:t>
+              <w:t>—</w:t>
             </w:r>
           </w:p>
         </w:tc>
@@ -18413,7 +18413,7 @@
           </w:tcPr>
           <w:p>
             <w:r>
-              <w:t>none</w:t>
+              <w:t>—</w:t>
             </w:r>
           </w:p>
         </w:tc>
@@ -18495,7 +18495,7 @@
           </w:tcPr>
           <w:p>
             <w:r>
-              <w:t>none</w:t>
+              <w:t>—</w:t>
             </w:r>
           </w:p>
         </w:tc>
@@ -29964,7 +29964,7 @@
     </w:p>
     <w:p>
       <w:r>
-        <w:t>El método estándar de la CMF provisiona $697.376.974 sobre $8.079.005.434 de colocaciones, un índice de riesgo del 8.63 %.</w:t>
+        <w:t>El método estándar de la CMF provisiona $697.376.974 sobre $8.079.005.434 de colocaciones, un índice de riesgo del 8,63 %.</w:t>
       </w:r>
     </w:p>
     <w:p>
@@ -33052,17 +33052,17 @@
     </w:p>
     <w:p>
       <w:r>
-        <w:t>Discriminación (AUC): Desarrollo 0.8347, Holdout 0.7956 y Fuera de tiempo (OOT) 0.7895.</w:t>
+        <w:t>Discriminación (AUC): Desarrollo 0,8347, Holdout 0,7956 y Fuera de tiempo (OOT) 0,7895.</w:t>
       </w:r>
     </w:p>
     <w:p>
       <w:r>
-        <w:t>Estabilidad (PSI del score): Desarrollo vs. Holdout 0.0122 («Estable») y Desarrollo vs. OOT 0.0147 («Estable»).</w:t>
+        <w:t>Estabilidad (PSI del score): Desarrollo vs. Holdout 0,0122 («Estable») y Desarrollo vs. OOT 0,0147 («Estable»).</w:t>
       </w:r>
     </w:p>
     <w:p>
       <w:r>
-        <w:t>Calibración: la PD media calibrada en Desarrollo (6.63 %) se contrasta con la tasa observada (6.63 %).</w:t>
+        <w:t>Calibración: la PD media calibrada en Desarrollo (6,63 %) se contrasta con la tasa observada (6,63 %).</w:t>
       </w:r>
     </w:p>
     <w:p>
@@ -33160,7 +33160,7 @@
         <w:rPr>
           <w:rFonts w:ascii="Consolas" w:hAnsi="Consolas"/>
         </w:rPr>
-        <w:t>9b542e2f4334e67b379fa921d4b38fe325dad373405e5930f3360f6652bba807</w:t>
+        <w:t>66cfffd0a9bf096ae7197e923f3d77bef483eb02f41f15e3555d657365a887d9</w:t>
       </w:r>
     </w:p>
     <w:p>
@@ -33176,7 +33176,7 @@
         <w:rPr>
           <w:rFonts w:ascii="Consolas" w:hAnsi="Consolas"/>
         </w:rPr>
-        <w:t>2026-07-18T23:17:03.934521Z</w:t>
+        <w:t>2026-07-21T01:16:22.067541Z</w:t>
       </w:r>
     </w:p>
     <w:p>
@@ -33240,7 +33240,7 @@
         <w:rPr>
           <w:rFonts w:ascii="Consolas" w:hAnsi="Consolas"/>
         </w:rPr>
-        <w:t>f205ea114cd48ad64371602d7774f3068c4517e2</w:t>
+        <w:t>6a7c4bde4e9309792fe21569fe93f4df5d8afd13</w:t>
       </w:r>
     </w:p>
     <w:p>
@@ -33260,7 +33260,7 @@
         <w:br/>
         <w:t xml:space="preserve">  "PyYAML": "6.0.3",</w:t>
         <w:br/>
-        <w:t xml:space="preserve">  "nikodym": "1.3.0",</w:t>
+        <w:t xml:space="preserve">  "nikodym": "1.4.0",</w:t>
         <w:br/>
         <w:t xml:space="preserve">  "numpy": "2.4.6",</w:t>
         <w:br/>
@@ -33316,7 +33316,7 @@
         <w:rPr>
           <w:rFonts w:ascii="Consolas" w:hAnsi="Consolas"/>
         </w:rPr>
-        <w:t>No disponible</w:t>
+        <w:t>—</w:t>
       </w:r>
     </w:p>
     <w:p>
@@ -39987,7 +39987,7 @@
         <w:rPr>
           <w:rFonts w:ascii="Consolas" w:hAnsi="Consolas"/>
         </w:rPr>
-        <w:t>No disponible</w:t>
+        <w:t>—</w:t>
       </w:r>
     </w:p>
     <w:p>
@@ -41109,7 +41109,7 @@
         <w:rPr>
           <w:rFonts w:ascii="Consolas" w:hAnsi="Consolas"/>
         </w:rPr>
-        <w:t>No disponible</w:t>
+        <w:t>—</w:t>
       </w:r>
     </w:p>
     <w:p>
@@ -41125,7 +41125,7 @@
         <w:rPr>
           <w:rFonts w:ascii="Consolas" w:hAnsi="Consolas"/>
         </w:rPr>
-        <w:t>No disponible</w:t>
+        <w:t>—</w:t>
       </w:r>
     </w:p>
     <w:p>
@@ -41477,7 +41477,7 @@
         <w:rPr>
           <w:rFonts w:ascii="Consolas" w:hAnsi="Consolas"/>
         </w:rPr>
-        <w:t>No disponible</w:t>
+        <w:t>—</w:t>
       </w:r>
     </w:p>
     <w:p>
@@ -41621,7 +41621,7 @@
         <w:rPr>
           <w:rFonts w:ascii="Consolas" w:hAnsi="Consolas"/>
         </w:rPr>
-        <w:t>No disponible</w:t>
+        <w:t>—</w:t>
       </w:r>
     </w:p>
     <w:p>
@@ -42489,7 +42489,7 @@
         <w:rPr>
           <w:rFonts w:ascii="Consolas" w:hAnsi="Consolas"/>
         </w:rPr>
-        <w:t>No disponible</w:t>
+        <w:t>—</w:t>
       </w:r>
     </w:p>
     <w:p>

</xml_diff>

<commit_message>
chore(demo): recapturar el bundle F3 sobre árbol limpio
Sobrecosto $388.732.916 invariante. El informe deja de declararse no
reconstruible (el «working tree git sucio» desaparece al capturar con el
árbol limpio) y las 63 celdas con montos crudos bajan a 0.
</commit_message>
<xml_diff>
--- a/web/src/fixtures/demo/report.docx
+++ b/web/src/fixtures/demo/report.docx
@@ -199,7 +199,7 @@
         <w:rPr>
           <w:rFonts w:ascii="Consolas" w:hAnsi="Consolas"/>
         </w:rPr>
-        <w:t>git_sha=88e0067e761252671b02016e74e329c5965da95d</w:t>
+        <w:t>git_sha=ff9d6a40aa8568ad04be25831691eacb637b114b</w:t>
       </w:r>
     </w:p>
     <w:p>
@@ -29898,7 +29898,7 @@
           </w:tcPr>
           <w:p>
             <w:r>
-              <w:t>697376973.922913</w:t>
+              <w:t>697376973.92</w:t>
             </w:r>
           </w:p>
         </w:tc>
@@ -29908,7 +29908,7 @@
           </w:tcPr>
           <w:p>
             <w:r>
-              <w:t>308644057.910000</w:t>
+              <w:t>308644057.91</w:t>
             </w:r>
           </w:p>
         </w:tc>
@@ -29918,7 +29918,7 @@
           </w:tcPr>
           <w:p>
             <w:r>
-              <w:t>697376973.922913</w:t>
+              <w:t>697376973.92</w:t>
             </w:r>
           </w:p>
         </w:tc>
@@ -30164,17 +30164,17 @@
           </w:tcPr>
           <w:p>
             <w:r>
-              <w:t>4338485154.070000</w:t>
-            </w:r>
-          </w:p>
-        </w:tc>
-        <w:tc>
-          <w:tcPr>
-            <w:tcW w:type="dxa" w:w="960"/>
-          </w:tcPr>
-          <w:p>
-            <w:r>
-              <w:t>160408349.388483</w:t>
+              <w:t>4338485154.07</w:t>
+            </w:r>
+          </w:p>
+        </w:tc>
+        <w:tc>
+          <w:tcPr>
+            <w:tcW w:type="dxa" w:w="960"/>
+          </w:tcPr>
+          <w:p>
+            <w:r>
+              <w:t>160408349.39</w:t>
             </w:r>
           </w:p>
         </w:tc>
@@ -30256,17 +30256,17 @@
           </w:tcPr>
           <w:p>
             <w:r>
-              <w:t>205078177.900000</w:t>
-            </w:r>
-          </w:p>
-        </w:tc>
-        <w:tc>
-          <w:tcPr>
-            <w:tcW w:type="dxa" w:w="960"/>
-          </w:tcPr>
-          <w:p>
-            <w:r>
-              <w:t>22952502.933697</w:t>
+              <w:t>205078177.90</w:t>
+            </w:r>
+          </w:p>
+        </w:tc>
+        <w:tc>
+          <w:tcPr>
+            <w:tcW w:type="dxa" w:w="960"/>
+          </w:tcPr>
+          <w:p>
+            <w:r>
+              <w:t>22952502.93</w:t>
             </w:r>
           </w:p>
         </w:tc>
@@ -30348,17 +30348,17 @@
           </w:tcPr>
           <w:p>
             <w:r>
-              <w:t>2133137478.420000</w:t>
-            </w:r>
-          </w:p>
-        </w:tc>
-        <w:tc>
-          <w:tcPr>
-            <w:tcW w:type="dxa" w:w="960"/>
-          </w:tcPr>
-          <w:p>
-            <w:r>
-              <w:t>33185728.908723</w:t>
+              <w:t>2133137478.42</w:t>
+            </w:r>
+          </w:p>
+        </w:tc>
+        <w:tc>
+          <w:tcPr>
+            <w:tcW w:type="dxa" w:w="960"/>
+          </w:tcPr>
+          <w:p>
+            <w:r>
+              <w:t>33185728.91</w:t>
             </w:r>
           </w:p>
         </w:tc>
@@ -30440,17 +30440,17 @@
           </w:tcPr>
           <w:p>
             <w:r>
-              <w:t>83754737.170000</w:t>
-            </w:r>
-          </w:p>
-        </w:tc>
-        <w:tc>
-          <w:tcPr>
-            <w:tcW w:type="dxa" w:w="960"/>
-          </w:tcPr>
-          <w:p>
-            <w:r>
-              <w:t>5704671.080689</w:t>
+              <w:t>83754737.17</w:t>
+            </w:r>
+          </w:p>
+        </w:tc>
+        <w:tc>
+          <w:tcPr>
+            <w:tcW w:type="dxa" w:w="960"/>
+          </w:tcPr>
+          <w:p>
+            <w:r>
+              <w:t>5704671.08</w:t>
             </w:r>
           </w:p>
         </w:tc>
@@ -30532,17 +30532,17 @@
           </w:tcPr>
           <w:p>
             <w:r>
-              <w:t>55425061.340000</w:t>
-            </w:r>
-          </w:p>
-        </w:tc>
-        <w:tc>
-          <w:tcPr>
-            <w:tcW w:type="dxa" w:w="960"/>
-          </w:tcPr>
-          <w:p>
-            <w:r>
-              <w:t>20577288.780615</w:t>
+              <w:t>55425061.34</w:t>
+            </w:r>
+          </w:p>
+        </w:tc>
+        <w:tc>
+          <w:tcPr>
+            <w:tcW w:type="dxa" w:w="960"/>
+          </w:tcPr>
+          <w:p>
+            <w:r>
+              <w:t>20577288.78</w:t>
             </w:r>
           </w:p>
         </w:tc>
@@ -30624,17 +30624,17 @@
           </w:tcPr>
           <w:p>
             <w:r>
-              <w:t>219161129.370000</w:t>
-            </w:r>
-          </w:p>
-        </w:tc>
-        <w:tc>
-          <w:tcPr>
-            <w:tcW w:type="dxa" w:w="960"/>
-          </w:tcPr>
-          <w:p>
-            <w:r>
-              <w:t>80596347.375358</w:t>
+              <w:t>219161129.37</w:t>
+            </w:r>
+          </w:p>
+        </w:tc>
+        <w:tc>
+          <w:tcPr>
+            <w:tcW w:type="dxa" w:w="960"/>
+          </w:tcPr>
+          <w:p>
+            <w:r>
+              <w:t>80596347.38</w:t>
             </w:r>
           </w:p>
         </w:tc>
@@ -30716,17 +30716,17 @@
           </w:tcPr>
           <w:p>
             <w:r>
-              <w:t>9258380.410000</w:t>
-            </w:r>
-          </w:p>
-        </w:tc>
-        <w:tc>
-          <w:tcPr>
-            <w:tcW w:type="dxa" w:w="960"/>
-          </w:tcPr>
-          <w:p>
-            <w:r>
-              <w:t>2274655.556781</w:t>
+              <w:t>9258380.41</w:t>
+            </w:r>
+          </w:p>
+        </w:tc>
+        <w:tc>
+          <w:tcPr>
+            <w:tcW w:type="dxa" w:w="960"/>
+          </w:tcPr>
+          <w:p>
+            <w:r>
+              <w:t>2274655.56</w:t>
             </w:r>
           </w:p>
         </w:tc>
@@ -30808,17 +30808,17 @@
           </w:tcPr>
           <w:p>
             <w:r>
-              <w:t>38305205.540000</w:t>
-            </w:r>
-          </w:p>
-        </w:tc>
-        <w:tc>
-          <w:tcPr>
-            <w:tcW w:type="dxa" w:w="960"/>
-          </w:tcPr>
-          <w:p>
-            <w:r>
-              <w:t>11657374.904246</w:t>
+              <w:t>38305205.54</w:t>
+            </w:r>
+          </w:p>
+        </w:tc>
+        <w:tc>
+          <w:tcPr>
+            <w:tcW w:type="dxa" w:w="960"/>
+          </w:tcPr>
+          <w:p>
+            <w:r>
+              <w:t>11657374.90</w:t>
             </w:r>
           </w:p>
         </w:tc>
@@ -30900,17 +30900,17 @@
           </w:tcPr>
           <w:p>
             <w:r>
-              <w:t>27382506.090000</w:t>
-            </w:r>
-          </w:p>
-        </w:tc>
-        <w:tc>
-          <w:tcPr>
-            <w:tcW w:type="dxa" w:w="960"/>
-          </w:tcPr>
-          <w:p>
-            <w:r>
-              <w:t>11334214.244198</w:t>
+              <w:t>27382506.09</w:t>
+            </w:r>
+          </w:p>
+        </w:tc>
+        <w:tc>
+          <w:tcPr>
+            <w:tcW w:type="dxa" w:w="960"/>
+          </w:tcPr>
+          <w:p>
+            <w:r>
+              <w:t>11334214.24</w:t>
             </w:r>
           </w:p>
         </w:tc>
@@ -30992,17 +30992,17 @@
           </w:tcPr>
           <w:p>
             <w:r>
-              <w:t>198520498.890000</w:t>
-            </w:r>
-          </w:p>
-        </w:tc>
-        <w:tc>
-          <w:tcPr>
-            <w:tcW w:type="dxa" w:w="960"/>
-          </w:tcPr>
-          <w:p>
-            <w:r>
-              <w:t>97121164.724921</w:t>
+              <w:t>198520498.89</w:t>
+            </w:r>
+          </w:p>
+        </w:tc>
+        <w:tc>
+          <w:tcPr>
+            <w:tcW w:type="dxa" w:w="960"/>
+          </w:tcPr>
+          <w:p>
+            <w:r>
+              <w:t>97121164.72</w:t>
             </w:r>
           </w:p>
         </w:tc>
@@ -31084,17 +31084,17 @@
           </w:tcPr>
           <w:p>
             <w:r>
-              <w:t>877312.520000</w:t>
-            </w:r>
-          </w:p>
-        </w:tc>
-        <w:tc>
-          <w:tcPr>
-            <w:tcW w:type="dxa" w:w="960"/>
-          </w:tcPr>
-          <w:p>
-            <w:r>
-              <w:t>226561.579625</w:t>
+              <w:t>877312.52</w:t>
+            </w:r>
+          </w:p>
+        </w:tc>
+        <w:tc>
+          <w:tcPr>
+            <w:tcW w:type="dxa" w:w="960"/>
+          </w:tcPr>
+          <w:p>
+            <w:r>
+              <w:t>226561.58</w:t>
             </w:r>
           </w:p>
         </w:tc>
@@ -31176,17 +31176,17 @@
           </w:tcPr>
           <w:p>
             <w:r>
-              <w:t>21947142.210000</w:t>
-            </w:r>
-          </w:p>
-        </w:tc>
-        <w:tc>
-          <w:tcPr>
-            <w:tcW w:type="dxa" w:w="960"/>
-          </w:tcPr>
-          <w:p>
-            <w:r>
-              <w:t>8640551.564971</w:t>
+              <w:t>21947142.21</w:t>
+            </w:r>
+          </w:p>
+        </w:tc>
+        <w:tc>
+          <w:tcPr>
+            <w:tcW w:type="dxa" w:w="960"/>
+          </w:tcPr>
+          <w:p>
+            <w:r>
+              <w:t>8640551.56</w:t>
             </w:r>
           </w:p>
         </w:tc>
@@ -31268,17 +31268,17 @@
           </w:tcPr>
           <w:p>
             <w:r>
-              <w:t>287666173.400000</w:t>
-            </w:r>
-          </w:p>
-        </w:tc>
-        <w:tc>
-          <w:tcPr>
-            <w:tcW w:type="dxa" w:w="960"/>
-          </w:tcPr>
-          <w:p>
-            <w:r>
-              <w:t>49925818.038930</w:t>
+              <w:t>287666173.40</w:t>
+            </w:r>
+          </w:p>
+        </w:tc>
+        <w:tc>
+          <w:tcPr>
+            <w:tcW w:type="dxa" w:w="960"/>
+          </w:tcPr>
+          <w:p>
+            <w:r>
+              <w:t>49925818.04</w:t>
             </w:r>
           </w:p>
         </w:tc>
@@ -31360,17 +31360,17 @@
           </w:tcPr>
           <w:p>
             <w:r>
-              <w:t>96507962.640000</w:t>
-            </w:r>
-          </w:p>
-        </w:tc>
-        <w:tc>
-          <w:tcPr>
-            <w:tcW w:type="dxa" w:w="960"/>
-          </w:tcPr>
-          <w:p>
-            <w:r>
-              <w:t>26205415.448031</w:t>
+              <w:t>96507962.64</w:t>
+            </w:r>
+          </w:p>
+        </w:tc>
+        <w:tc>
+          <w:tcPr>
+            <w:tcW w:type="dxa" w:w="960"/>
+          </w:tcPr>
+          <w:p>
+            <w:r>
+              <w:t>26205415.45</w:t>
             </w:r>
           </w:p>
         </w:tc>
@@ -31452,17 +31452,17 @@
           </w:tcPr>
           <w:p>
             <w:r>
-              <w:t>65946744.980000</w:t>
-            </w:r>
-          </w:p>
-        </w:tc>
-        <w:tc>
-          <w:tcPr>
-            <w:tcW w:type="dxa" w:w="960"/>
-          </w:tcPr>
-          <w:p>
-            <w:r>
-              <w:t>6395689.638576</w:t>
+              <w:t>65946744.98</w:t>
+            </w:r>
+          </w:p>
+        </w:tc>
+        <w:tc>
+          <w:tcPr>
+            <w:tcW w:type="dxa" w:w="960"/>
+          </w:tcPr>
+          <w:p>
+            <w:r>
+              <w:t>6395689.64</w:t>
             </w:r>
           </w:p>
         </w:tc>
@@ -31544,17 +31544,17 @@
           </w:tcPr>
           <w:p>
             <w:r>
-              <w:t>10753882.850000</w:t>
-            </w:r>
-          </w:p>
-        </w:tc>
-        <w:tc>
-          <w:tcPr>
-            <w:tcW w:type="dxa" w:w="960"/>
-          </w:tcPr>
-          <w:p>
-            <w:r>
-              <w:t>2166881.206048</w:t>
+              <w:t>10753882.85</w:t>
+            </w:r>
+          </w:p>
+        </w:tc>
+        <w:tc>
+          <w:tcPr>
+            <w:tcW w:type="dxa" w:w="960"/>
+          </w:tcPr>
+          <w:p>
+            <w:r>
+              <w:t>2166881.21</w:t>
             </w:r>
           </w:p>
         </w:tc>
@@ -31636,17 +31636,17 @@
           </w:tcPr>
           <w:p>
             <w:r>
-              <w:t>50546434.840000</w:t>
-            </w:r>
-          </w:p>
-        </w:tc>
-        <w:tc>
-          <w:tcPr>
-            <w:tcW w:type="dxa" w:w="960"/>
-          </w:tcPr>
-          <w:p>
-            <w:r>
-              <w:t>29263970.777660</w:t>
+              <w:t>50546434.84</w:t>
+            </w:r>
+          </w:p>
+        </w:tc>
+        <w:tc>
+          <w:tcPr>
+            <w:tcW w:type="dxa" w:w="960"/>
+          </w:tcPr>
+          <w:p>
+            <w:r>
+              <w:t>29263970.78</w:t>
             </w:r>
           </w:p>
         </w:tc>
@@ -31728,17 +31728,17 @@
           </w:tcPr>
           <w:p>
             <w:r>
-              <w:t>195318139.750000</w:t>
-            </w:r>
-          </w:p>
-        </w:tc>
-        <w:tc>
-          <w:tcPr>
-            <w:tcW w:type="dxa" w:w="960"/>
-          </w:tcPr>
-          <w:p>
-            <w:r>
-              <w:t>109394454.475730</w:t>
+              <w:t>195318139.75</w:t>
+            </w:r>
+          </w:p>
+        </w:tc>
+        <w:tc>
+          <w:tcPr>
+            <w:tcW w:type="dxa" w:w="960"/>
+          </w:tcPr>
+          <w:p>
+            <w:r>
+              <w:t>109394454.48</w:t>
             </w:r>
           </w:p>
         </w:tc>
@@ -31820,17 +31820,17 @@
           </w:tcPr>
           <w:p>
             <w:r>
-              <w:t>3472853.520000</w:t>
-            </w:r>
-          </w:p>
-        </w:tc>
-        <w:tc>
-          <w:tcPr>
-            <w:tcW w:type="dxa" w:w="960"/>
-          </w:tcPr>
-          <w:p>
-            <w:r>
-              <w:t>1678907.148840</w:t>
+              <w:t>3472853.52</w:t>
+            </w:r>
+          </w:p>
+        </w:tc>
+        <w:tc>
+          <w:tcPr>
+            <w:tcW w:type="dxa" w:w="960"/>
+          </w:tcPr>
+          <w:p>
+            <w:r>
+              <w:t>1678907.15</w:t>
             </w:r>
           </w:p>
         </w:tc>
@@ -31912,17 +31912,17 @@
           </w:tcPr>
           <w:p>
             <w:r>
-              <w:t>37460457.850000</w:t>
-            </w:r>
-          </w:p>
-        </w:tc>
-        <w:tc>
-          <w:tcPr>
-            <w:tcW w:type="dxa" w:w="960"/>
-          </w:tcPr>
-          <w:p>
-            <w:r>
-              <w:t>17666426.146790</w:t>
+              <w:t>37460457.85</w:t>
+            </w:r>
+          </w:p>
+        </w:tc>
+        <w:tc>
+          <w:tcPr>
+            <w:tcW w:type="dxa" w:w="960"/>
+          </w:tcPr>
+          <w:p>
+            <w:r>
+              <w:t>17666426.15</w:t>
             </w:r>
           </w:p>
         </w:tc>
@@ -32158,7 +32158,7 @@
           </w:tcPr>
           <w:p>
             <w:r>
-              <w:t>925418827.500000</w:t>
+              <w:t>925418827.50</w:t>
             </w:r>
           </w:p>
         </w:tc>
@@ -32198,7 +32198,7 @@
           </w:tcPr>
           <w:p>
             <w:r>
-              <w:t>2191578.950000</w:t>
+              <w:t>2191578.95</w:t>
             </w:r>
           </w:p>
         </w:tc>
@@ -32250,7 +32250,7 @@
           </w:tcPr>
           <w:p>
             <w:r>
-              <w:t>740016129.760000</w:t>
+              <w:t>740016129.76</w:t>
             </w:r>
           </w:p>
         </w:tc>
@@ -32290,7 +32290,7 @@
           </w:tcPr>
           <w:p>
             <w:r>
-              <w:t>3675482.570000</w:t>
+              <w:t>3675482.57</w:t>
             </w:r>
           </w:p>
         </w:tc>
@@ -32342,7 +32342,7 @@
           </w:tcPr>
           <w:p>
             <w:r>
-              <w:t>597423782.520000</w:t>
+              <w:t>597423782.52</w:t>
             </w:r>
           </w:p>
         </w:tc>
@@ -32382,7 +32382,7 @@
           </w:tcPr>
           <w:p>
             <w:r>
-              <w:t>4211741.320000</w:t>
+              <w:t>4211741.32</w:t>
             </w:r>
           </w:p>
         </w:tc>
@@ -32434,7 +32434,7 @@
           </w:tcPr>
           <w:p>
             <w:r>
-              <w:t>676036496.860000</w:t>
+              <w:t>676036496.86</w:t>
             </w:r>
           </w:p>
         </w:tc>
@@ -32474,7 +32474,7 @@
           </w:tcPr>
           <w:p>
             <w:r>
-              <w:t>6280138.440000</w:t>
+              <w:t>6280138.44</w:t>
             </w:r>
           </w:p>
         </w:tc>
@@ -32526,7 +32526,7 @@
           </w:tcPr>
           <w:p>
             <w:r>
-              <w:t>633253913.040000</w:t>
+              <w:t>633253913.04</w:t>
             </w:r>
           </w:p>
         </w:tc>
@@ -32566,7 +32566,7 @@
           </w:tcPr>
           <w:p>
             <w:r>
-              <w:t>7272179.440000</w:t>
+              <w:t>7272179.44</w:t>
             </w:r>
           </w:p>
         </w:tc>
@@ -32618,7 +32618,7 @@
           </w:tcPr>
           <w:p>
             <w:r>
-              <w:t>786325720.200000</w:t>
+              <w:t>786325720.20</w:t>
             </w:r>
           </w:p>
         </w:tc>
@@ -32658,7 +32658,7 @@
           </w:tcPr>
           <w:p>
             <w:r>
-              <w:t>11718116.000000</w:t>
+              <w:t>11718116.00</w:t>
             </w:r>
           </w:p>
         </w:tc>
@@ -32710,7 +32710,7 @@
           </w:tcPr>
           <w:p>
             <w:r>
-              <w:t>799003777.310000</w:t>
+              <w:t>799003777.31</w:t>
             </w:r>
           </w:p>
         </w:tc>
@@ -32750,7 +32750,7 @@
           </w:tcPr>
           <w:p>
             <w:r>
-              <w:t>15869829.360000</w:t>
+              <w:t>15869829.36</w:t>
             </w:r>
           </w:p>
         </w:tc>
@@ -32802,7 +32802,7 @@
           </w:tcPr>
           <w:p>
             <w:r>
-              <w:t>884140798.850000</w:t>
+              <w:t>884140798.85</w:t>
             </w:r>
           </w:p>
         </w:tc>
@@ -32842,7 +32842,7 @@
           </w:tcPr>
           <w:p>
             <w:r>
-              <w:t>23818655.920000</w:t>
+              <w:t>23818655.92</w:t>
             </w:r>
           </w:p>
         </w:tc>
@@ -32894,7 +32894,7 @@
           </w:tcPr>
           <w:p>
             <w:r>
-              <w:t>999840506.410000</w:t>
+              <w:t>999840506.41</w:t>
             </w:r>
           </w:p>
         </w:tc>
@@ -32934,7 +32934,7 @@
           </w:tcPr>
           <w:p>
             <w:r>
-              <w:t>44813044.990000</w:t>
+              <w:t>44813044.99</w:t>
             </w:r>
           </w:p>
         </w:tc>
@@ -32986,7 +32986,7 @@
           </w:tcPr>
           <w:p>
             <w:r>
-              <w:t>1037545481.310000</w:t>
+              <w:t>1037545481.31</w:t>
             </w:r>
           </w:p>
         </w:tc>
@@ -33026,7 +33026,7 @@
           </w:tcPr>
           <w:p>
             <w:r>
-              <w:t>188793290.920000</w:t>
+              <w:t>188793290.92</w:t>
             </w:r>
           </w:p>
         </w:tc>
@@ -33123,11 +33123,6 @@
     </w:p>
     <w:p>
       <w:r>
-        <w:t>Caveats de reproducibilidad declarados por la corrida: working tree git sucio: cambios sin commitear no reconstruibles.</w:t>
-      </w:r>
-    </w:p>
-    <w:p>
-      <w:r>
         <w:t>No hay secciones obligatorias ausentes en esta corrida.</w:t>
       </w:r>
     </w:p>
@@ -33181,7 +33176,7 @@
         <w:rPr>
           <w:rFonts w:ascii="Consolas" w:hAnsi="Consolas"/>
         </w:rPr>
-        <w:t>2026-07-21T02:08:09.982208Z</w:t>
+        <w:t>2026-07-21T15:37:50.786756Z</w:t>
       </w:r>
     </w:p>
     <w:p>
@@ -33213,11 +33208,7 @@
         <w:rPr>
           <w:rFonts w:ascii="Consolas" w:hAnsi="Consolas"/>
         </w:rPr>
-        <w:t>[</w:t>
-        <w:br/>
-        <w:t xml:space="preserve">  "working tree git sucio: cambios sin commitear no reconstruibles"</w:t>
-        <w:br/>
-        <w:t>]</w:t>
+        <w:t>[]</w:t>
       </w:r>
     </w:p>
     <w:p>
@@ -33233,7 +33224,7 @@
         <w:rPr>
           <w:rFonts w:ascii="Consolas" w:hAnsi="Consolas"/>
         </w:rPr>
-        <w:t>true</w:t>
+        <w:t>false</w:t>
       </w:r>
     </w:p>
     <w:p>
@@ -33249,7 +33240,7 @@
         <w:rPr>
           <w:rFonts w:ascii="Consolas" w:hAnsi="Consolas"/>
         </w:rPr>
-        <w:t>88e0067e761252671b02016e74e329c5965da95d</w:t>
+        <w:t>ff9d6a40aa8568ad04be25831691eacb637b114b</w:t>
       </w:r>
     </w:p>
     <w:p>
@@ -40852,9 +40843,9 @@
         </w:rPr>
         <w:t>{</w:t>
         <w:br/>
-        <w:t xml:space="preserve">  "aic": "1415.014625",</w:t>
+        <w:t xml:space="preserve">  "aic": "1415.01",</w:t>
         <w:br/>
-        <w:t xml:space="preserve">  "bic": "1452.686718",</w:t>
+        <w:t xml:space="preserve">  "bic": "1452.69",</w:t>
         <w:br/>
         <w:t xml:space="preserve">  "converged": true,</w:t>
         <w:br/>
@@ -42664,7 +42655,7 @@
         <w:rPr>
           <w:rFonts w:ascii="Consolas" w:hAnsi="Consolas"/>
         </w:rPr>
-        <w:t>697376973.922913</w:t>
+        <w:t>697376973.92</w:t>
       </w:r>
     </w:p>
     <w:p>
@@ -42680,7 +42671,7 @@
         <w:rPr>
           <w:rFonts w:ascii="Consolas" w:hAnsi="Consolas"/>
         </w:rPr>
-        <w:t>308644057.910000</w:t>
+        <w:t>308644057.91</w:t>
       </w:r>
     </w:p>
     <w:p>
@@ -42696,7 +42687,7 @@
         <w:rPr>
           <w:rFonts w:ascii="Consolas" w:hAnsi="Consolas"/>
         </w:rPr>
-        <w:t>697376973.922913</w:t>
+        <w:t>697376973.92</w:t>
       </w:r>
     </w:p>
     <w:p>
@@ -42940,9 +42931,9 @@
         <w:br/>
         <w:t xml:space="preserve">    "portfolio": "consumer",</w:t>
         <w:br/>
-        <w:t xml:space="preserve">    "total_exposure_amount": "8079005433.760000",</w:t>
+        <w:t xml:space="preserve">    "total_exposure_amount": "8079005433.76",</w:t>
         <w:br/>
-        <w:t xml:space="preserve">    "total_provision_amount": "697376973.922913",</w:t>
+        <w:t xml:space="preserve">    "total_provision_amount": "697376973.92",</w:t>
         <w:br/>
         <w:t xml:space="preserve">    "warnings": [],</w:t>
         <w:br/>
@@ -42986,7 +42977,7 @@
         <w:rPr>
           <w:rFonts w:ascii="Consolas" w:hAnsi="Consolas"/>
         </w:rPr>
-        <w:t>8079005433.760000</w:t>
+        <w:t>8079005433.76</w:t>
       </w:r>
     </w:p>
     <w:p>
@@ -43002,7 +42993,7 @@
         <w:rPr>
           <w:rFonts w:ascii="Consolas" w:hAnsi="Consolas"/>
         </w:rPr>
-        <w:t>697376973.922913</w:t>
+        <w:t>697376973.92</w:t>
       </w:r>
     </w:p>
     <w:p>
@@ -43246,7 +43237,7 @@
         <w:rPr>
           <w:rFonts w:ascii="Consolas" w:hAnsi="Consolas"/>
         </w:rPr>
-        <w:t>8079005433.760000</w:t>
+        <w:t>8079005433.76</w:t>
       </w:r>
     </w:p>
     <w:p>
@@ -43262,7 +43253,7 @@
         <w:rPr>
           <w:rFonts w:ascii="Consolas" w:hAnsi="Consolas"/>
         </w:rPr>
-        <w:t>308644057.910000</w:t>
+        <w:t>308644057.91</w:t>
       </w:r>
     </w:p>
     <w:p>

</xml_diff>

<commit_message>
chore(demo): recapturar F3 con lineage 1.4.1
</commit_message>
<xml_diff>
--- a/web/src/fixtures/demo/report.docx
+++ b/web/src/fixtures/demo/report.docx
@@ -199,7 +199,7 @@
         <w:rPr>
           <w:rFonts w:ascii="Consolas" w:hAnsi="Consolas"/>
         </w:rPr>
-        <w:t>git_sha=ff9d6a40aa8568ad04be25831691eacb637b114b</w:t>
+        <w:t>git_sha=86ecf0ce03f7ff61f2cb5825d235e0762b7af499</w:t>
       </w:r>
     </w:p>
     <w:p>
@@ -33176,7 +33176,7 @@
         <w:rPr>
           <w:rFonts w:ascii="Consolas" w:hAnsi="Consolas"/>
         </w:rPr>
-        <w:t>2026-07-21T15:37:50.786756Z</w:t>
+        <w:t>2026-07-21T17:01:13.485408Z</w:t>
       </w:r>
     </w:p>
     <w:p>
@@ -33240,7 +33240,7 @@
         <w:rPr>
           <w:rFonts w:ascii="Consolas" w:hAnsi="Consolas"/>
         </w:rPr>
-        <w:t>ff9d6a40aa8568ad04be25831691eacb637b114b</w:t>
+        <w:t>86ecf0ce03f7ff61f2cb5825d235e0762b7af499</w:t>
       </w:r>
     </w:p>
     <w:p>
@@ -33260,7 +33260,7 @@
         <w:br/>
         <w:t xml:space="preserve">  "PyYAML": "6.0.3",</w:t>
         <w:br/>
-        <w:t xml:space="preserve">  "nikodym": "1.4.0",</w:t>
+        <w:t xml:space="preserve">  "nikodym": "1.4.1",</w:t>
         <w:br/>
         <w:t xml:space="preserve">  "numpy": "2.4.6",</w:t>
         <w:br/>

</xml_diff>

<commit_message>
chore(demo): recapturar F3 con lineage 1.5.0
Corrida real sobre arbol limpio (git_dirty=false). Cifras invariantes:
estandar 697M · interno 309M · binding cmf · sobrecosto $388.732.916 ·
indice 8,63 %.

Verificado sobre el artefacto que los arreglos de B1 salen publicados:
total_expected_loss_rate = 0.0382 (antes 51 digitos) e iv=0.650693 (antes
0.650693017601).

Co-Authored-By: Claude Opus 4.8 <noreply@anthropic.com>
</commit_message>
<xml_diff>
--- a/web/src/fixtures/demo/report.docx
+++ b/web/src/fixtures/demo/report.docx
@@ -163,7 +163,7 @@
           </w:tcPr>
           <w:p>
             <w:r>
-              <w:t>2026-07-21</w:t>
+              <w:t>2026-07-22</w:t>
             </w:r>
           </w:p>
         </w:tc>
@@ -199,7 +199,7 @@
         <w:rPr>
           <w:rFonts w:ascii="Consolas" w:hAnsi="Consolas"/>
         </w:rPr>
-        <w:t>git_sha=9b851201c8b66056dbc98947fef0c7d9a3877118</w:t>
+        <w:t>git_sha=2aed91f2bc35b965ab6cbb73a5c6d33ecc585dd5</w:t>
       </w:r>
     </w:p>
     <w:p>
@@ -3239,7 +3239,7 @@
           </w:tcPr>
           <w:p>
             <w:r>
-              <w:t>iv=0.650693017601 &gt;= max_iv=0.5</w:t>
+              <w:t>iv=0.650693 &gt;= max_iv=0.5</w:t>
             </w:r>
           </w:p>
         </w:tc>
@@ -3391,7 +3391,7 @@
           </w:tcPr>
           <w:p>
             <w:r>
-              <w:t>iv=0.621124012624 &gt;= max_iv=0.5</w:t>
+              <w:t>iv=0.621124 &gt;= max_iv=0.5</w:t>
             </w:r>
           </w:p>
         </w:tc>
@@ -3543,7 +3543,7 @@
           </w:tcPr>
           <w:p>
             <w:r>
-              <w:t>iv=1.40908616508 &gt;= max_iv=0.5</w:t>
+              <w:t>iv=1.40909 &gt;= max_iv=0.5</w:t>
             </w:r>
           </w:p>
         </w:tc>
@@ -3695,7 +3695,7 @@
           </w:tcPr>
           <w:p>
             <w:r>
-              <w:t>iv=0.000469213025506 &lt; min_iv=0.02</w:t>
+              <w:t>iv=0.000469213 &lt; min_iv=0.02</w:t>
             </w:r>
           </w:p>
         </w:tc>
@@ -33176,7 +33176,7 @@
         <w:rPr>
           <w:rFonts w:ascii="Consolas" w:hAnsi="Consolas"/>
         </w:rPr>
-        <w:t>2026-07-21T17:18:52.347288Z</w:t>
+        <w:t>2026-07-22T17:24:05.111445Z</w:t>
       </w:r>
     </w:p>
     <w:p>
@@ -33240,7 +33240,7 @@
         <w:rPr>
           <w:rFonts w:ascii="Consolas" w:hAnsi="Consolas"/>
         </w:rPr>
-        <w:t>9b851201c8b66056dbc98947fef0c7d9a3877118</w:t>
+        <w:t>2aed91f2bc35b965ab6cbb73a5c6d33ecc585dd5</w:t>
       </w:r>
     </w:p>
     <w:p>
@@ -33260,7 +33260,7 @@
         <w:br/>
         <w:t xml:space="preserve">  "PyYAML": "6.0.3",</w:t>
         <w:br/>
-        <w:t xml:space="preserve">  "nikodym": "1.4.1",</w:t>
+        <w:t xml:space="preserve">  "nikodym": "1.5.0",</w:t>
         <w:br/>
         <w:t xml:space="preserve">  "numpy": "2.4.6",</w:t>
         <w:br/>
@@ -43299,7 +43299,7 @@
         <w:br/>
         <w:t xml:space="preserve">  "rounding": "currency_2dp",</w:t>
         <w:br/>
-        <w:t xml:space="preserve">  "total_expected_loss_rate": "0.038203224448922777376082337534204431258983735881240",</w:t>
+        <w:t xml:space="preserve">  "total_expected_loss_rate": "0.0382",</w:t>
         <w:br/>
         <w:t xml:space="preserve">  "warning_codes": []</w:t>
         <w:br/>

</xml_diff>

<commit_message>
chore(demo): recaptura F3 sobre árbol limpio, sin el caveat de no reproducible
La recaptura anterior corrió con cambios sin commitear, así que el informe de la
demo salió declarando «working tree git sucio: cambios sin commitear no
reconstruibles» y `git_dirty=true` en su propio lineage. En una página cuya tesis
es que cada corrida se reproduce en otra máquina, publicar un informe que dice lo
contrario es el peor detalle posible — y lo escribió el propio motor, que en eso
hizo bien su trabajo.

Capturado ahora sobre árbol limpio: `git_dirty=false` y cero caveats. Números
intactos: estándar 697M · interno 309M · reportada 697M · sobrecosto $388.732.916
· índice 8,63 %.
</commit_message>
<xml_diff>
--- a/web/src/fixtures/demo/report.docx
+++ b/web/src/fixtures/demo/report.docx
@@ -199,7 +199,7 @@
         <w:rPr>
           <w:rFonts w:ascii="Consolas" w:hAnsi="Consolas"/>
         </w:rPr>
-        <w:t>git_sha=d897c7f95857b24686c5e46274b5fcc5115d9876</w:t>
+        <w:t>git_sha=4e44f18b2a9cc0bf7aff659612546b59904a35b8</w:t>
       </w:r>
     </w:p>
     <w:p>
@@ -32824,7 +32824,7 @@
         <w:rPr>
           <w:rFonts w:ascii="Consolas" w:hAnsi="Consolas"/>
         </w:rPr>
-        <w:t>2026-07-25T01:58:12.741166Z</w:t>
+        <w:t>2026-07-25T04:09:43.879020Z</w:t>
       </w:r>
     </w:p>
     <w:p>
@@ -32888,7 +32888,7 @@
         <w:rPr>
           <w:rFonts w:ascii="Consolas" w:hAnsi="Consolas"/>
         </w:rPr>
-        <w:t>d897c7f95857b24686c5e46274b5fcc5115d9876</w:t>
+        <w:t>4e44f18b2a9cc0bf7aff659612546b59904a35b8</w:t>
       </w:r>
     </w:p>
     <w:p>

</xml_diff>

<commit_message>
chore(demo): recaptura F3 con lineage 1.6.0
Segunda del patrón C-D. El sobrecosto ($388.732.916) y el binding=cmf salen de
la corrida real y los verifica el propio script, no se editan a mano.
</commit_message>
<xml_diff>
--- a/web/src/fixtures/demo/report.docx
+++ b/web/src/fixtures/demo/report.docx
@@ -163,7 +163,7 @@
           </w:tcPr>
           <w:p>
             <w:r>
-              <w:t>2026-07-25</w:t>
+              <w:t>2026-07-26</w:t>
             </w:r>
           </w:p>
         </w:tc>
@@ -199,7 +199,7 @@
         <w:rPr>
           <w:rFonts w:ascii="Consolas" w:hAnsi="Consolas"/>
         </w:rPr>
-        <w:t>git_sha=fc651dc272835aa729bc7cabeb55e3312ea95eae</w:t>
+        <w:t>git_sha=77b47d6de1375fa16f9168067f6125e06fe98e11</w:t>
       </w:r>
     </w:p>
     <w:p>
@@ -32824,7 +32824,7 @@
         <w:rPr>
           <w:rFonts w:ascii="Consolas" w:hAnsi="Consolas"/>
         </w:rPr>
-        <w:t>2026-07-25T22:25:25.717396Z</w:t>
+        <w:t>2026-07-26T16:27:25.463960Z</w:t>
       </w:r>
     </w:p>
     <w:p>
@@ -32888,7 +32888,7 @@
         <w:rPr>
           <w:rFonts w:ascii="Consolas" w:hAnsi="Consolas"/>
         </w:rPr>
-        <w:t>fc651dc272835aa729bc7cabeb55e3312ea95eae</w:t>
+        <w:t>77b47d6de1375fa16f9168067f6125e06fe98e11</w:t>
       </w:r>
     </w:p>
     <w:p>
@@ -32908,7 +32908,7 @@
         <w:br/>
         <w:t xml:space="preserve">  "PyYAML": "6.0.3",</w:t>
         <w:br/>
-        <w:t xml:space="preserve">  "nikodym": "1.5.0",</w:t>
+        <w:t xml:space="preserve">  "nikodym": "1.6.0",</w:t>
         <w:br/>
         <w:t xml:space="preserve">  "numpy": "2.4.6",</w:t>
         <w:br/>

</xml_diff>

<commit_message>
chore(demo): recaptura del bundle F3 (provisiones CMF) sobre árbol limpio
Segundo eslabón de la cadena C→D: capturado sobre el commit del F1, con
`git_dirty=false` verificado en el informe recién escrito. Las cifras de
negocio no se movieron —estándar $697M, interno $309M, binding CMF,
sobrecosto $388.732.916—, así que el diff del `results` es exactamente
`run_id` más el bloque de lineage que antes no se publicaba.
</commit_message>
<xml_diff>
--- a/web/src/fixtures/demo/report.docx
+++ b/web/src/fixtures/demo/report.docx
@@ -163,7 +163,7 @@
           </w:tcPr>
           <w:p>
             <w:r>
-              <w:t>2026-07-26</w:t>
+              <w:t>2026-08-03</w:t>
             </w:r>
           </w:p>
         </w:tc>
@@ -199,7 +199,7 @@
         <w:rPr>
           <w:rFonts w:ascii="Consolas" w:hAnsi="Consolas"/>
         </w:rPr>
-        <w:t>git_sha=77b47d6de1375fa16f9168067f6125e06fe98e11</w:t>
+        <w:t>git_sha=21ef63d54ebf19dc4a64ab87b0246419aa7d855f</w:t>
       </w:r>
     </w:p>
     <w:p>
@@ -32824,7 +32824,7 @@
         <w:rPr>
           <w:rFonts w:ascii="Consolas" w:hAnsi="Consolas"/>
         </w:rPr>
-        <w:t>2026-07-26T16:27:25.463960Z</w:t>
+        <w:t>2026-08-03T00:05:34.797396Z</w:t>
       </w:r>
     </w:p>
     <w:p>
@@ -32888,7 +32888,7 @@
         <w:rPr>
           <w:rFonts w:ascii="Consolas" w:hAnsi="Consolas"/>
         </w:rPr>
-        <w:t>77b47d6de1375fa16f9168067f6125e06fe98e11</w:t>
+        <w:t>21ef63d54ebf19dc4a64ab87b0246419aa7d855f</w:t>
       </w:r>
     </w:p>
     <w:p>
@@ -32908,7 +32908,7 @@
         <w:br/>
         <w:t xml:space="preserve">  "PyYAML": "6.0.3",</w:t>
         <w:br/>
-        <w:t xml:space="preserve">  "nikodym": "1.6.0",</w:t>
+        <w:t xml:space="preserve">  "nikodym": "1.10.0",</w:t>
         <w:br/>
         <w:t xml:space="preserve">  "numpy": "2.4.6",</w:t>
         <w:br/>
@@ -39788,6 +39788,22 @@
         <w:t xml:space="preserve">  "variable_overrides": []</w:t>
         <w:br/>
         <w:t>}</w:t>
+      </w:r>
+    </w:p>
+    <w:p>
+      <w:r>
+        <w:rPr>
+          <w:b/>
+        </w:rPr>
+        <w:t>excluded_by_target_rule</w:t>
+      </w:r>
+    </w:p>
+    <w:p>
+      <w:r>
+        <w:rPr>
+          <w:rFonts w:ascii="Consolas" w:hAnsi="Consolas"/>
+        </w:rPr>
+        <w:t>[]</w:t>
       </w:r>
     </w:p>
     <w:p>

</xml_diff>

<commit_message>
Recaptura demo F3 con prosa factual
</commit_message>
<xml_diff>
--- a/web/src/fixtures/demo/report.docx
+++ b/web/src/fixtures/demo/report.docx
@@ -163,7 +163,7 @@
           </w:tcPr>
           <w:p>
             <w:r>
-              <w:t>2026-08-03</w:t>
+              <w:t>2026-08-09</w:t>
             </w:r>
           </w:p>
         </w:tc>
@@ -199,7 +199,7 @@
         <w:rPr>
           <w:rFonts w:ascii="Consolas" w:hAnsi="Consolas"/>
         </w:rPr>
-        <w:t>git_sha=21ef63d54ebf19dc4a64ab87b0246419aa7d855f</w:t>
+        <w:t>git_sha=a4e24831187244ca147f92d3ea3c6bef5ad3e503</w:t>
       </w:r>
     </w:p>
     <w:p>
@@ -845,7 +845,7 @@
           </w:tcPr>
           <w:p>
             <w:r>
-              <w:t>PSI del score</w:t>
+              <w:t>Peor PSI entre score y PD · score</w:t>
             </w:r>
           </w:p>
         </w:tc>
@@ -887,7 +887,7 @@
           </w:tcPr>
           <w:p>
             <w:r>
-              <w:t>PSI del score</w:t>
+              <w:t>Peor PSI entre score y PD · PD calibrada</w:t>
             </w:r>
           </w:p>
         </w:tc>
@@ -936,7 +936,7 @@
         <w:rPr>
           <w:i/>
         </w:rPr>
-        <w:t>Las bandas de PSI usan los umbrales configurados: estable por debajo de 0,10 y redesarrollo por sobre 0,25.</w:t>
+        <w:t>Las bandas de PSI usan los umbrales configurados: estable por debajo de 0,10, revisión desde 0,10 y redesarrollo desde 0,25.</w:t>
       </w:r>
     </w:p>
     <w:p>
@@ -1456,7 +1456,7 @@
     </w:p>
     <w:p>
       <w:r>
-        <w:t>En el tratamiento de faltantes se rechaza toda variable con más de 99,00 % de valores faltantes.</w:t>
+        <w:t>En el tratamiento de faltantes se reporta para revisión toda variable con más de 99,00 % de valores faltantes, sin eliminarla automáticamente.</w:t>
       </w:r>
     </w:p>
     <w:p>
@@ -1497,7 +1497,7 @@
     </w:p>
     <w:p>
       <w:r>
-        <w:t>Se descartaron las variables con IV inferior a 0,02; las de IV superior a 0,50 se marcaron para revisión, porque un poder predictivo tan alto suele indicar fuga de información más que señal legítima.</w:t>
+        <w:t>Se descartaron las variables con IV inferior a 0,02; las de IV igual o superior a 0,50 se marcaron para revisión, porque un poder predictivo tan alto suele indicar fuga de información más que señal legítima.</w:t>
       </w:r>
     </w:p>
     <w:p>
@@ -1571,7 +1571,7 @@
     </w:p>
     <w:p>
       <w:r>
-        <w:t>La PD se calibró por desplazamiento del intercepto (intercept offset), ajustando sobre la partición de Desarrollo contra la tasa de incumplimiento observada en Desarrollo, con una PD objetivo de 6,63 %. El ancla es a través del ciclo (TTC).</w:t>
+        <w:t>La PD se calibró por desplazamiento del intercepto (intercept offset), ajustando sobre la partición de Desarrollo contra la tasa de incumplimiento observada en Desarrollo, que resultó ser 6,63 %. El ancla es a través del ciclo (TTC).</w:t>
       </w:r>
     </w:p>
     <w:p>
@@ -10015,7 +10015,7 @@
     </w:p>
     <w:p>
       <w:r>
-        <w:t>La tabla de desempeño reparte la población en 10 tramos de riesgo ordenados por score, y permite verificar que la tasa de incumplimiento observada sea monótona entre tramos.</w:t>
+        <w:t>La tabla de desempeño usa hasta 10 tramos de riesgo configurados, ordenados por la PD calibrada. Los tramos efectivos por partición fueron Desarrollo: 10, Holdout: 10 y Fuera de tiempo (OOT): 10, y permiten verificar la evolución de la tasa de incumplimiento observada entre tramos.</w:t>
       </w:r>
     </w:p>
     <w:p>
@@ -17076,12 +17076,12 @@
     </w:p>
     <w:p>
       <w:r>
-        <w:t>El PSI del score en Desarrollo vs. Holdout es 0,0122 (banda «Estable»). La distribución del score se mantiene, de modo que no hay evidencia de desplazamiento poblacional.</w:t>
+        <w:t>El peor PSI entre score y PD en Desarrollo vs. Holdout es 0,0122 (banda «Estable»); corresponde al score. La distribución de la magnitud ganadora se mantiene, de modo que no hay desplazamiento poblacional.</w:t>
       </w:r>
     </w:p>
     <w:p>
       <w:r>
-        <w:t>El PSI del score en Desarrollo vs. OOT es 0,0147 (banda «Estable»). La distribución del score se mantiene, de modo que no hay evidencia de desplazamiento poblacional.</w:t>
+        <w:t>El peor PSI entre score y PD en Desarrollo vs. OOT es 0,0147 (banda «Estable»); corresponde a la PD calibrada. La distribución de la magnitud ganadora se mantiene, de modo que no hay desplazamiento poblacional.</w:t>
       </w:r>
     </w:p>
     <w:p>
@@ -17091,7 +17091,7 @@
     </w:p>
     <w:p>
       <w:r>
-        <w:t>El PSI se calculó sobre 10 tramos del score, definidos en Desarrollo.</w:t>
+        <w:t>Se configuraron hasta 10 tramos por magnitud para el PSI, definidos en Desarrollo.</w:t>
       </w:r>
     </w:p>
     <w:p>
@@ -29666,7 +29666,7 @@
     </w:p>
     <w:p>
       <w:r>
-        <w:t>Sobre colocaciones por $8.079.005.434, el método estándar de la CMF calcula $697.376.974 y el método interno $308.644.058. La provisión a reportar según la regla configurada es $697.376.974. Las cifras van en pesos chilenos (CLP). Manda el estándar: cuesta $388.732.916 por encima de lo que el propio modelo interno del banco pediría (un 126 % más).</w:t>
+        <w:t>Sobre colocaciones por $8.079.005.434, el método estándar de la CMF calcula $697.376.974 y el método interno $308.644.058. La provisión a reportar según la regla configurada es $697.376.974. Los montos van en CLP. Manda el estándar: cuesta $388.732.916 por encima de lo que el propio modelo interno del banco pediría (un 126 % más).</w:t>
       </w:r>
     </w:p>
     <w:p>
@@ -29940,7 +29940,7 @@
     </w:p>
     <w:p>
       <w:r>
-        <w:t>El método estándar de la CMF provisiona $697.376.974 sobre $8.079.005.434 de colocaciones, un índice de riesgo del 8,63 %. Cifras en pesos chilenos (CLP).</w:t>
+        <w:t>El método estándar de la CMF provisiona $697.376.974 sobre $8.079.005.434 de colocaciones, un índice de riesgo del 8,63 %. Los montos van en CLP.</w:t>
       </w:r>
     </w:p>
     <w:p>
@@ -31730,12 +31730,17 @@
     </w:p>
     <w:p>
       <w:r>
-        <w:t>El método interno es el que la norma también exige: pérdida esperada por grupo homogéneo, como probabilidad de incumplimiento por pérdida dado el incumplimiento por exposición del grupo. Sobre esta cartera suma $308.644.058.</w:t>
+        <w:t>El método interno estima la pérdida esperada por grupo homogéneo como provisión = exposición del grupo · PD estimada · pérdida dado el incumplimiento. Sobre esta cartera suma $308.644.058.</w:t>
       </w:r>
     </w:p>
     <w:p>
       <w:r>
         <w:t>La PD proviene de la PD calibrada del scorecard —el modelo del banco entra por aquí en el número reportado—, agrupada en 10 grupos por banda de score.</w:t>
+      </w:r>
+    </w:p>
+    <w:p>
+      <w:r>
+        <w:t>La severidad la aporta la institución, columna por operación, y la del grupo es el promedio ponderado por la exposición.</w:t>
       </w:r>
     </w:p>
     <w:p>
@@ -32705,7 +32710,7 @@
     </w:p>
     <w:p>
       <w:r>
-        <w:t>Estabilidad (PSI del score): Desarrollo vs. Holdout 0,0122 («Estable») y Desarrollo vs. OOT 0,0147 («Estable»).</w:t>
+        <w:t>Estabilidad (peor PSI entre score y PD): Desarrollo vs. Holdout 0,0122 («Estable»; score) y Desarrollo vs. OOT 0,0147 («Estable»; PD calibrada).</w:t>
       </w:r>
     </w:p>
     <w:p>
@@ -32824,7 +32829,7 @@
         <w:rPr>
           <w:rFonts w:ascii="Consolas" w:hAnsi="Consolas"/>
         </w:rPr>
-        <w:t>2026-08-03T00:05:34.797396Z</w:t>
+        <w:t>2026-08-09T18:45:16.806536Z</w:t>
       </w:r>
     </w:p>
     <w:p>
@@ -32888,7 +32893,7 @@
         <w:rPr>
           <w:rFonts w:ascii="Consolas" w:hAnsi="Consolas"/>
         </w:rPr>
-        <w:t>21ef63d54ebf19dc4a64ab87b0246419aa7d855f</w:t>
+        <w:t>a4e24831187244ca147f92d3ea3c6bef5ad3e503</w:t>
       </w:r>
     </w:p>
     <w:p>
@@ -32908,7 +32913,7 @@
         <w:br/>
         <w:t xml:space="preserve">  "PyYAML": "6.0.3",</w:t>
         <w:br/>
-        <w:t xml:space="preserve">  "nikodym": "1.10.0",</w:t>
+        <w:t xml:space="preserve">  "nikodym": "1.11.0",</w:t>
         <w:br/>
         <w:t xml:space="preserve">  "numpy": "2.4.6",</w:t>
         <w:br/>
@@ -41829,6 +41834,28 @@
         <w:rPr>
           <w:b/>
         </w:rPr>
+        <w:t>psi_metric_by_comparison</w:t>
+      </w:r>
+    </w:p>
+    <w:p>
+      <w:r>
+        <w:rPr>
+          <w:rFonts w:ascii="Consolas" w:hAnsi="Consolas"/>
+        </w:rPr>
+        <w:t>{</w:t>
+        <w:br/>
+        <w:t xml:space="preserve">  "dev_vs_holdout": "score_psi",</w:t>
+        <w:br/>
+        <w:t xml:space="preserve">  "dev_vs_oot": "pd_psi"</w:t>
+        <w:br/>
+        <w:t>}</w:t>
+      </w:r>
+    </w:p>
+    <w:p>
+      <w:r>
+        <w:rPr>
+          <w:b/>
+        </w:rPr>
         <w:t>review_threshold</w:t>
       </w:r>
     </w:p>
@@ -42778,6 +42805,22 @@
           <w:rFonts w:ascii="Consolas" w:hAnsi="Consolas"/>
         </w:rPr>
         <w:t>2024-06-30</w:t>
+      </w:r>
+    </w:p>
+    <w:p>
+      <w:r>
+        <w:rPr>
+          <w:b/>
+        </w:rPr>
+        <w:t>avisos</w:t>
+      </w:r>
+    </w:p>
+    <w:p>
+      <w:r>
+        <w:rPr>
+          <w:rFonts w:ascii="Consolas" w:hAnsi="Consolas"/>
+        </w:rPr>
+        <w:t>[]</w:t>
       </w:r>
     </w:p>
     <w:p>

</xml_diff>

<commit_message>
test: verifica y recaptura demo F3
</commit_message>
<xml_diff>
--- a/web/src/fixtures/demo/report.docx
+++ b/web/src/fixtures/demo/report.docx
@@ -199,7 +199,7 @@
         <w:rPr>
           <w:rFonts w:ascii="Consolas" w:hAnsi="Consolas"/>
         </w:rPr>
-        <w:t>git_sha=a4e24831187244ca147f92d3ea3c6bef5ad3e503</w:t>
+        <w:t>git_sha=63fd29c6186ddad084b1ada19dff9c269ff59056</w:t>
       </w:r>
     </w:p>
     <w:p>
@@ -10712,7 +10712,7 @@
           <w:b/>
           <w:sz w:val="18"/>
         </w:rPr>
-        <w:t>Desempeño por decil de score</w:t>
+        <w:t>Desempeño por tramo de riesgo</w:t>
       </w:r>
     </w:p>
     <w:tbl>
@@ -32829,7 +32829,7 @@
         <w:rPr>
           <w:rFonts w:ascii="Consolas" w:hAnsi="Consolas"/>
         </w:rPr>
-        <w:t>2026-08-09T18:45:16.806536Z</w:t>
+        <w:t>2026-08-09T19:36:53.429206Z</w:t>
       </w:r>
     </w:p>
     <w:p>
@@ -32893,7 +32893,7 @@
         <w:rPr>
           <w:rFonts w:ascii="Consolas" w:hAnsi="Consolas"/>
         </w:rPr>
-        <w:t>a4e24831187244ca147f92d3ea3c6bef5ad3e503</w:t>
+        <w:t>63fd29c6186ddad084b1ada19dff9c269ff59056</w:t>
       </w:r>
     </w:p>
     <w:p>

</xml_diff>